<commit_message>
Perbaikan fitur Template Word
</commit_message>
<xml_diff>
--- a/storage/app/templates/notulen_capkin.docx
+++ b/storage/app/templates/notulen_capkin.docx
@@ -154,8 +154,18 @@
                 <w:b/>
                 <w:bCs/>
               </w:rPr>
-              <w:t>Agenda Pembahasan</w:t>
-            </w:r>
+              <w:t xml:space="preserve">Agenda </w:t>
+            </w:r>
+            <w:proofErr w:type="spellStart"/>
+            <w:r>
+              <w:rPr>
+                <w:rFonts w:ascii="Times New Roman" w:hAnsi="Times New Roman" w:cs="Times New Roman"/>
+                <w:b/>
+                <w:bCs/>
+              </w:rPr>
+              <w:t>Pembahasan</w:t>
+            </w:r>
+            <w:proofErr w:type="spellEnd"/>
           </w:p>
         </w:tc>
         <w:tc>
@@ -184,21 +194,76 @@
                 <w:rFonts w:ascii="Arial" w:hAnsi="Arial" w:cs="Arial"/>
                 <w:color w:val="000000"/>
               </w:rPr>
-              <w:t>${triwulan}</w:t>
-            </w:r>
+              <w:t>${</w:t>
+            </w:r>
+            <w:proofErr w:type="spellStart"/>
             <w:r>
               <w:rPr>
                 <w:rFonts w:ascii="Arial" w:hAnsi="Arial" w:cs="Arial"/>
                 <w:color w:val="000000"/>
               </w:rPr>
-              <w:t xml:space="preserve"> Tahun </w:t>
+              <w:t>triwulan</w:t>
             </w:r>
             <w:r>
               <w:rPr>
                 <w:rFonts w:ascii="Arial" w:hAnsi="Arial" w:cs="Arial"/>
                 <w:color w:val="000000"/>
               </w:rPr>
-              <w:t>${tahun}</w:t>
+              <w:t>_proper</w:t>
+            </w:r>
+            <w:proofErr w:type="spellEnd"/>
+            <w:r>
+              <w:rPr>
+                <w:rFonts w:ascii="Arial" w:hAnsi="Arial" w:cs="Arial"/>
+                <w:color w:val="000000"/>
+              </w:rPr>
+              <w:t>}</w:t>
+            </w:r>
+            <w:r>
+              <w:rPr>
+                <w:rFonts w:ascii="Arial" w:hAnsi="Arial" w:cs="Arial"/>
+                <w:color w:val="000000"/>
+              </w:rPr>
+              <w:t xml:space="preserve"> </w:t>
+            </w:r>
+            <w:proofErr w:type="spellStart"/>
+            <w:r>
+              <w:rPr>
+                <w:rFonts w:ascii="Arial" w:hAnsi="Arial" w:cs="Arial"/>
+                <w:color w:val="000000"/>
+              </w:rPr>
+              <w:t>Tahun</w:t>
+            </w:r>
+            <w:proofErr w:type="spellEnd"/>
+            <w:r>
+              <w:rPr>
+                <w:rFonts w:ascii="Arial" w:hAnsi="Arial" w:cs="Arial"/>
+                <w:color w:val="000000"/>
+              </w:rPr>
+              <w:t xml:space="preserve"> </w:t>
+            </w:r>
+            <w:r>
+              <w:rPr>
+                <w:rFonts w:ascii="Arial" w:hAnsi="Arial" w:cs="Arial"/>
+                <w:color w:val="000000"/>
+              </w:rPr>
+              <w:t>${</w:t>
+            </w:r>
+            <w:proofErr w:type="spellStart"/>
+            <w:r>
+              <w:rPr>
+                <w:rFonts w:ascii="Arial" w:hAnsi="Arial" w:cs="Arial"/>
+                <w:color w:val="000000"/>
+              </w:rPr>
+              <w:t>tahun</w:t>
+            </w:r>
+            <w:proofErr w:type="spellEnd"/>
+            <w:r>
+              <w:rPr>
+                <w:rFonts w:ascii="Arial" w:hAnsi="Arial" w:cs="Arial"/>
+                <w:color w:val="000000"/>
+              </w:rPr>
+              <w:t>}</w:t>
             </w:r>
           </w:p>
         </w:tc>
@@ -227,8 +292,18 @@
                 <w:b/>
                 <w:bCs/>
               </w:rPr>
-              <w:t>Hari/Tanggal</w:t>
-            </w:r>
+              <w:t>Hari/</w:t>
+            </w:r>
+            <w:proofErr w:type="spellStart"/>
+            <w:r>
+              <w:rPr>
+                <w:rFonts w:ascii="Times New Roman" w:hAnsi="Times New Roman" w:cs="Times New Roman"/>
+                <w:b/>
+                <w:bCs/>
+              </w:rPr>
+              <w:t>Tanggal</w:t>
+            </w:r>
+            <w:proofErr w:type="spellEnd"/>
           </w:p>
         </w:tc>
         <w:tc>
@@ -252,6 +327,7 @@
               </w:rPr>
               <w:t>${</w:t>
             </w:r>
+            <w:proofErr w:type="spellStart"/>
             <w:r>
               <w:rPr>
                 <w:rFonts w:ascii="Arial" w:hAnsi="Arial" w:cs="Arial"/>
@@ -264,7 +340,15 @@
                 <w:rFonts w:ascii="Arial" w:hAnsi="Arial" w:cs="Arial"/>
                 <w:color w:val="000000"/>
               </w:rPr>
-              <w:t>tanggal}</w:t>
+              <w:t>tanggal</w:t>
+            </w:r>
+            <w:proofErr w:type="spellEnd"/>
+            <w:r>
+              <w:rPr>
+                <w:rFonts w:ascii="Arial" w:hAnsi="Arial" w:cs="Arial"/>
+                <w:color w:val="000000"/>
+              </w:rPr>
+              <w:t>}</w:t>
             </w:r>
           </w:p>
         </w:tc>
@@ -316,7 +400,23 @@
                 <w:rFonts w:ascii="Arial" w:hAnsi="Arial" w:cs="Arial"/>
                 <w:color w:val="000000"/>
               </w:rPr>
-              <w:t>${waktu}</w:t>
+              <w:t>${</w:t>
+            </w:r>
+            <w:proofErr w:type="spellStart"/>
+            <w:r>
+              <w:rPr>
+                <w:rFonts w:ascii="Arial" w:hAnsi="Arial" w:cs="Arial"/>
+                <w:color w:val="000000"/>
+              </w:rPr>
+              <w:t>waktu</w:t>
+            </w:r>
+            <w:proofErr w:type="spellEnd"/>
+            <w:r>
+              <w:rPr>
+                <w:rFonts w:ascii="Arial" w:hAnsi="Arial" w:cs="Arial"/>
+                <w:color w:val="000000"/>
+              </w:rPr>
+              <w:t>}</w:t>
             </w:r>
           </w:p>
         </w:tc>
@@ -339,6 +439,7 @@
                 <w:bCs/>
               </w:rPr>
             </w:pPr>
+            <w:proofErr w:type="spellStart"/>
             <w:r>
               <w:rPr>
                 <w:rFonts w:ascii="Times New Roman" w:hAnsi="Times New Roman" w:cs="Times New Roman"/>
@@ -347,6 +448,7 @@
               </w:rPr>
               <w:t>Tempat</w:t>
             </w:r>
+            <w:proofErr w:type="spellEnd"/>
           </w:p>
         </w:tc>
         <w:tc>
@@ -368,7 +470,23 @@
                 <w:rFonts w:ascii="Arial" w:hAnsi="Arial" w:cs="Arial"/>
                 <w:color w:val="000000"/>
               </w:rPr>
-              <w:t>${tempat}</w:t>
+              <w:t>${</w:t>
+            </w:r>
+            <w:proofErr w:type="spellStart"/>
+            <w:r>
+              <w:rPr>
+                <w:rFonts w:ascii="Arial" w:hAnsi="Arial" w:cs="Arial"/>
+                <w:color w:val="000000"/>
+              </w:rPr>
+              <w:t>tempat</w:t>
+            </w:r>
+            <w:proofErr w:type="spellEnd"/>
+            <w:r>
+              <w:rPr>
+                <w:rFonts w:ascii="Arial" w:hAnsi="Arial" w:cs="Arial"/>
+                <w:color w:val="000000"/>
+              </w:rPr>
+              <w:t>}</w:t>
             </w:r>
           </w:p>
         </w:tc>
@@ -391,14 +509,34 @@
                 <w:bCs/>
               </w:rPr>
             </w:pPr>
-            <w:r>
-              <w:rPr>
-                <w:rFonts w:ascii="Times New Roman" w:hAnsi="Times New Roman" w:cs="Times New Roman"/>
-                <w:b/>
-                <w:bCs/>
-              </w:rPr>
-              <w:t>Pimpinan Rapat</w:t>
-            </w:r>
+            <w:proofErr w:type="spellStart"/>
+            <w:r>
+              <w:rPr>
+                <w:rFonts w:ascii="Times New Roman" w:hAnsi="Times New Roman" w:cs="Times New Roman"/>
+                <w:b/>
+                <w:bCs/>
+              </w:rPr>
+              <w:t>Pimpinan</w:t>
+            </w:r>
+            <w:proofErr w:type="spellEnd"/>
+            <w:r>
+              <w:rPr>
+                <w:rFonts w:ascii="Times New Roman" w:hAnsi="Times New Roman" w:cs="Times New Roman"/>
+                <w:b/>
+                <w:bCs/>
+              </w:rPr>
+              <w:t xml:space="preserve"> </w:t>
+            </w:r>
+            <w:proofErr w:type="spellStart"/>
+            <w:r>
+              <w:rPr>
+                <w:rFonts w:ascii="Times New Roman" w:hAnsi="Times New Roman" w:cs="Times New Roman"/>
+                <w:b/>
+                <w:bCs/>
+              </w:rPr>
+              <w:t>Rapat</w:t>
+            </w:r>
+            <w:proofErr w:type="spellEnd"/>
           </w:p>
         </w:tc>
         <w:tc>
@@ -429,6 +567,7 @@
               </w:rPr>
               <w:t>{</w:t>
             </w:r>
+            <w:proofErr w:type="spellStart"/>
             <w:r>
               <w:rPr>
                 <w:rFonts w:ascii="Arial" w:hAnsi="Arial" w:cs="Arial"/>
@@ -443,6 +582,7 @@
               </w:rPr>
               <w:t>_rapat</w:t>
             </w:r>
+            <w:proofErr w:type="spellEnd"/>
             <w:r>
               <w:rPr>
                 <w:rFonts w:ascii="Arial" w:hAnsi="Arial" w:cs="Arial"/>
@@ -455,7 +595,23 @@
                 <w:rFonts w:ascii="Arial" w:hAnsi="Arial" w:cs="Arial"/>
                 <w:color w:val="000000"/>
               </w:rPr>
-              <w:t xml:space="preserve"> (${jabatan_pimpinan})</w:t>
+              <w:t xml:space="preserve"> (${</w:t>
+            </w:r>
+            <w:proofErr w:type="spellStart"/>
+            <w:r>
+              <w:rPr>
+                <w:rFonts w:ascii="Arial" w:hAnsi="Arial" w:cs="Arial"/>
+                <w:color w:val="000000"/>
+              </w:rPr>
+              <w:t>jabatan_pimpinan</w:t>
+            </w:r>
+            <w:proofErr w:type="spellEnd"/>
+            <w:r>
+              <w:rPr>
+                <w:rFonts w:ascii="Arial" w:hAnsi="Arial" w:cs="Arial"/>
+                <w:color w:val="000000"/>
+              </w:rPr>
+              <w:t>})</w:t>
             </w:r>
           </w:p>
         </w:tc>
@@ -484,44 +640,103 @@
           <w:rFonts w:ascii="Times New Roman" w:hAnsi="Times New Roman" w:cs="Times New Roman"/>
           <w:b/>
           <w:bCs/>
-          <w:lang w:val="fi-FI"/>
-        </w:rPr>
-      </w:pPr>
+        </w:rPr>
+      </w:pPr>
+      <w:proofErr w:type="spellStart"/>
       <w:r>
         <w:rPr>
           <w:rFonts w:ascii="Times New Roman" w:hAnsi="Times New Roman" w:cs="Times New Roman"/>
           <w:b/>
           <w:bCs/>
-          <w:lang w:val="fi-FI"/>
-        </w:rPr>
-        <w:t xml:space="preserve">Capaian Kinerja </w:t>
-      </w:r>
+        </w:rPr>
+        <w:t>Capaian</w:t>
+      </w:r>
+      <w:proofErr w:type="spellEnd"/>
       <w:r>
         <w:rPr>
           <w:rFonts w:ascii="Times New Roman" w:hAnsi="Times New Roman" w:cs="Times New Roman"/>
           <w:b/>
           <w:bCs/>
-          <w:lang w:val="fi-FI"/>
-        </w:rPr>
-        <w:t>${triwulan}</w:t>
+        </w:rPr>
+        <w:t xml:space="preserve"> Kinerja </w:t>
       </w:r>
       <w:r>
         <w:rPr>
           <w:rFonts w:ascii="Times New Roman" w:hAnsi="Times New Roman" w:cs="Times New Roman"/>
           <w:b/>
           <w:bCs/>
-          <w:lang w:val="fi-FI"/>
-        </w:rPr>
-        <w:t xml:space="preserve"> Tahun </w:t>
-      </w:r>
+        </w:rPr>
+        <w:t>${</w:t>
+      </w:r>
+      <w:proofErr w:type="spellStart"/>
       <w:r>
         <w:rPr>
           <w:rFonts w:ascii="Times New Roman" w:hAnsi="Times New Roman" w:cs="Times New Roman"/>
           <w:b/>
           <w:bCs/>
-          <w:lang w:val="fi-FI"/>
-        </w:rPr>
-        <w:t>${tahun}</w:t>
+        </w:rPr>
+        <w:t>triwulan_upper</w:t>
+      </w:r>
+      <w:proofErr w:type="spellEnd"/>
+      <w:r>
+        <w:rPr>
+          <w:rFonts w:ascii="Times New Roman" w:hAnsi="Times New Roman" w:cs="Times New Roman"/>
+          <w:b/>
+          <w:bCs/>
+        </w:rPr>
+        <w:t>}</w:t>
+      </w:r>
+      <w:r>
+        <w:rPr>
+          <w:rFonts w:ascii="Times New Roman" w:hAnsi="Times New Roman" w:cs="Times New Roman"/>
+          <w:b/>
+          <w:bCs/>
+        </w:rPr>
+        <w:t xml:space="preserve"> </w:t>
+      </w:r>
+      <w:proofErr w:type="spellStart"/>
+      <w:r>
+        <w:rPr>
+          <w:rFonts w:ascii="Times New Roman" w:hAnsi="Times New Roman" w:cs="Times New Roman"/>
+          <w:b/>
+          <w:bCs/>
+        </w:rPr>
+        <w:t>Tahun</w:t>
+      </w:r>
+      <w:proofErr w:type="spellEnd"/>
+      <w:r>
+        <w:rPr>
+          <w:rFonts w:ascii="Times New Roman" w:hAnsi="Times New Roman" w:cs="Times New Roman"/>
+          <w:b/>
+          <w:bCs/>
+        </w:rPr>
+        <w:t xml:space="preserve"> </w:t>
+      </w:r>
+      <w:r>
+        <w:rPr>
+          <w:rFonts w:ascii="Times New Roman" w:hAnsi="Times New Roman" w:cs="Times New Roman"/>
+          <w:b/>
+          <w:bCs/>
+        </w:rPr>
+        <w:t>${</w:t>
+      </w:r>
+      <w:proofErr w:type="spellStart"/>
+      <w:r>
+        <w:rPr>
+          <w:rFonts w:ascii="Times New Roman" w:hAnsi="Times New Roman" w:cs="Times New Roman"/>
+          <w:b/>
+          <w:bCs/>
+        </w:rPr>
+        <w:t>tahun</w:t>
+      </w:r>
+      <w:proofErr w:type="spellEnd"/>
+      <w:r>
+        <w:rPr>
+          <w:rFonts w:ascii="Times New Roman" w:hAnsi="Times New Roman" w:cs="Times New Roman"/>
+          <w:b/>
+          <w:bCs/>
+        </w:rPr>
+        <w:t>}</w:t>
       </w:r>
     </w:p>
     <w:p>
@@ -532,78 +747,389 @@
         <w:jc w:val="both"/>
         <w:rPr>
           <w:rFonts w:ascii="Times New Roman" w:hAnsi="Times New Roman" w:cs="Times New Roman"/>
-          <w:lang w:val="fi-FI"/>
-        </w:rPr>
-      </w:pPr>
-      <w:r>
-        <w:rPr>
-          <w:rFonts w:ascii="Times New Roman" w:hAnsi="Times New Roman" w:cs="Times New Roman"/>
-          <w:lang w:val="fi-FI"/>
-        </w:rPr>
-        <w:t xml:space="preserve">Capaian Kinerja IKU </w:t>
-      </w:r>
-      <w:r>
-        <w:rPr>
-          <w:rFonts w:ascii="Times New Roman" w:hAnsi="Times New Roman" w:cs="Times New Roman"/>
-          <w:lang w:val="fi-FI"/>
-        </w:rPr>
-        <w:t>${triwulan}</w:t>
-      </w:r>
-      <w:r>
-        <w:rPr>
-          <w:rFonts w:ascii="Times New Roman" w:hAnsi="Times New Roman" w:cs="Times New Roman"/>
-          <w:lang w:val="fi-FI"/>
-        </w:rPr>
-        <w:t xml:space="preserve"> tahun </w:t>
+        </w:rPr>
+      </w:pPr>
+      <w:proofErr w:type="spellStart"/>
+      <w:r>
+        <w:rPr>
+          <w:rFonts w:ascii="Times New Roman" w:hAnsi="Times New Roman" w:cs="Times New Roman"/>
+        </w:rPr>
+        <w:t>Capaian</w:t>
+      </w:r>
+      <w:proofErr w:type="spellEnd"/>
+      <w:r>
+        <w:rPr>
+          <w:rFonts w:ascii="Times New Roman" w:hAnsi="Times New Roman" w:cs="Times New Roman"/>
+        </w:rPr>
+        <w:t xml:space="preserve"> Kinerja IKU </w:t>
+      </w:r>
+      <w:r>
+        <w:rPr>
+          <w:rFonts w:ascii="Times New Roman" w:hAnsi="Times New Roman" w:cs="Times New Roman"/>
+        </w:rPr>
+        <w:t>${</w:t>
+      </w:r>
+      <w:proofErr w:type="spellStart"/>
+      <w:r>
+        <w:rPr>
+          <w:rFonts w:ascii="Times New Roman" w:hAnsi="Times New Roman" w:cs="Times New Roman"/>
+        </w:rPr>
+        <w:t>triwulan_upper</w:t>
+      </w:r>
+      <w:proofErr w:type="spellEnd"/>
+      <w:r>
+        <w:rPr>
+          <w:rFonts w:ascii="Times New Roman" w:hAnsi="Times New Roman" w:cs="Times New Roman"/>
+        </w:rPr>
+        <w:t>}</w:t>
+      </w:r>
+      <w:r>
+        <w:rPr>
+          <w:rFonts w:ascii="Times New Roman" w:hAnsi="Times New Roman" w:cs="Times New Roman"/>
+        </w:rPr>
+        <w:t xml:space="preserve"> </w:t>
+      </w:r>
+      <w:proofErr w:type="spellStart"/>
+      <w:r>
+        <w:rPr>
+          <w:rFonts w:ascii="Times New Roman" w:hAnsi="Times New Roman" w:cs="Times New Roman"/>
+        </w:rPr>
+        <w:t>tahun</w:t>
+      </w:r>
+      <w:proofErr w:type="spellEnd"/>
+      <w:r>
+        <w:rPr>
+          <w:rFonts w:ascii="Times New Roman" w:hAnsi="Times New Roman" w:cs="Times New Roman"/>
+        </w:rPr>
+        <w:t xml:space="preserve"> </w:t>
       </w:r>
       <w:r>
         <w:rPr>
           <w:rFonts w:ascii="Arial" w:hAnsi="Arial" w:cs="Arial"/>
           <w:color w:val="000000"/>
         </w:rPr>
-        <w:t>${tahun}</w:t>
-      </w:r>
+        <w:t>${</w:t>
+      </w:r>
+      <w:proofErr w:type="spellStart"/>
       <w:r>
         <w:rPr>
           <w:rFonts w:ascii="Arial" w:hAnsi="Arial" w:cs="Arial"/>
           <w:color w:val="000000"/>
         </w:rPr>
-        <w:t xml:space="preserve"> </w:t>
-      </w:r>
-      <w:r>
-        <w:rPr>
-          <w:rFonts w:ascii="Times New Roman" w:hAnsi="Times New Roman" w:cs="Times New Roman"/>
-          <w:lang w:val="fi-FI"/>
-        </w:rPr>
-        <w:t xml:space="preserve">pada BPS Kabupaten Tapin sebesar 110 persen (terhadap target </w:t>
-      </w:r>
-      <w:r>
-        <w:rPr>
-          <w:rFonts w:ascii="Times New Roman" w:hAnsi="Times New Roman" w:cs="Times New Roman"/>
-          <w:lang w:val="fi-FI"/>
-        </w:rPr>
-        <w:t>${triwulan}</w:t>
-      </w:r>
-      <w:r>
-        <w:rPr>
-          <w:rFonts w:ascii="Times New Roman" w:hAnsi="Times New Roman" w:cs="Times New Roman"/>
-          <w:lang w:val="fi-FI"/>
-        </w:rPr>
-        <w:t xml:space="preserve"> </w:t>
-      </w:r>
+        <w:t>tahun</w:t>
+      </w:r>
+      <w:proofErr w:type="spellEnd"/>
       <w:r>
         <w:rPr>
           <w:rFonts w:ascii="Arial" w:hAnsi="Arial" w:cs="Arial"/>
           <w:color w:val="000000"/>
         </w:rPr>
-        <w:t>${tahun}</w:t>
-      </w:r>
-      <w:r>
-        <w:rPr>
-          <w:rFonts w:ascii="Times New Roman" w:hAnsi="Times New Roman" w:cs="Times New Roman"/>
-          <w:lang w:val="fi-FI"/>
-        </w:rPr>
-        <w:t>) atau 6,38 persen (terhadap target tahunan). Adapun penjelasan detail capaian untuk setiap indikator kinerja disampaikan di bawah ini.</w:t>
+        <w:t xml:space="preserve">} </w:t>
+      </w:r>
+      <w:r>
+        <w:rPr>
+          <w:rFonts w:ascii="Times New Roman" w:hAnsi="Times New Roman" w:cs="Times New Roman"/>
+        </w:rPr>
+        <w:t xml:space="preserve">pada BPS </w:t>
+      </w:r>
+      <w:proofErr w:type="spellStart"/>
+      <w:r>
+        <w:rPr>
+          <w:rFonts w:ascii="Times New Roman" w:hAnsi="Times New Roman" w:cs="Times New Roman"/>
+        </w:rPr>
+        <w:t>Kabupaten</w:t>
+      </w:r>
+      <w:proofErr w:type="spellEnd"/>
+      <w:r>
+        <w:rPr>
+          <w:rFonts w:ascii="Times New Roman" w:hAnsi="Times New Roman" w:cs="Times New Roman"/>
+        </w:rPr>
+        <w:t xml:space="preserve"> Tapin </w:t>
+      </w:r>
+      <w:proofErr w:type="spellStart"/>
+      <w:r>
+        <w:rPr>
+          <w:rFonts w:ascii="Times New Roman" w:hAnsi="Times New Roman" w:cs="Times New Roman"/>
+        </w:rPr>
+        <w:t>sebesar</w:t>
+      </w:r>
+      <w:proofErr w:type="spellEnd"/>
+      <w:r>
+        <w:rPr>
+          <w:rFonts w:ascii="Times New Roman" w:hAnsi="Times New Roman" w:cs="Times New Roman"/>
+        </w:rPr>
+        <w:t xml:space="preserve"> 110 </w:t>
+      </w:r>
+      <w:proofErr w:type="spellStart"/>
+      <w:r>
+        <w:rPr>
+          <w:rFonts w:ascii="Times New Roman" w:hAnsi="Times New Roman" w:cs="Times New Roman"/>
+        </w:rPr>
+        <w:t>persen</w:t>
+      </w:r>
+      <w:proofErr w:type="spellEnd"/>
+      <w:r>
+        <w:rPr>
+          <w:rFonts w:ascii="Times New Roman" w:hAnsi="Times New Roman" w:cs="Times New Roman"/>
+        </w:rPr>
+        <w:t xml:space="preserve"> (</w:t>
+      </w:r>
+      <w:proofErr w:type="spellStart"/>
+      <w:r>
+        <w:rPr>
+          <w:rFonts w:ascii="Times New Roman" w:hAnsi="Times New Roman" w:cs="Times New Roman"/>
+        </w:rPr>
+        <w:t>terhadap</w:t>
+      </w:r>
+      <w:proofErr w:type="spellEnd"/>
+      <w:r>
+        <w:rPr>
+          <w:rFonts w:ascii="Times New Roman" w:hAnsi="Times New Roman" w:cs="Times New Roman"/>
+        </w:rPr>
+        <w:t xml:space="preserve"> target </w:t>
+      </w:r>
+      <w:r>
+        <w:rPr>
+          <w:rFonts w:ascii="Times New Roman" w:hAnsi="Times New Roman" w:cs="Times New Roman"/>
+        </w:rPr>
+        <w:t>${</w:t>
+      </w:r>
+      <w:proofErr w:type="spellStart"/>
+      <w:r>
+        <w:rPr>
+          <w:rFonts w:ascii="Times New Roman" w:hAnsi="Times New Roman" w:cs="Times New Roman"/>
+        </w:rPr>
+        <w:t>triwulan_upper</w:t>
+      </w:r>
+      <w:proofErr w:type="spellEnd"/>
+      <w:r>
+        <w:rPr>
+          <w:rFonts w:ascii="Times New Roman" w:hAnsi="Times New Roman" w:cs="Times New Roman"/>
+        </w:rPr>
+        <w:t>}</w:t>
+      </w:r>
+      <w:r>
+        <w:rPr>
+          <w:rFonts w:ascii="Times New Roman" w:hAnsi="Times New Roman" w:cs="Times New Roman"/>
+        </w:rPr>
+        <w:t xml:space="preserve"> </w:t>
+      </w:r>
+      <w:r>
+        <w:rPr>
+          <w:rFonts w:ascii="Arial" w:hAnsi="Arial" w:cs="Arial"/>
+          <w:color w:val="000000"/>
+        </w:rPr>
+        <w:t>${</w:t>
+      </w:r>
+      <w:proofErr w:type="spellStart"/>
+      <w:r>
+        <w:rPr>
+          <w:rFonts w:ascii="Arial" w:hAnsi="Arial" w:cs="Arial"/>
+          <w:color w:val="000000"/>
+        </w:rPr>
+        <w:t>tahun</w:t>
+      </w:r>
+      <w:proofErr w:type="spellEnd"/>
+      <w:r>
+        <w:rPr>
+          <w:rFonts w:ascii="Arial" w:hAnsi="Arial" w:cs="Arial"/>
+          <w:color w:val="000000"/>
+        </w:rPr>
+        <w:t>}</w:t>
+      </w:r>
+      <w:r>
+        <w:rPr>
+          <w:rFonts w:ascii="Times New Roman" w:hAnsi="Times New Roman" w:cs="Times New Roman"/>
+        </w:rPr>
+        <w:t xml:space="preserve">) </w:t>
+      </w:r>
+      <w:proofErr w:type="spellStart"/>
+      <w:r>
+        <w:rPr>
+          <w:rFonts w:ascii="Times New Roman" w:hAnsi="Times New Roman" w:cs="Times New Roman"/>
+        </w:rPr>
+        <w:t>atau</w:t>
+      </w:r>
+      <w:proofErr w:type="spellEnd"/>
+      <w:r>
+        <w:rPr>
+          <w:rFonts w:ascii="Times New Roman" w:hAnsi="Times New Roman" w:cs="Times New Roman"/>
+        </w:rPr>
+        <w:t xml:space="preserve"> 6,38 </w:t>
+      </w:r>
+      <w:proofErr w:type="spellStart"/>
+      <w:r>
+        <w:rPr>
+          <w:rFonts w:ascii="Times New Roman" w:hAnsi="Times New Roman" w:cs="Times New Roman"/>
+        </w:rPr>
+        <w:t>persen</w:t>
+      </w:r>
+      <w:proofErr w:type="spellEnd"/>
+      <w:r>
+        <w:rPr>
+          <w:rFonts w:ascii="Times New Roman" w:hAnsi="Times New Roman" w:cs="Times New Roman"/>
+        </w:rPr>
+        <w:t xml:space="preserve"> (</w:t>
+      </w:r>
+      <w:proofErr w:type="spellStart"/>
+      <w:r>
+        <w:rPr>
+          <w:rFonts w:ascii="Times New Roman" w:hAnsi="Times New Roman" w:cs="Times New Roman"/>
+        </w:rPr>
+        <w:t>terhadap</w:t>
+      </w:r>
+      <w:proofErr w:type="spellEnd"/>
+      <w:r>
+        <w:rPr>
+          <w:rFonts w:ascii="Times New Roman" w:hAnsi="Times New Roman" w:cs="Times New Roman"/>
+        </w:rPr>
+        <w:t xml:space="preserve"> target </w:t>
+      </w:r>
+      <w:proofErr w:type="spellStart"/>
+      <w:r>
+        <w:rPr>
+          <w:rFonts w:ascii="Times New Roman" w:hAnsi="Times New Roman" w:cs="Times New Roman"/>
+        </w:rPr>
+        <w:t>tahunan</w:t>
+      </w:r>
+      <w:proofErr w:type="spellEnd"/>
+      <w:r>
+        <w:rPr>
+          <w:rFonts w:ascii="Times New Roman" w:hAnsi="Times New Roman" w:cs="Times New Roman"/>
+        </w:rPr>
+        <w:t xml:space="preserve">). </w:t>
+      </w:r>
+      <w:r>
+        <w:rPr>
+          <w:rFonts w:ascii="Times New Roman" w:hAnsi="Times New Roman" w:cs="Times New Roman"/>
+        </w:rPr>
+        <w:t xml:space="preserve">Adapun </w:t>
+      </w:r>
+      <w:proofErr w:type="spellStart"/>
+      <w:r>
+        <w:rPr>
+          <w:rFonts w:ascii="Times New Roman" w:hAnsi="Times New Roman" w:cs="Times New Roman"/>
+        </w:rPr>
+        <w:t>penjelasan</w:t>
+      </w:r>
+      <w:proofErr w:type="spellEnd"/>
+      <w:r>
+        <w:rPr>
+          <w:rFonts w:ascii="Times New Roman" w:hAnsi="Times New Roman" w:cs="Times New Roman"/>
+        </w:rPr>
+        <w:t xml:space="preserve"> detail </w:t>
+      </w:r>
+      <w:proofErr w:type="spellStart"/>
+      <w:r>
+        <w:rPr>
+          <w:rFonts w:ascii="Times New Roman" w:hAnsi="Times New Roman" w:cs="Times New Roman"/>
+        </w:rPr>
+        <w:t>capaian</w:t>
+      </w:r>
+      <w:proofErr w:type="spellEnd"/>
+      <w:r>
+        <w:rPr>
+          <w:rFonts w:ascii="Times New Roman" w:hAnsi="Times New Roman" w:cs="Times New Roman"/>
+        </w:rPr>
+        <w:t xml:space="preserve"> </w:t>
+      </w:r>
+      <w:proofErr w:type="spellStart"/>
+      <w:r>
+        <w:rPr>
+          <w:rFonts w:ascii="Times New Roman" w:hAnsi="Times New Roman" w:cs="Times New Roman"/>
+        </w:rPr>
+        <w:t>untuk</w:t>
+      </w:r>
+      <w:proofErr w:type="spellEnd"/>
+      <w:r>
+        <w:rPr>
+          <w:rFonts w:ascii="Times New Roman" w:hAnsi="Times New Roman" w:cs="Times New Roman"/>
+        </w:rPr>
+        <w:t xml:space="preserve"> </w:t>
+      </w:r>
+      <w:proofErr w:type="spellStart"/>
+      <w:r>
+        <w:rPr>
+          <w:rFonts w:ascii="Times New Roman" w:hAnsi="Times New Roman" w:cs="Times New Roman"/>
+        </w:rPr>
+        <w:t>setiap</w:t>
+      </w:r>
+      <w:proofErr w:type="spellEnd"/>
+      <w:r>
+        <w:rPr>
+          <w:rFonts w:ascii="Times New Roman" w:hAnsi="Times New Roman" w:cs="Times New Roman"/>
+        </w:rPr>
+        <w:t xml:space="preserve"> </w:t>
+      </w:r>
+      <w:proofErr w:type="spellStart"/>
+      <w:r>
+        <w:rPr>
+          <w:rFonts w:ascii="Times New Roman" w:hAnsi="Times New Roman" w:cs="Times New Roman"/>
+        </w:rPr>
+        <w:t>indikator</w:t>
+      </w:r>
+      <w:proofErr w:type="spellEnd"/>
+      <w:r>
+        <w:rPr>
+          <w:rFonts w:ascii="Times New Roman" w:hAnsi="Times New Roman" w:cs="Times New Roman"/>
+        </w:rPr>
+        <w:t xml:space="preserve"> </w:t>
+      </w:r>
+      <w:proofErr w:type="spellStart"/>
+      <w:r>
+        <w:rPr>
+          <w:rFonts w:ascii="Times New Roman" w:hAnsi="Times New Roman" w:cs="Times New Roman"/>
+        </w:rPr>
+        <w:t>kinerja</w:t>
+      </w:r>
+      <w:proofErr w:type="spellEnd"/>
+      <w:r>
+        <w:rPr>
+          <w:rFonts w:ascii="Times New Roman" w:hAnsi="Times New Roman" w:cs="Times New Roman"/>
+        </w:rPr>
+        <w:t xml:space="preserve"> </w:t>
+      </w:r>
+      <w:proofErr w:type="spellStart"/>
+      <w:r>
+        <w:rPr>
+          <w:rFonts w:ascii="Times New Roman" w:hAnsi="Times New Roman" w:cs="Times New Roman"/>
+        </w:rPr>
+        <w:t>disampaikan</w:t>
+      </w:r>
+      <w:proofErr w:type="spellEnd"/>
+      <w:r>
+        <w:rPr>
+          <w:rFonts w:ascii="Times New Roman" w:hAnsi="Times New Roman" w:cs="Times New Roman"/>
+        </w:rPr>
+        <w:t xml:space="preserve"> di </w:t>
+      </w:r>
+      <w:proofErr w:type="spellStart"/>
+      <w:r>
+        <w:rPr>
+          <w:rFonts w:ascii="Times New Roman" w:hAnsi="Times New Roman" w:cs="Times New Roman"/>
+        </w:rPr>
+        <w:t>bawah</w:t>
+      </w:r>
+      <w:proofErr w:type="spellEnd"/>
+      <w:r>
+        <w:rPr>
+          <w:rFonts w:ascii="Times New Roman" w:hAnsi="Times New Roman" w:cs="Times New Roman"/>
+        </w:rPr>
+        <w:t xml:space="preserve"> </w:t>
+      </w:r>
+      <w:proofErr w:type="spellStart"/>
+      <w:r>
+        <w:rPr>
+          <w:rFonts w:ascii="Times New Roman" w:hAnsi="Times New Roman" w:cs="Times New Roman"/>
+        </w:rPr>
+        <w:t>ini</w:t>
+      </w:r>
+      <w:proofErr w:type="spellEnd"/>
+      <w:r>
+        <w:rPr>
+          <w:rFonts w:ascii="Times New Roman" w:hAnsi="Times New Roman" w:cs="Times New Roman"/>
+        </w:rPr>
+        <w:t>.</w:t>
       </w:r>
     </w:p>
     <w:p>
@@ -614,15 +1140,38 @@
         <w:jc w:val="both"/>
         <w:rPr>
           <w:rFonts w:ascii="Times New Roman" w:hAnsi="Times New Roman" w:cs="Times New Roman"/>
-          <w:lang w:val="fi-FI"/>
-        </w:rPr>
-      </w:pPr>
-      <w:r>
-        <w:rPr>
-          <w:rFonts w:ascii="Times New Roman" w:hAnsi="Times New Roman" w:cs="Times New Roman"/>
-          <w:lang w:val="fi-FI"/>
-        </w:rPr>
-        <w:t>${block_indikator}</w:t>
+        </w:rPr>
+      </w:pPr>
+    </w:p>
+    <w:p>
+      <w:pPr>
+        <w:pStyle w:val="ListParagraph"/>
+        <w:spacing w:line="276" w:lineRule="auto"/>
+        <w:ind w:left="426"/>
+        <w:jc w:val="both"/>
+        <w:rPr>
+          <w:rFonts w:ascii="Times New Roman" w:hAnsi="Times New Roman" w:cs="Times New Roman"/>
+        </w:rPr>
+      </w:pPr>
+      <w:r>
+        <w:rPr>
+          <w:rFonts w:ascii="Times New Roman" w:hAnsi="Times New Roman" w:cs="Times New Roman"/>
+        </w:rPr>
+        <w:t>${</w:t>
+      </w:r>
+      <w:proofErr w:type="spellStart"/>
+      <w:r>
+        <w:rPr>
+          <w:rFonts w:ascii="Times New Roman" w:hAnsi="Times New Roman" w:cs="Times New Roman"/>
+        </w:rPr>
+        <w:t>block_indikator</w:t>
+      </w:r>
+      <w:proofErr w:type="spellEnd"/>
+      <w:r>
+        <w:rPr>
+          <w:rFonts w:ascii="Times New Roman" w:hAnsi="Times New Roman" w:cs="Times New Roman"/>
+        </w:rPr>
+        <w:t>}</w:t>
       </w:r>
     </w:p>
     <w:tbl>
@@ -869,7 +1418,21 @@
                 <w:rFonts w:ascii="Times New Roman" w:hAnsi="Times New Roman" w:cs="Times New Roman"/>
                 <w:lang w:val="fi-FI"/>
               </w:rPr>
-              <w:t>${triwulan}</w:t>
+              <w:t>${</w:t>
+            </w:r>
+            <w:r>
+              <w:rPr>
+                <w:rFonts w:ascii="Times New Roman" w:hAnsi="Times New Roman" w:cs="Times New Roman"/>
+                <w:lang w:val="fi-FI"/>
+              </w:rPr>
+              <w:t>triwulan_upper</w:t>
+            </w:r>
+            <w:r>
+              <w:rPr>
+                <w:rFonts w:ascii="Times New Roman" w:hAnsi="Times New Roman" w:cs="Times New Roman"/>
+                <w:lang w:val="fi-FI"/>
+              </w:rPr>
+              <w:t>}</w:t>
             </w:r>
           </w:p>
         </w:tc>
@@ -1646,34 +2209,198 @@
               <w:jc w:val="both"/>
               <w:rPr>
                 <w:rFonts w:ascii="Times New Roman" w:hAnsi="Times New Roman" w:cs="Times New Roman"/>
-                <w:lang w:val="fi-FI"/>
-              </w:rPr>
-            </w:pPr>
-            <w:r>
-              <w:rPr>
-                <w:rFonts w:ascii="Times New Roman" w:hAnsi="Times New Roman" w:cs="Times New Roman"/>
-                <w:b/>
-                <w:bCs/>
-                <w:lang w:val="fi-FI"/>
-              </w:rPr>
-              <w:t>Realisasi Volume RO dan Progress Pelaksanaan Kegiatan sampai dengan Triwulan Berjalan</w:t>
-            </w:r>
-            <w:r>
-              <w:rPr>
-                <w:rFonts w:ascii="Times New Roman" w:hAnsi="Times New Roman" w:cs="Times New Roman"/>
-                <w:b/>
-                <w:bCs/>
-                <w:lang w:val="fi-FI"/>
+              </w:rPr>
+            </w:pPr>
+            <w:proofErr w:type="spellStart"/>
+            <w:r>
+              <w:rPr>
+                <w:rFonts w:ascii="Times New Roman" w:hAnsi="Times New Roman" w:cs="Times New Roman"/>
+                <w:b/>
+                <w:bCs/>
+              </w:rPr>
+              <w:t>Realisasi</w:t>
+            </w:r>
+            <w:proofErr w:type="spellEnd"/>
+            <w:r>
+              <w:rPr>
+                <w:rFonts w:ascii="Times New Roman" w:hAnsi="Times New Roman" w:cs="Times New Roman"/>
+                <w:b/>
+                <w:bCs/>
+              </w:rPr>
+              <w:t xml:space="preserve"> Volume RO dan Progress </w:t>
+            </w:r>
+            <w:proofErr w:type="spellStart"/>
+            <w:r>
+              <w:rPr>
+                <w:rFonts w:ascii="Times New Roman" w:hAnsi="Times New Roman" w:cs="Times New Roman"/>
+                <w:b/>
+                <w:bCs/>
+              </w:rPr>
+              <w:t>Pelaksanaan</w:t>
+            </w:r>
+            <w:proofErr w:type="spellEnd"/>
+            <w:r>
+              <w:rPr>
+                <w:rFonts w:ascii="Times New Roman" w:hAnsi="Times New Roman" w:cs="Times New Roman"/>
+                <w:b/>
+                <w:bCs/>
+              </w:rPr>
+              <w:t xml:space="preserve"> </w:t>
+            </w:r>
+            <w:proofErr w:type="spellStart"/>
+            <w:r>
+              <w:rPr>
+                <w:rFonts w:ascii="Times New Roman" w:hAnsi="Times New Roman" w:cs="Times New Roman"/>
+                <w:b/>
+                <w:bCs/>
+              </w:rPr>
+              <w:t>Kegiatan</w:t>
+            </w:r>
+            <w:proofErr w:type="spellEnd"/>
+            <w:r>
+              <w:rPr>
+                <w:rFonts w:ascii="Times New Roman" w:hAnsi="Times New Roman" w:cs="Times New Roman"/>
+                <w:b/>
+                <w:bCs/>
+              </w:rPr>
+              <w:t xml:space="preserve"> </w:t>
+            </w:r>
+            <w:proofErr w:type="spellStart"/>
+            <w:r>
+              <w:rPr>
+                <w:rFonts w:ascii="Times New Roman" w:hAnsi="Times New Roman" w:cs="Times New Roman"/>
+                <w:b/>
+                <w:bCs/>
+              </w:rPr>
+              <w:t>sampai</w:t>
+            </w:r>
+            <w:proofErr w:type="spellEnd"/>
+            <w:r>
+              <w:rPr>
+                <w:rFonts w:ascii="Times New Roman" w:hAnsi="Times New Roman" w:cs="Times New Roman"/>
+                <w:b/>
+                <w:bCs/>
+              </w:rPr>
+              <w:t xml:space="preserve"> </w:t>
+            </w:r>
+            <w:proofErr w:type="spellStart"/>
+            <w:r>
+              <w:rPr>
+                <w:rFonts w:ascii="Times New Roman" w:hAnsi="Times New Roman" w:cs="Times New Roman"/>
+                <w:b/>
+                <w:bCs/>
+              </w:rPr>
+              <w:t>dengan</w:t>
+            </w:r>
+            <w:proofErr w:type="spellEnd"/>
+            <w:r>
+              <w:rPr>
+                <w:rFonts w:ascii="Times New Roman" w:hAnsi="Times New Roman" w:cs="Times New Roman"/>
+                <w:b/>
+                <w:bCs/>
+              </w:rPr>
+              <w:t xml:space="preserve"> </w:t>
+            </w:r>
+            <w:proofErr w:type="spellStart"/>
+            <w:r>
+              <w:rPr>
+                <w:rFonts w:ascii="Times New Roman" w:hAnsi="Times New Roman" w:cs="Times New Roman"/>
+                <w:b/>
+                <w:bCs/>
+              </w:rPr>
+              <w:t>Triwulan</w:t>
+            </w:r>
+            <w:proofErr w:type="spellEnd"/>
+            <w:r>
+              <w:rPr>
+                <w:rFonts w:ascii="Times New Roman" w:hAnsi="Times New Roman" w:cs="Times New Roman"/>
+                <w:b/>
+                <w:bCs/>
+              </w:rPr>
+              <w:t xml:space="preserve"> </w:t>
+            </w:r>
+            <w:proofErr w:type="spellStart"/>
+            <w:r>
+              <w:rPr>
+                <w:rFonts w:ascii="Times New Roman" w:hAnsi="Times New Roman" w:cs="Times New Roman"/>
+                <w:b/>
+                <w:bCs/>
+              </w:rPr>
+              <w:t>Berjalan</w:t>
+            </w:r>
+            <w:proofErr w:type="spellEnd"/>
+            <w:r>
+              <w:rPr>
+                <w:rFonts w:ascii="Times New Roman" w:hAnsi="Times New Roman" w:cs="Times New Roman"/>
+                <w:b/>
+                <w:bCs/>
               </w:rPr>
               <w:t xml:space="preserve"> : </w:t>
             </w:r>
-            <w:r>
-              <w:rPr>
-                <w:rFonts w:ascii="Times New Roman" w:hAnsi="Times New Roman" w:cs="Times New Roman"/>
-                <w:lang w:val="fi-FI"/>
-              </w:rPr>
-              <w:t>Realisasi volume RO kegiatan Statistik Kependudukan dan Ketenagakerjaan</w:t>
-            </w:r>
+            <w:proofErr w:type="spellStart"/>
+            <w:r>
+              <w:rPr>
+                <w:rFonts w:ascii="Times New Roman" w:hAnsi="Times New Roman" w:cs="Times New Roman"/>
+              </w:rPr>
+              <w:t>Realisasi</w:t>
+            </w:r>
+            <w:proofErr w:type="spellEnd"/>
+            <w:r>
+              <w:rPr>
+                <w:rFonts w:ascii="Times New Roman" w:hAnsi="Times New Roman" w:cs="Times New Roman"/>
+              </w:rPr>
+              <w:t xml:space="preserve"> volume RO </w:t>
+            </w:r>
+            <w:proofErr w:type="spellStart"/>
+            <w:r>
+              <w:rPr>
+                <w:rFonts w:ascii="Times New Roman" w:hAnsi="Times New Roman" w:cs="Times New Roman"/>
+              </w:rPr>
+              <w:t>kegiatan</w:t>
+            </w:r>
+            <w:proofErr w:type="spellEnd"/>
+            <w:r>
+              <w:rPr>
+                <w:rFonts w:ascii="Times New Roman" w:hAnsi="Times New Roman" w:cs="Times New Roman"/>
+              </w:rPr>
+              <w:t xml:space="preserve"> </w:t>
+            </w:r>
+            <w:proofErr w:type="spellStart"/>
+            <w:r>
+              <w:rPr>
+                <w:rFonts w:ascii="Times New Roman" w:hAnsi="Times New Roman" w:cs="Times New Roman"/>
+              </w:rPr>
+              <w:t>Statistik</w:t>
+            </w:r>
+            <w:proofErr w:type="spellEnd"/>
+            <w:r>
+              <w:rPr>
+                <w:rFonts w:ascii="Times New Roman" w:hAnsi="Times New Roman" w:cs="Times New Roman"/>
+              </w:rPr>
+              <w:t xml:space="preserve"> </w:t>
+            </w:r>
+            <w:proofErr w:type="spellStart"/>
+            <w:r>
+              <w:rPr>
+                <w:rFonts w:ascii="Times New Roman" w:hAnsi="Times New Roman" w:cs="Times New Roman"/>
+              </w:rPr>
+              <w:t>Kependudukan</w:t>
+            </w:r>
+            <w:proofErr w:type="spellEnd"/>
+            <w:r>
+              <w:rPr>
+                <w:rFonts w:ascii="Times New Roman" w:hAnsi="Times New Roman" w:cs="Times New Roman"/>
+              </w:rPr>
+              <w:t xml:space="preserve"> dan </w:t>
+            </w:r>
+            <w:proofErr w:type="spellStart"/>
+            <w:r>
+              <w:rPr>
+                <w:rFonts w:ascii="Times New Roman" w:hAnsi="Times New Roman" w:cs="Times New Roman"/>
+              </w:rPr>
+              <w:t>Ketenagakerjaan</w:t>
+            </w:r>
+            <w:proofErr w:type="spellEnd"/>
           </w:p>
           <w:tbl>
             <w:tblPr>
@@ -1700,14 +2427,21 @@
                     <w:jc w:val="center"/>
                     <w:rPr>
                       <w:rFonts w:ascii="Times New Roman" w:hAnsi="Times New Roman" w:cs="Times New Roman"/>
-                      <w:lang w:val="fi-FI"/>
                     </w:rPr>
                   </w:pPr>
+                  <w:proofErr w:type="spellStart"/>
                   <w:r>
                     <w:rPr>
                       <w:rFonts w:ascii="Times New Roman" w:hAnsi="Times New Roman" w:cs="Times New Roman"/>
                     </w:rPr>
-                    <w:t>Rincian Output</w:t>
+                    <w:t>Rincian</w:t>
+                  </w:r>
+                  <w:proofErr w:type="spellEnd"/>
+                  <w:r>
+                    <w:rPr>
+                      <w:rFonts w:ascii="Times New Roman" w:hAnsi="Times New Roman" w:cs="Times New Roman"/>
+                    </w:rPr>
+                    <w:t xml:space="preserve"> Output</w:t>
                   </w:r>
                 </w:p>
               </w:tc>
@@ -1724,14 +2458,21 @@
                     <w:jc w:val="center"/>
                     <w:rPr>
                       <w:rFonts w:ascii="Times New Roman" w:hAnsi="Times New Roman" w:cs="Times New Roman"/>
-                      <w:lang w:val="fi-FI"/>
                     </w:rPr>
                   </w:pPr>
+                  <w:proofErr w:type="spellStart"/>
                   <w:r>
                     <w:rPr>
                       <w:rFonts w:ascii="Times New Roman" w:hAnsi="Times New Roman" w:cs="Times New Roman"/>
                     </w:rPr>
-                    <w:t>Realisasi Volume RO</w:t>
+                    <w:t>Realisasi</w:t>
+                  </w:r>
+                  <w:proofErr w:type="spellEnd"/>
+                  <w:r>
+                    <w:rPr>
+                      <w:rFonts w:ascii="Times New Roman" w:hAnsi="Times New Roman" w:cs="Times New Roman"/>
+                    </w:rPr>
+                    <w:t xml:space="preserve"> Volume RO</w:t>
                   </w:r>
                 </w:p>
               </w:tc>
@@ -1748,14 +2489,49 @@
                     <w:jc w:val="center"/>
                     <w:rPr>
                       <w:rFonts w:ascii="Times New Roman" w:hAnsi="Times New Roman" w:cs="Times New Roman"/>
-                      <w:lang w:val="fi-FI"/>
                     </w:rPr>
                   </w:pPr>
+                  <w:proofErr w:type="spellStart"/>
                   <w:r>
                     <w:rPr>
                       <w:rFonts w:ascii="Times New Roman" w:hAnsi="Times New Roman" w:cs="Times New Roman"/>
                     </w:rPr>
-                    <w:t>Progres Pelaksanaan Kegiatan (Persen)</w:t>
+                    <w:t>Progres</w:t>
+                  </w:r>
+                  <w:proofErr w:type="spellEnd"/>
+                  <w:r>
+                    <w:rPr>
+                      <w:rFonts w:ascii="Times New Roman" w:hAnsi="Times New Roman" w:cs="Times New Roman"/>
+                    </w:rPr>
+                    <w:t xml:space="preserve"> </w:t>
+                  </w:r>
+                  <w:proofErr w:type="spellStart"/>
+                  <w:r>
+                    <w:rPr>
+                      <w:rFonts w:ascii="Times New Roman" w:hAnsi="Times New Roman" w:cs="Times New Roman"/>
+                    </w:rPr>
+                    <w:t>Pelaksanaan</w:t>
+                  </w:r>
+                  <w:proofErr w:type="spellEnd"/>
+                  <w:r>
+                    <w:rPr>
+                      <w:rFonts w:ascii="Times New Roman" w:hAnsi="Times New Roman" w:cs="Times New Roman"/>
+                    </w:rPr>
+                    <w:t xml:space="preserve"> </w:t>
+                  </w:r>
+                  <w:proofErr w:type="spellStart"/>
+                  <w:r>
+                    <w:rPr>
+                      <w:rFonts w:ascii="Times New Roman" w:hAnsi="Times New Roman" w:cs="Times New Roman"/>
+                    </w:rPr>
+                    <w:t>Kegiatan</w:t>
+                  </w:r>
+                  <w:proofErr w:type="spellEnd"/>
+                  <w:r>
+                    <w:rPr>
+                      <w:rFonts w:ascii="Times New Roman" w:hAnsi="Times New Roman" w:cs="Times New Roman"/>
+                    </w:rPr>
+                    <w:t xml:space="preserve"> (Persen)</w:t>
                   </w:r>
                 </w:p>
               </w:tc>
@@ -1787,12 +2563,14 @@
                     </w:rPr>
                     <w:t>{</w:t>
                   </w:r>
+                  <w:proofErr w:type="spellStart"/>
                   <w:r>
                     <w:rPr>
                       <w:rFonts w:ascii="Times New Roman" w:hAnsi="Times New Roman" w:cs="Times New Roman"/>
                     </w:rPr>
                     <w:t>nama_output</w:t>
                   </w:r>
+                  <w:proofErr w:type="spellEnd"/>
                   <w:r>
                     <w:rPr>
                       <w:rFonts w:ascii="Times New Roman" w:hAnsi="Times New Roman" w:cs="Times New Roman"/>
@@ -1828,12 +2606,14 @@
                     </w:rPr>
                     <w:t>{</w:t>
                   </w:r>
+                  <w:proofErr w:type="spellStart"/>
                   <w:r>
                     <w:rPr>
                       <w:rFonts w:ascii="Times New Roman" w:hAnsi="Times New Roman" w:cs="Times New Roman"/>
                     </w:rPr>
                     <w:t>output_volume</w:t>
                   </w:r>
+                  <w:proofErr w:type="spellEnd"/>
                   <w:r>
                     <w:rPr>
                       <w:rFonts w:ascii="Times New Roman" w:hAnsi="Times New Roman" w:cs="Times New Roman"/>
@@ -1869,12 +2649,14 @@
                     </w:rPr>
                     <w:t>{</w:t>
                   </w:r>
+                  <w:proofErr w:type="spellStart"/>
                   <w:r>
                     <w:rPr>
                       <w:rFonts w:ascii="Times New Roman" w:hAnsi="Times New Roman" w:cs="Times New Roman"/>
                     </w:rPr>
                     <w:t>output_progres</w:t>
                   </w:r>
+                  <w:proofErr w:type="spellEnd"/>
                   <w:r>
                     <w:rPr>
                       <w:rFonts w:ascii="Times New Roman" w:hAnsi="Times New Roman" w:cs="Times New Roman"/>
@@ -1893,7 +2675,6 @@
               <w:jc w:val="both"/>
               <w:rPr>
                 <w:rFonts w:ascii="Times New Roman" w:hAnsi="Times New Roman" w:cs="Times New Roman"/>
-                <w:lang w:val="fi-FI"/>
               </w:rPr>
             </w:pPr>
           </w:p>
@@ -1907,26 +2688,15 @@
                 <w:rFonts w:ascii="Times New Roman" w:hAnsi="Times New Roman" w:cs="Times New Roman"/>
                 <w:b/>
                 <w:bCs/>
-                <w:lang w:val="fi-FI"/>
-              </w:rPr>
-            </w:pPr>
-            <w:r>
-              <w:rPr>
-                <w:rFonts w:ascii="Times New Roman" w:hAnsi="Times New Roman" w:cs="Times New Roman"/>
-                <w:b/>
-                <w:bCs/>
-                <w:lang w:val="fi-FI"/>
-              </w:rPr>
-              <w:t>Kendala</w:t>
-            </w:r>
-            <w:r>
-              <w:rPr>
-                <w:rFonts w:ascii="Times New Roman" w:hAnsi="Times New Roman" w:cs="Times New Roman"/>
-                <w:b/>
-                <w:bCs/>
-                <w:lang w:val="fi-FI"/>
-              </w:rPr>
-              <w:t>:</w:t>
+              </w:rPr>
+            </w:pPr>
+            <w:r>
+              <w:rPr>
+                <w:rFonts w:ascii="Times New Roman" w:hAnsi="Times New Roman" w:cs="Times New Roman"/>
+                <w:b/>
+                <w:bCs/>
+              </w:rPr>
+              <w:t>Kendala:</w:t>
             </w:r>
           </w:p>
           <w:p>
@@ -2088,6 +2858,7 @@
                 <w:bCs/>
                 <w:lang w:val="fi-FI"/>
               </w:rPr>
+              <w:lastRenderedPageBreak/>
               <w:t>Rencana Tindak Lanjut:</w:t>
             </w:r>
           </w:p>
@@ -2110,7 +2881,6 @@
                 <w:rFonts w:ascii="Times New Roman" w:hAnsi="Times New Roman" w:cs="Times New Roman"/>
                 <w:lang w:val="fi-FI"/>
               </w:rPr>
-              <w:lastRenderedPageBreak/>
               <w:t>$</w:t>
             </w:r>
             <w:r>
@@ -2151,7 +2921,6 @@
                 <w:bCs/>
                 <w:lang w:val="fi-FI"/>
               </w:rPr>
-              <w:lastRenderedPageBreak/>
               <w:t>PIC Tindak Lanjut:</w:t>
             </w:r>
           </w:p>
@@ -2174,7 +2943,6 @@
                 <w:rFonts w:ascii="Times New Roman" w:hAnsi="Times New Roman" w:cs="Times New Roman"/>
                 <w:lang w:val="fi-FI"/>
               </w:rPr>
-              <w:lastRenderedPageBreak/>
               <w:t>${pic_tindak_lanjut}</w:t>
             </w:r>
           </w:p>
@@ -2248,9 +3016,59 @@
                 <w:bCs/>
                 <w:lang w:val="en-ID"/>
               </w:rPr>
-              <w:lastRenderedPageBreak/>
-              <w:t>Dasar Hitung/Bukti Dukung/Lainnya</w:t>
-            </w:r>
+              <w:t xml:space="preserve">Dasar </w:t>
+            </w:r>
+            <w:proofErr w:type="spellStart"/>
+            <w:r>
+              <w:rPr>
+                <w:rFonts w:ascii="Times New Roman" w:hAnsi="Times New Roman" w:cs="Times New Roman"/>
+                <w:b/>
+                <w:bCs/>
+                <w:lang w:val="en-ID"/>
+              </w:rPr>
+              <w:t>Hitung</w:t>
+            </w:r>
+            <w:proofErr w:type="spellEnd"/>
+            <w:r>
+              <w:rPr>
+                <w:rFonts w:ascii="Times New Roman" w:hAnsi="Times New Roman" w:cs="Times New Roman"/>
+                <w:b/>
+                <w:bCs/>
+                <w:lang w:val="en-ID"/>
+              </w:rPr>
+              <w:t xml:space="preserve">/Bukti </w:t>
+            </w:r>
+            <w:proofErr w:type="spellStart"/>
+            <w:r>
+              <w:rPr>
+                <w:rFonts w:ascii="Times New Roman" w:hAnsi="Times New Roman" w:cs="Times New Roman"/>
+                <w:b/>
+                <w:bCs/>
+                <w:lang w:val="en-ID"/>
+              </w:rPr>
+              <w:t>Dukung</w:t>
+            </w:r>
+            <w:proofErr w:type="spellEnd"/>
+            <w:r>
+              <w:rPr>
+                <w:rFonts w:ascii="Times New Roman" w:hAnsi="Times New Roman" w:cs="Times New Roman"/>
+                <w:b/>
+                <w:bCs/>
+                <w:lang w:val="en-ID"/>
+              </w:rPr>
+              <w:t>/</w:t>
+            </w:r>
+            <w:proofErr w:type="spellStart"/>
+            <w:r>
+              <w:rPr>
+                <w:rFonts w:ascii="Times New Roman" w:hAnsi="Times New Roman" w:cs="Times New Roman"/>
+                <w:b/>
+                <w:bCs/>
+                <w:lang w:val="en-ID"/>
+              </w:rPr>
+              <w:t>Lainnya</w:t>
+            </w:r>
+            <w:proofErr w:type="spellEnd"/>
           </w:p>
         </w:tc>
       </w:tr>
@@ -2276,17 +3094,40 @@
                 <w:rFonts w:ascii="Times New Roman" w:hAnsi="Times New Roman" w:cs="Times New Roman"/>
                 <w:lang w:val="en-ID"/>
               </w:rPr>
-              <w:t xml:space="preserve">Dasar Hitung dan Basis Data Realisasi </w:t>
-            </w:r>
-            <w:proofErr w:type="gramStart"/>
-            <w:r>
-              <w:rPr>
-                <w:rFonts w:ascii="Times New Roman" w:hAnsi="Times New Roman" w:cs="Times New Roman"/>
-                <w:lang w:val="en-ID"/>
-              </w:rPr>
-              <w:t>IKU :</w:t>
-            </w:r>
-            <w:proofErr w:type="gramEnd"/>
+              <w:t xml:space="preserve">Dasar </w:t>
+            </w:r>
+            <w:proofErr w:type="spellStart"/>
+            <w:r>
+              <w:rPr>
+                <w:rFonts w:ascii="Times New Roman" w:hAnsi="Times New Roman" w:cs="Times New Roman"/>
+                <w:lang w:val="en-ID"/>
+              </w:rPr>
+              <w:t>Hitung</w:t>
+            </w:r>
+            <w:proofErr w:type="spellEnd"/>
+            <w:r>
+              <w:rPr>
+                <w:rFonts w:ascii="Times New Roman" w:hAnsi="Times New Roman" w:cs="Times New Roman"/>
+                <w:lang w:val="en-ID"/>
+              </w:rPr>
+              <w:t xml:space="preserve"> dan Basis Data </w:t>
+            </w:r>
+            <w:proofErr w:type="spellStart"/>
+            <w:r>
+              <w:rPr>
+                <w:rFonts w:ascii="Times New Roman" w:hAnsi="Times New Roman" w:cs="Times New Roman"/>
+                <w:lang w:val="en-ID"/>
+              </w:rPr>
+              <w:t>Realisasi</w:t>
+            </w:r>
+            <w:proofErr w:type="spellEnd"/>
+            <w:r>
+              <w:rPr>
+                <w:rFonts w:ascii="Times New Roman" w:hAnsi="Times New Roman" w:cs="Times New Roman"/>
+                <w:lang w:val="en-ID"/>
+              </w:rPr>
+              <w:t xml:space="preserve"> IKU :</w:t>
+            </w:r>
           </w:p>
           <w:p>
             <w:pPr>
@@ -2307,8 +3148,17 @@
                 <w:rFonts w:ascii="Times New Roman" w:hAnsi="Times New Roman" w:cs="Times New Roman"/>
                 <w:lang w:val="en-ID"/>
               </w:rPr>
-              <w:t>Dasar Hitung</w:t>
-            </w:r>
+              <w:t xml:space="preserve">Dasar </w:t>
+            </w:r>
+            <w:proofErr w:type="spellStart"/>
+            <w:r>
+              <w:rPr>
+                <w:rFonts w:ascii="Times New Roman" w:hAnsi="Times New Roman" w:cs="Times New Roman"/>
+                <w:lang w:val="en-ID"/>
+              </w:rPr>
+              <w:t>Hitung</w:t>
+            </w:r>
+            <w:proofErr w:type="spellEnd"/>
           </w:p>
           <w:p>
             <w:pPr>
@@ -2326,7 +3176,23 @@
                 <w:rFonts w:ascii="Times New Roman" w:hAnsi="Times New Roman" w:cs="Times New Roman"/>
                 <w:lang w:val="en-ID"/>
               </w:rPr>
-              <w:t>${dasar_hitung}</w:t>
+              <w:t>${</w:t>
+            </w:r>
+            <w:proofErr w:type="spellStart"/>
+            <w:r>
+              <w:rPr>
+                <w:rFonts w:ascii="Times New Roman" w:hAnsi="Times New Roman" w:cs="Times New Roman"/>
+                <w:lang w:val="en-ID"/>
+              </w:rPr>
+              <w:t>dasar_hitung</w:t>
+            </w:r>
+            <w:proofErr w:type="spellEnd"/>
+            <w:r>
+              <w:rPr>
+                <w:rFonts w:ascii="Times New Roman" w:hAnsi="Times New Roman" w:cs="Times New Roman"/>
+                <w:lang w:val="en-ID"/>
+              </w:rPr>
+              <w:t>}</w:t>
             </w:r>
           </w:p>
           <w:p>
@@ -2367,7 +3233,23 @@
                 <w:rFonts w:ascii="Times New Roman" w:hAnsi="Times New Roman" w:cs="Times New Roman"/>
                 <w:lang w:val="en-ID"/>
               </w:rPr>
-              <w:t>${basis_data_baseline}</w:t>
+              <w:t>${</w:t>
+            </w:r>
+            <w:proofErr w:type="spellStart"/>
+            <w:r>
+              <w:rPr>
+                <w:rFonts w:ascii="Times New Roman" w:hAnsi="Times New Roman" w:cs="Times New Roman"/>
+                <w:lang w:val="en-ID"/>
+              </w:rPr>
+              <w:t>basis_data_baseline</w:t>
+            </w:r>
+            <w:proofErr w:type="spellEnd"/>
+            <w:r>
+              <w:rPr>
+                <w:rFonts w:ascii="Times New Roman" w:hAnsi="Times New Roman" w:cs="Times New Roman"/>
+                <w:lang w:val="en-ID"/>
+              </w:rPr>
+              <w:t>}</w:t>
             </w:r>
           </w:p>
           <w:p>
@@ -2386,83 +3268,83 @@
               <w:jc w:val="both"/>
               <w:rPr>
                 <w:rFonts w:ascii="Times New Roman" w:hAnsi="Times New Roman" w:cs="Times New Roman"/>
-              </w:rPr>
-            </w:pPr>
-            <w:r>
-              <w:rPr>
-                <w:rFonts w:ascii="Times New Roman" w:hAnsi="Times New Roman" w:cs="Times New Roman"/>
+                <w:lang w:val="fi-FI"/>
+              </w:rPr>
+            </w:pPr>
+            <w:r>
+              <w:rPr>
+                <w:rFonts w:ascii="Times New Roman" w:hAnsi="Times New Roman" w:cs="Times New Roman"/>
+                <w:lang w:val="fi-FI"/>
               </w:rPr>
               <w:t xml:space="preserve">Target dan realisasi publikasi </w:t>
             </w:r>
             <w:r>
               <w:rPr>
                 <w:rFonts w:ascii="Times New Roman" w:hAnsi="Times New Roman" w:cs="Times New Roman"/>
+                <w:lang w:val="fi-FI"/>
               </w:rPr>
               <w:t>${indikator_kinerja_tanpa_satuan}</w:t>
             </w:r>
             <w:r>
               <w:rPr>
                 <w:rFonts w:ascii="Times New Roman" w:hAnsi="Times New Roman" w:cs="Times New Roman"/>
-              </w:rPr>
-              <w:t xml:space="preserve"> (n=</w:t>
-            </w:r>
-            <w:r>
-              <w:rPr>
-                <w:rFonts w:ascii="Times New Roman" w:hAnsi="Times New Roman" w:cs="Times New Roman"/>
-              </w:rPr>
-              <w:t>$</w:t>
-            </w:r>
-            <w:r>
-              <w:rPr>
-                <w:rFonts w:ascii="Times New Roman" w:hAnsi="Times New Roman" w:cs="Times New Roman"/>
+                <w:lang w:val="fi-FI"/>
+              </w:rPr>
+              <w:t xml:space="preserve"> (n=$</w:t>
+            </w:r>
+            <w:r>
+              <w:rPr>
+                <w:rFonts w:ascii="Times New Roman" w:hAnsi="Times New Roman" w:cs="Times New Roman"/>
+                <w:lang w:val="fi-FI"/>
               </w:rPr>
               <w:t>{</w:t>
             </w:r>
             <w:r>
               <w:rPr>
                 <w:rFonts w:ascii="Times New Roman" w:hAnsi="Times New Roman" w:cs="Times New Roman"/>
+                <w:lang w:val="fi-FI"/>
               </w:rPr>
               <w:t>x</w:t>
             </w:r>
             <w:r>
               <w:rPr>
                 <w:rFonts w:ascii="Times New Roman" w:hAnsi="Times New Roman" w:cs="Times New Roman"/>
+                <w:lang w:val="fi-FI"/>
               </w:rPr>
               <w:t>}</w:t>
             </w:r>
             <w:r>
               <w:rPr>
                 <w:rFonts w:ascii="Times New Roman" w:hAnsi="Times New Roman" w:cs="Times New Roman"/>
-              </w:rPr>
-              <w:t>dan N=</w:t>
-            </w:r>
-            <w:r>
-              <w:rPr>
-                <w:rFonts w:ascii="Times New Roman" w:hAnsi="Times New Roman" w:cs="Times New Roman"/>
-              </w:rPr>
-              <w:t>$</w:t>
-            </w:r>
-            <w:r>
-              <w:rPr>
-                <w:rFonts w:ascii="Times New Roman" w:hAnsi="Times New Roman" w:cs="Times New Roman"/>
+                <w:lang w:val="fi-FI"/>
+              </w:rPr>
+              <w:t>dan N=$</w:t>
+            </w:r>
+            <w:r>
+              <w:rPr>
+                <w:rFonts w:ascii="Times New Roman" w:hAnsi="Times New Roman" w:cs="Times New Roman"/>
+                <w:lang w:val="fi-FI"/>
               </w:rPr>
               <w:t>{</w:t>
             </w:r>
             <w:r>
               <w:rPr>
                 <w:rFonts w:ascii="Times New Roman" w:hAnsi="Times New Roman" w:cs="Times New Roman"/>
+                <w:lang w:val="fi-FI"/>
               </w:rPr>
               <w:t>y</w:t>
             </w:r>
             <w:r>
               <w:rPr>
                 <w:rFonts w:ascii="Times New Roman" w:hAnsi="Times New Roman" w:cs="Times New Roman"/>
+                <w:lang w:val="fi-FI"/>
               </w:rPr>
               <w:t>}</w:t>
             </w:r>
             <w:r>
               <w:rPr>
                 <w:rFonts w:ascii="Times New Roman" w:hAnsi="Times New Roman" w:cs="Times New Roman"/>
+                <w:lang w:val="fi-FI"/>
               </w:rPr>
               <w:t>), yaitu:</w:t>
             </w:r>
@@ -2495,6 +3377,7 @@
               </w:rPr>
               <w:t>{</w:t>
             </w:r>
+            <w:proofErr w:type="spellStart"/>
             <w:r>
               <w:rPr>
                 <w:rFonts w:ascii="Times New Roman" w:hAnsi="Times New Roman" w:cs="Times New Roman"/>
@@ -2507,7 +3390,15 @@
                 <w:rFonts w:ascii="Times New Roman" w:hAnsi="Times New Roman" w:cs="Times New Roman"/>
                 <w:lang w:val="en-ID"/>
               </w:rPr>
-              <w:t>_master_nama_output}</w:t>
+              <w:t>_master_nama_output</w:t>
+            </w:r>
+            <w:proofErr w:type="spellEnd"/>
+            <w:r>
+              <w:rPr>
+                <w:rFonts w:ascii="Times New Roman" w:hAnsi="Times New Roman" w:cs="Times New Roman"/>
+                <w:lang w:val="en-ID"/>
+              </w:rPr>
+              <w:t>}</w:t>
             </w:r>
           </w:p>
           <w:p>
@@ -2528,24 +3419,104 @@
                 <w:rFonts w:ascii="Times New Roman" w:hAnsi="Times New Roman" w:cs="Times New Roman"/>
               </w:rPr>
             </w:pPr>
-            <w:r>
-              <w:rPr>
-                <w:rFonts w:ascii="Times New Roman" w:hAnsi="Times New Roman" w:cs="Times New Roman"/>
-              </w:rPr>
-              <w:t xml:space="preserve">Untuk Tahun </w:t>
+            <w:proofErr w:type="spellStart"/>
+            <w:r>
+              <w:rPr>
+                <w:rFonts w:ascii="Times New Roman" w:hAnsi="Times New Roman" w:cs="Times New Roman"/>
+              </w:rPr>
+              <w:t>Untuk</w:t>
+            </w:r>
+            <w:proofErr w:type="spellEnd"/>
+            <w:r>
+              <w:rPr>
+                <w:rFonts w:ascii="Times New Roman" w:hAnsi="Times New Roman" w:cs="Times New Roman"/>
+              </w:rPr>
+              <w:t xml:space="preserve"> </w:t>
+            </w:r>
+            <w:proofErr w:type="spellStart"/>
+            <w:r>
+              <w:rPr>
+                <w:rFonts w:ascii="Times New Roman" w:hAnsi="Times New Roman" w:cs="Times New Roman"/>
+              </w:rPr>
+              <w:t>Tahun</w:t>
+            </w:r>
+            <w:proofErr w:type="spellEnd"/>
+            <w:r>
+              <w:rPr>
+                <w:rFonts w:ascii="Times New Roman" w:hAnsi="Times New Roman" w:cs="Times New Roman"/>
+              </w:rPr>
+              <w:t xml:space="preserve"> </w:t>
             </w:r>
             <w:r>
               <w:rPr>
                 <w:rFonts w:ascii="Arial" w:hAnsi="Arial" w:cs="Arial"/>
                 <w:color w:val="000000"/>
               </w:rPr>
-              <w:t>${tahun}</w:t>
-            </w:r>
-            <w:r>
-              <w:rPr>
-                <w:rFonts w:ascii="Times New Roman" w:hAnsi="Times New Roman" w:cs="Times New Roman"/>
-              </w:rPr>
-              <w:t xml:space="preserve">, dengan adanya target sebanyak </w:t>
+              <w:t>${</w:t>
+            </w:r>
+            <w:proofErr w:type="spellStart"/>
+            <w:r>
+              <w:rPr>
+                <w:rFonts w:ascii="Arial" w:hAnsi="Arial" w:cs="Arial"/>
+                <w:color w:val="000000"/>
+              </w:rPr>
+              <w:t>tahun</w:t>
+            </w:r>
+            <w:proofErr w:type="spellEnd"/>
+            <w:r>
+              <w:rPr>
+                <w:rFonts w:ascii="Arial" w:hAnsi="Arial" w:cs="Arial"/>
+                <w:color w:val="000000"/>
+              </w:rPr>
+              <w:t>}</w:t>
+            </w:r>
+            <w:r>
+              <w:rPr>
+                <w:rFonts w:ascii="Times New Roman" w:hAnsi="Times New Roman" w:cs="Times New Roman"/>
+              </w:rPr>
+              <w:t xml:space="preserve">, </w:t>
+            </w:r>
+            <w:proofErr w:type="spellStart"/>
+            <w:r>
+              <w:rPr>
+                <w:rFonts w:ascii="Times New Roman" w:hAnsi="Times New Roman" w:cs="Times New Roman"/>
+              </w:rPr>
+              <w:t>dengan</w:t>
+            </w:r>
+            <w:proofErr w:type="spellEnd"/>
+            <w:r>
+              <w:rPr>
+                <w:rFonts w:ascii="Times New Roman" w:hAnsi="Times New Roman" w:cs="Times New Roman"/>
+              </w:rPr>
+              <w:t xml:space="preserve"> </w:t>
+            </w:r>
+            <w:proofErr w:type="spellStart"/>
+            <w:r>
+              <w:rPr>
+                <w:rFonts w:ascii="Times New Roman" w:hAnsi="Times New Roman" w:cs="Times New Roman"/>
+              </w:rPr>
+              <w:t>adanya</w:t>
+            </w:r>
+            <w:proofErr w:type="spellEnd"/>
+            <w:r>
+              <w:rPr>
+                <w:rFonts w:ascii="Times New Roman" w:hAnsi="Times New Roman" w:cs="Times New Roman"/>
+              </w:rPr>
+              <w:t xml:space="preserve"> target </w:t>
+            </w:r>
+            <w:proofErr w:type="spellStart"/>
+            <w:r>
+              <w:rPr>
+                <w:rFonts w:ascii="Times New Roman" w:hAnsi="Times New Roman" w:cs="Times New Roman"/>
+              </w:rPr>
+              <w:t>sebanyak</w:t>
+            </w:r>
+            <w:proofErr w:type="spellEnd"/>
+            <w:r>
+              <w:rPr>
+                <w:rFonts w:ascii="Times New Roman" w:hAnsi="Times New Roman" w:cs="Times New Roman"/>
+              </w:rPr>
+              <w:t xml:space="preserve"> </w:t>
             </w:r>
             <w:r>
               <w:rPr>
@@ -2577,18 +3548,136 @@
               </w:rPr>
               <w:t xml:space="preserve"> </w:t>
             </w:r>
+            <w:proofErr w:type="spellStart"/>
             <w:r>
               <w:rPr>
                 <w:rFonts w:ascii="Times New Roman" w:hAnsi="Times New Roman" w:cs="Times New Roman"/>
                 <w:color w:val="FF0000"/>
               </w:rPr>
-              <w:t>publikasi/laporan yang berkualitas</w:t>
-            </w:r>
-            <w:r>
-              <w:rPr>
-                <w:rFonts w:ascii="Times New Roman" w:hAnsi="Times New Roman" w:cs="Times New Roman"/>
-              </w:rPr>
-              <w:t>, maka disusun target per triwulan adalah sebagai berikut:</w:t>
+              <w:t>publikasi</w:t>
+            </w:r>
+            <w:proofErr w:type="spellEnd"/>
+            <w:r>
+              <w:rPr>
+                <w:rFonts w:ascii="Times New Roman" w:hAnsi="Times New Roman" w:cs="Times New Roman"/>
+                <w:color w:val="FF0000"/>
+              </w:rPr>
+              <w:t>/</w:t>
+            </w:r>
+            <w:proofErr w:type="spellStart"/>
+            <w:r>
+              <w:rPr>
+                <w:rFonts w:ascii="Times New Roman" w:hAnsi="Times New Roman" w:cs="Times New Roman"/>
+                <w:color w:val="FF0000"/>
+              </w:rPr>
+              <w:t>laporan</w:t>
+            </w:r>
+            <w:proofErr w:type="spellEnd"/>
+            <w:r>
+              <w:rPr>
+                <w:rFonts w:ascii="Times New Roman" w:hAnsi="Times New Roman" w:cs="Times New Roman"/>
+                <w:color w:val="FF0000"/>
+              </w:rPr>
+              <w:t xml:space="preserve"> yang </w:t>
+            </w:r>
+            <w:proofErr w:type="spellStart"/>
+            <w:r>
+              <w:rPr>
+                <w:rFonts w:ascii="Times New Roman" w:hAnsi="Times New Roman" w:cs="Times New Roman"/>
+                <w:color w:val="FF0000"/>
+              </w:rPr>
+              <w:t>berkualitas</w:t>
+            </w:r>
+            <w:proofErr w:type="spellEnd"/>
+            <w:r>
+              <w:rPr>
+                <w:rFonts w:ascii="Times New Roman" w:hAnsi="Times New Roman" w:cs="Times New Roman"/>
+              </w:rPr>
+              <w:t xml:space="preserve">, </w:t>
+            </w:r>
+            <w:proofErr w:type="spellStart"/>
+            <w:r>
+              <w:rPr>
+                <w:rFonts w:ascii="Times New Roman" w:hAnsi="Times New Roman" w:cs="Times New Roman"/>
+              </w:rPr>
+              <w:t>maka</w:t>
+            </w:r>
+            <w:proofErr w:type="spellEnd"/>
+            <w:r>
+              <w:rPr>
+                <w:rFonts w:ascii="Times New Roman" w:hAnsi="Times New Roman" w:cs="Times New Roman"/>
+              </w:rPr>
+              <w:t xml:space="preserve"> </w:t>
+            </w:r>
+            <w:proofErr w:type="spellStart"/>
+            <w:r>
+              <w:rPr>
+                <w:rFonts w:ascii="Times New Roman" w:hAnsi="Times New Roman" w:cs="Times New Roman"/>
+              </w:rPr>
+              <w:t>disusun</w:t>
+            </w:r>
+            <w:proofErr w:type="spellEnd"/>
+            <w:r>
+              <w:rPr>
+                <w:rFonts w:ascii="Times New Roman" w:hAnsi="Times New Roman" w:cs="Times New Roman"/>
+              </w:rPr>
+              <w:t xml:space="preserve"> target per </w:t>
+            </w:r>
+            <w:proofErr w:type="spellStart"/>
+            <w:r>
+              <w:rPr>
+                <w:rFonts w:ascii="Times New Roman" w:hAnsi="Times New Roman" w:cs="Times New Roman"/>
+              </w:rPr>
+              <w:t>triwulan</w:t>
+            </w:r>
+            <w:proofErr w:type="spellEnd"/>
+            <w:r>
+              <w:rPr>
+                <w:rFonts w:ascii="Times New Roman" w:hAnsi="Times New Roman" w:cs="Times New Roman"/>
+              </w:rPr>
+              <w:t xml:space="preserve"> </w:t>
+            </w:r>
+            <w:proofErr w:type="spellStart"/>
+            <w:r>
+              <w:rPr>
+                <w:rFonts w:ascii="Times New Roman" w:hAnsi="Times New Roman" w:cs="Times New Roman"/>
+              </w:rPr>
+              <w:t>adalah</w:t>
+            </w:r>
+            <w:proofErr w:type="spellEnd"/>
+            <w:r>
+              <w:rPr>
+                <w:rFonts w:ascii="Times New Roman" w:hAnsi="Times New Roman" w:cs="Times New Roman"/>
+              </w:rPr>
+              <w:t xml:space="preserve"> </w:t>
+            </w:r>
+            <w:proofErr w:type="spellStart"/>
+            <w:r>
+              <w:rPr>
+                <w:rFonts w:ascii="Times New Roman" w:hAnsi="Times New Roman" w:cs="Times New Roman"/>
+              </w:rPr>
+              <w:t>sebagai</w:t>
+            </w:r>
+            <w:proofErr w:type="spellEnd"/>
+            <w:r>
+              <w:rPr>
+                <w:rFonts w:ascii="Times New Roman" w:hAnsi="Times New Roman" w:cs="Times New Roman"/>
+              </w:rPr>
+              <w:t xml:space="preserve"> </w:t>
+            </w:r>
+            <w:proofErr w:type="spellStart"/>
+            <w:r>
+              <w:rPr>
+                <w:rFonts w:ascii="Times New Roman" w:hAnsi="Times New Roman" w:cs="Times New Roman"/>
+              </w:rPr>
+              <w:t>berikut</w:t>
+            </w:r>
+            <w:proofErr w:type="spellEnd"/>
+            <w:r>
+              <w:rPr>
+                <w:rFonts w:ascii="Times New Roman" w:hAnsi="Times New Roman" w:cs="Times New Roman"/>
+              </w:rPr>
+              <w:t>:</w:t>
             </w:r>
           </w:p>
           <w:tbl>
@@ -2618,12 +3707,46 @@
                       <w:lang w:val="en-ID"/>
                     </w:rPr>
                   </w:pPr>
+                  <w:proofErr w:type="spellStart"/>
                   <w:r>
                     <w:rPr>
                       <w:rFonts w:ascii="Times New Roman" w:hAnsi="Times New Roman" w:cs="Times New Roman"/>
                       <w:lang w:val="en-ID"/>
                     </w:rPr>
                     <w:t>Keterangan</w:t>
+                  </w:r>
+                  <w:proofErr w:type="spellEnd"/>
+                </w:p>
+              </w:tc>
+              <w:tc>
+                <w:tcPr>
+                  <w:tcW w:w="1602" w:type="dxa"/>
+                  <w:vAlign w:val="center"/>
+                </w:tcPr>
+                <w:p>
+                  <w:pPr>
+                    <w:spacing w:line="276" w:lineRule="auto"/>
+                    <w:jc w:val="center"/>
+                    <w:rPr>
+                      <w:rFonts w:ascii="Times New Roman" w:hAnsi="Times New Roman" w:cs="Times New Roman"/>
+                      <w:lang w:val="en-ID"/>
+                    </w:rPr>
+                  </w:pPr>
+                  <w:proofErr w:type="spellStart"/>
+                  <w:r>
+                    <w:rPr>
+                      <w:rFonts w:ascii="Times New Roman" w:hAnsi="Times New Roman" w:cs="Times New Roman"/>
+                      <w:lang w:val="en-ID"/>
+                    </w:rPr>
+                    <w:t>Triwulan</w:t>
+                  </w:r>
+                  <w:proofErr w:type="spellEnd"/>
+                  <w:r>
+                    <w:rPr>
+                      <w:rFonts w:ascii="Times New Roman" w:hAnsi="Times New Roman" w:cs="Times New Roman"/>
+                      <w:lang w:val="en-ID"/>
+                    </w:rPr>
+                    <w:t xml:space="preserve"> I</w:t>
                   </w:r>
                 </w:p>
               </w:tc>
@@ -2641,12 +3764,21 @@
                       <w:lang w:val="en-ID"/>
                     </w:rPr>
                   </w:pPr>
+                  <w:proofErr w:type="spellStart"/>
                   <w:r>
                     <w:rPr>
                       <w:rFonts w:ascii="Times New Roman" w:hAnsi="Times New Roman" w:cs="Times New Roman"/>
                       <w:lang w:val="en-ID"/>
                     </w:rPr>
-                    <w:t>Triwulan I</w:t>
+                    <w:t>Triwulan</w:t>
+                  </w:r>
+                  <w:proofErr w:type="spellEnd"/>
+                  <w:r>
+                    <w:rPr>
+                      <w:rFonts w:ascii="Times New Roman" w:hAnsi="Times New Roman" w:cs="Times New Roman"/>
+                      <w:lang w:val="en-ID"/>
+                    </w:rPr>
+                    <w:t xml:space="preserve"> II</w:t>
                   </w:r>
                 </w:p>
               </w:tc>
@@ -2664,35 +3796,21 @@
                       <w:lang w:val="en-ID"/>
                     </w:rPr>
                   </w:pPr>
+                  <w:proofErr w:type="spellStart"/>
                   <w:r>
                     <w:rPr>
                       <w:rFonts w:ascii="Times New Roman" w:hAnsi="Times New Roman" w:cs="Times New Roman"/>
                       <w:lang w:val="en-ID"/>
                     </w:rPr>
-                    <w:t>Triwulan II</w:t>
+                    <w:t>Triwulan</w:t>
                   </w:r>
-                </w:p>
-              </w:tc>
-              <w:tc>
-                <w:tcPr>
-                  <w:tcW w:w="1602" w:type="dxa"/>
-                  <w:vAlign w:val="center"/>
-                </w:tcPr>
-                <w:p>
-                  <w:pPr>
-                    <w:spacing w:line="276" w:lineRule="auto"/>
-                    <w:jc w:val="center"/>
-                    <w:rPr>
-                      <w:rFonts w:ascii="Times New Roman" w:hAnsi="Times New Roman" w:cs="Times New Roman"/>
-                      <w:lang w:val="en-ID"/>
-                    </w:rPr>
-                  </w:pPr>
+                  <w:proofErr w:type="spellEnd"/>
                   <w:r>
                     <w:rPr>
                       <w:rFonts w:ascii="Times New Roman" w:hAnsi="Times New Roman" w:cs="Times New Roman"/>
                       <w:lang w:val="en-ID"/>
                     </w:rPr>
-                    <w:t>Triwulan III</w:t>
+                    <w:t xml:space="preserve"> III</w:t>
                   </w:r>
                 </w:p>
               </w:tc>
@@ -2710,12 +3828,21 @@
                       <w:lang w:val="en-ID"/>
                     </w:rPr>
                   </w:pPr>
+                  <w:proofErr w:type="spellStart"/>
                   <w:r>
                     <w:rPr>
                       <w:rFonts w:ascii="Times New Roman" w:hAnsi="Times New Roman" w:cs="Times New Roman"/>
                       <w:lang w:val="en-ID"/>
                     </w:rPr>
-                    <w:t>Triwulan IV</w:t>
+                    <w:t>Triwulan</w:t>
+                  </w:r>
+                  <w:proofErr w:type="spellEnd"/>
+                  <w:r>
+                    <w:rPr>
+                      <w:rFonts w:ascii="Times New Roman" w:hAnsi="Times New Roman" w:cs="Times New Roman"/>
+                      <w:lang w:val="en-ID"/>
+                    </w:rPr>
+                    <w:t xml:space="preserve"> IV</w:t>
                   </w:r>
                 </w:p>
               </w:tc>
@@ -2746,7 +3873,23 @@
                       <w:rFonts w:ascii="Times New Roman" w:hAnsi="Times New Roman" w:cs="Times New Roman"/>
                       <w:lang w:val="en-ID"/>
                     </w:rPr>
-                    <w:t>{definisi_x}</w:t>
+                    <w:t>{</w:t>
+                  </w:r>
+                  <w:proofErr w:type="spellStart"/>
+                  <w:r>
+                    <w:rPr>
+                      <w:rFonts w:ascii="Times New Roman" w:hAnsi="Times New Roman" w:cs="Times New Roman"/>
+                      <w:lang w:val="en-ID"/>
+                    </w:rPr>
+                    <w:t>definisi_x</w:t>
+                  </w:r>
+                  <w:proofErr w:type="spellEnd"/>
+                  <w:r>
+                    <w:rPr>
+                      <w:rFonts w:ascii="Times New Roman" w:hAnsi="Times New Roman" w:cs="Times New Roman"/>
+                      <w:lang w:val="en-ID"/>
+                    </w:rPr>
+                    <w:t>}</w:t>
                   </w:r>
                 </w:p>
               </w:tc>
@@ -2792,21 +3935,7 @@
                       <w:rFonts w:ascii="Times New Roman" w:hAnsi="Times New Roman" w:cs="Times New Roman"/>
                       <w:lang w:val="en-ID"/>
                     </w:rPr>
-                    <w:t>${target_x_tw</w:t>
-                  </w:r>
-                  <w:r>
-                    <w:rPr>
-                      <w:rFonts w:ascii="Times New Roman" w:hAnsi="Times New Roman" w:cs="Times New Roman"/>
-                      <w:lang w:val="en-ID"/>
-                    </w:rPr>
-                    <w:t>2</w:t>
-                  </w:r>
-                  <w:r>
-                    <w:rPr>
-                      <w:rFonts w:ascii="Times New Roman" w:hAnsi="Times New Roman" w:cs="Times New Roman"/>
-                      <w:lang w:val="en-ID"/>
-                    </w:rPr>
-                    <w:t>}</w:t>
+                    <w:t>${target_x_tw2}</w:t>
                   </w:r>
                 </w:p>
               </w:tc>
@@ -2829,21 +3958,7 @@
                       <w:rFonts w:ascii="Times New Roman" w:hAnsi="Times New Roman" w:cs="Times New Roman"/>
                       <w:lang w:val="en-ID"/>
                     </w:rPr>
-                    <w:t>${target_x_tw</w:t>
-                  </w:r>
-                  <w:r>
-                    <w:rPr>
-                      <w:rFonts w:ascii="Times New Roman" w:hAnsi="Times New Roman" w:cs="Times New Roman"/>
-                      <w:lang w:val="en-ID"/>
-                    </w:rPr>
-                    <w:t>3</w:t>
-                  </w:r>
-                  <w:r>
-                    <w:rPr>
-                      <w:rFonts w:ascii="Times New Roman" w:hAnsi="Times New Roman" w:cs="Times New Roman"/>
-                      <w:lang w:val="en-ID"/>
-                    </w:rPr>
-                    <w:t>}</w:t>
+                    <w:t>${target_x_tw3}</w:t>
                   </w:r>
                 </w:p>
               </w:tc>
@@ -2866,21 +3981,7 @@
                       <w:rFonts w:ascii="Times New Roman" w:hAnsi="Times New Roman" w:cs="Times New Roman"/>
                       <w:lang w:val="en-ID"/>
                     </w:rPr>
-                    <w:t>${target_x_tw</w:t>
-                  </w:r>
-                  <w:r>
-                    <w:rPr>
-                      <w:rFonts w:ascii="Times New Roman" w:hAnsi="Times New Roman" w:cs="Times New Roman"/>
-                      <w:lang w:val="en-ID"/>
-                    </w:rPr>
-                    <w:t>4</w:t>
-                  </w:r>
-                  <w:r>
-                    <w:rPr>
-                      <w:rFonts w:ascii="Times New Roman" w:hAnsi="Times New Roman" w:cs="Times New Roman"/>
-                      <w:lang w:val="en-ID"/>
-                    </w:rPr>
-                    <w:t>}</w:t>
+                    <w:t>${target_x_tw4}</w:t>
                   </w:r>
                 </w:p>
               </w:tc>
@@ -2911,89 +4012,17 @@
                       <w:rFonts w:ascii="Times New Roman" w:hAnsi="Times New Roman" w:cs="Times New Roman"/>
                       <w:lang w:val="en-ID"/>
                     </w:rPr>
-                    <w:t>{definisi_y}</w:t>
+                    <w:t>{</w:t>
                   </w:r>
-                </w:p>
-              </w:tc>
-              <w:tc>
-                <w:tcPr>
-                  <w:tcW w:w="1602" w:type="dxa"/>
-                  <w:vAlign w:val="center"/>
-                </w:tcPr>
-                <w:p>
-                  <w:pPr>
-                    <w:spacing w:line="276" w:lineRule="auto"/>
-                    <w:jc w:val="center"/>
-                    <w:rPr>
-                      <w:rFonts w:ascii="Times New Roman" w:hAnsi="Times New Roman" w:cs="Times New Roman"/>
-                      <w:lang w:val="en-ID"/>
-                    </w:rPr>
-                  </w:pPr>
+                  <w:proofErr w:type="spellStart"/>
                   <w:r>
                     <w:rPr>
                       <w:rFonts w:ascii="Times New Roman" w:hAnsi="Times New Roman" w:cs="Times New Roman"/>
                       <w:lang w:val="en-ID"/>
                     </w:rPr>
-                    <w:t>${target_</w:t>
+                    <w:t>definisi_y</w:t>
                   </w:r>
-                  <w:r>
-                    <w:rPr>
-                      <w:rFonts w:ascii="Times New Roman" w:hAnsi="Times New Roman" w:cs="Times New Roman"/>
-                      <w:lang w:val="en-ID"/>
-                    </w:rPr>
-                    <w:t>y</w:t>
-                  </w:r>
-                  <w:r>
-                    <w:rPr>
-                      <w:rFonts w:ascii="Times New Roman" w:hAnsi="Times New Roman" w:cs="Times New Roman"/>
-                      <w:lang w:val="en-ID"/>
-                    </w:rPr>
-                    <w:t>_tw1}</w:t>
-                  </w:r>
-                </w:p>
-              </w:tc>
-              <w:tc>
-                <w:tcPr>
-                  <w:tcW w:w="1602" w:type="dxa"/>
-                  <w:vAlign w:val="center"/>
-                </w:tcPr>
-                <w:p>
-                  <w:pPr>
-                    <w:spacing w:line="276" w:lineRule="auto"/>
-                    <w:jc w:val="center"/>
-                    <w:rPr>
-                      <w:rFonts w:ascii="Times New Roman" w:hAnsi="Times New Roman" w:cs="Times New Roman"/>
-                      <w:lang w:val="en-ID"/>
-                    </w:rPr>
-                  </w:pPr>
-                  <w:r>
-                    <w:rPr>
-                      <w:rFonts w:ascii="Times New Roman" w:hAnsi="Times New Roman" w:cs="Times New Roman"/>
-                      <w:lang w:val="en-ID"/>
-                    </w:rPr>
-                    <w:t>${target_</w:t>
-                  </w:r>
-                  <w:r>
-                    <w:rPr>
-                      <w:rFonts w:ascii="Times New Roman" w:hAnsi="Times New Roman" w:cs="Times New Roman"/>
-                      <w:lang w:val="en-ID"/>
-                    </w:rPr>
-                    <w:t>y</w:t>
-                  </w:r>
-                  <w:r>
-                    <w:rPr>
-                      <w:rFonts w:ascii="Times New Roman" w:hAnsi="Times New Roman" w:cs="Times New Roman"/>
-                      <w:lang w:val="en-ID"/>
-                    </w:rPr>
-                    <w:t>_tw</w:t>
-                  </w:r>
-                  <w:r>
-                    <w:rPr>
-                      <w:rFonts w:ascii="Times New Roman" w:hAnsi="Times New Roman" w:cs="Times New Roman"/>
-                      <w:lang w:val="en-ID"/>
-                    </w:rPr>
-                    <w:t>2</w:t>
-                  </w:r>
+                  <w:proofErr w:type="spellEnd"/>
                   <w:r>
                     <w:rPr>
                       <w:rFonts w:ascii="Times New Roman" w:hAnsi="Times New Roman" w:cs="Times New Roman"/>
@@ -3022,35 +4051,53 @@
                       <w:rFonts w:ascii="Times New Roman" w:hAnsi="Times New Roman" w:cs="Times New Roman"/>
                       <w:lang w:val="en-ID"/>
                     </w:rPr>
-                    <w:t>${target_</w:t>
+                    <w:t>${target_y_tw1}</w:t>
                   </w:r>
+                </w:p>
+              </w:tc>
+              <w:tc>
+                <w:tcPr>
+                  <w:tcW w:w="1602" w:type="dxa"/>
+                  <w:vAlign w:val="center"/>
+                </w:tcPr>
+                <w:p>
+                  <w:pPr>
+                    <w:spacing w:line="276" w:lineRule="auto"/>
+                    <w:jc w:val="center"/>
+                    <w:rPr>
+                      <w:rFonts w:ascii="Times New Roman" w:hAnsi="Times New Roman" w:cs="Times New Roman"/>
+                      <w:lang w:val="en-ID"/>
+                    </w:rPr>
+                  </w:pPr>
                   <w:r>
                     <w:rPr>
                       <w:rFonts w:ascii="Times New Roman" w:hAnsi="Times New Roman" w:cs="Times New Roman"/>
                       <w:lang w:val="en-ID"/>
                     </w:rPr>
-                    <w:t>y</w:t>
+                    <w:t>${target_y_tw2}</w:t>
                   </w:r>
+                </w:p>
+              </w:tc>
+              <w:tc>
+                <w:tcPr>
+                  <w:tcW w:w="1602" w:type="dxa"/>
+                  <w:vAlign w:val="center"/>
+                </w:tcPr>
+                <w:p>
+                  <w:pPr>
+                    <w:spacing w:line="276" w:lineRule="auto"/>
+                    <w:jc w:val="center"/>
+                    <w:rPr>
+                      <w:rFonts w:ascii="Times New Roman" w:hAnsi="Times New Roman" w:cs="Times New Roman"/>
+                      <w:lang w:val="en-ID"/>
+                    </w:rPr>
+                  </w:pPr>
                   <w:r>
                     <w:rPr>
                       <w:rFonts w:ascii="Times New Roman" w:hAnsi="Times New Roman" w:cs="Times New Roman"/>
                       <w:lang w:val="en-ID"/>
                     </w:rPr>
-                    <w:t>_tw</w:t>
-                  </w:r>
-                  <w:r>
-                    <w:rPr>
-                      <w:rFonts w:ascii="Times New Roman" w:hAnsi="Times New Roman" w:cs="Times New Roman"/>
-                      <w:lang w:val="en-ID"/>
-                    </w:rPr>
-                    <w:t>3</w:t>
-                  </w:r>
-                  <w:r>
-                    <w:rPr>
-                      <w:rFonts w:ascii="Times New Roman" w:hAnsi="Times New Roman" w:cs="Times New Roman"/>
-                      <w:lang w:val="en-ID"/>
-                    </w:rPr>
-                    <w:t>}</w:t>
+                    <w:t>${target_y_tw3}</w:t>
                   </w:r>
                 </w:p>
               </w:tc>
@@ -3073,35 +4120,7 @@
                       <w:rFonts w:ascii="Times New Roman" w:hAnsi="Times New Roman" w:cs="Times New Roman"/>
                       <w:lang w:val="en-ID"/>
                     </w:rPr>
-                    <w:t>${target_</w:t>
-                  </w:r>
-                  <w:r>
-                    <w:rPr>
-                      <w:rFonts w:ascii="Times New Roman" w:hAnsi="Times New Roman" w:cs="Times New Roman"/>
-                      <w:lang w:val="en-ID"/>
-                    </w:rPr>
-                    <w:t>y</w:t>
-                  </w:r>
-                  <w:r>
-                    <w:rPr>
-                      <w:rFonts w:ascii="Times New Roman" w:hAnsi="Times New Roman" w:cs="Times New Roman"/>
-                      <w:lang w:val="en-ID"/>
-                    </w:rPr>
-                    <w:t>_tw</w:t>
-                  </w:r>
-                  <w:r>
-                    <w:rPr>
-                      <w:rFonts w:ascii="Times New Roman" w:hAnsi="Times New Roman" w:cs="Times New Roman"/>
-                      <w:lang w:val="en-ID"/>
-                    </w:rPr>
-                    <w:t>4</w:t>
-                  </w:r>
-                  <w:r>
-                    <w:rPr>
-                      <w:rFonts w:ascii="Times New Roman" w:hAnsi="Times New Roman" w:cs="Times New Roman"/>
-                      <w:lang w:val="en-ID"/>
-                    </w:rPr>
-                    <w:t>}</w:t>
+                    <w:t>${target_y_tw4}</w:t>
                   </w:r>
                 </w:p>
               </w:tc>
@@ -3142,14 +4161,30 @@
                 <w:rFonts w:ascii="Times New Roman" w:hAnsi="Times New Roman" w:cs="Times New Roman"/>
                 <w:b/>
                 <w:bCs/>
-                <w:lang w:val="fi-FI"/>
-              </w:rPr>
-              <w:t>${triwulan}</w:t>
-            </w:r>
-            <w:r>
-              <w:rPr>
-                <w:rFonts w:ascii="Times New Roman" w:hAnsi="Times New Roman" w:cs="Times New Roman"/>
-                <w:lang w:val="fi-FI"/>
+              </w:rPr>
+              <w:t>${</w:t>
+            </w:r>
+            <w:proofErr w:type="spellStart"/>
+            <w:r>
+              <w:rPr>
+                <w:rFonts w:ascii="Times New Roman" w:hAnsi="Times New Roman" w:cs="Times New Roman"/>
+                <w:b/>
+                <w:bCs/>
+              </w:rPr>
+              <w:t>triwulan_upper</w:t>
+            </w:r>
+            <w:proofErr w:type="spellEnd"/>
+            <w:r>
+              <w:rPr>
+                <w:rFonts w:ascii="Times New Roman" w:hAnsi="Times New Roman" w:cs="Times New Roman"/>
+                <w:b/>
+                <w:bCs/>
+              </w:rPr>
+              <w:t>}</w:t>
+            </w:r>
+            <w:r>
+              <w:rPr>
+                <w:rFonts w:ascii="Times New Roman" w:hAnsi="Times New Roman" w:cs="Times New Roman"/>
               </w:rPr>
               <w:t xml:space="preserve"> </w:t>
             </w:r>
@@ -3160,7 +4195,27 @@
                 <w:bCs/>
                 <w:color w:val="000000"/>
               </w:rPr>
-              <w:t>${tahun}</w:t>
+              <w:t>${</w:t>
+            </w:r>
+            <w:proofErr w:type="spellStart"/>
+            <w:r>
+              <w:rPr>
+                <w:rFonts w:ascii="Arial" w:hAnsi="Arial" w:cs="Arial"/>
+                <w:b/>
+                <w:bCs/>
+                <w:color w:val="000000"/>
+              </w:rPr>
+              <w:t>tahun</w:t>
+            </w:r>
+            <w:proofErr w:type="spellEnd"/>
+            <w:r>
+              <w:rPr>
+                <w:rFonts w:ascii="Arial" w:hAnsi="Arial" w:cs="Arial"/>
+                <w:b/>
+                <w:bCs/>
+                <w:color w:val="000000"/>
+              </w:rPr>
+              <w:t>}</w:t>
             </w:r>
           </w:p>
           <w:p>
@@ -3184,39 +4239,90 @@
                 <w:lang w:val="en-ID"/>
               </w:rPr>
             </w:pPr>
-            <w:r>
-              <w:rPr>
-                <w:rFonts w:ascii="Times New Roman" w:hAnsi="Times New Roman" w:cs="Times New Roman"/>
-                <w:b/>
-                <w:bCs/>
-                <w:lang w:val="en-ID"/>
-              </w:rPr>
-              <w:t xml:space="preserve">Realisasi </w:t>
-            </w:r>
-            <w:r>
-              <w:rPr>
-                <w:rFonts w:ascii="Times New Roman" w:hAnsi="Times New Roman" w:cs="Times New Roman"/>
-                <w:b/>
-                <w:bCs/>
-                <w:lang w:val="fi-FI"/>
-              </w:rPr>
-              <w:t>${triwulan}</w:t>
-            </w:r>
-            <w:r>
-              <w:rPr>
-                <w:rFonts w:ascii="Times New Roman" w:hAnsi="Times New Roman" w:cs="Times New Roman"/>
-                <w:lang w:val="fi-FI"/>
+            <w:proofErr w:type="spellStart"/>
+            <w:r>
+              <w:rPr>
+                <w:rFonts w:ascii="Times New Roman" w:hAnsi="Times New Roman" w:cs="Times New Roman"/>
+                <w:b/>
+                <w:bCs/>
+                <w:lang w:val="en-ID"/>
+              </w:rPr>
+              <w:t>Realisasi</w:t>
+            </w:r>
+            <w:proofErr w:type="spellEnd"/>
+            <w:r>
+              <w:rPr>
+                <w:rFonts w:ascii="Times New Roman" w:hAnsi="Times New Roman" w:cs="Times New Roman"/>
+                <w:b/>
+                <w:bCs/>
+                <w:lang w:val="en-ID"/>
               </w:rPr>
               <w:t xml:space="preserve"> </w:t>
             </w:r>
             <w:r>
               <w:rPr>
+                <w:rFonts w:ascii="Times New Roman" w:hAnsi="Times New Roman" w:cs="Times New Roman"/>
+                <w:b/>
+                <w:bCs/>
+                <w:lang w:val="en-ID"/>
+              </w:rPr>
+              <w:t>${</w:t>
+            </w:r>
+            <w:proofErr w:type="spellStart"/>
+            <w:r>
+              <w:rPr>
+                <w:rFonts w:ascii="Times New Roman" w:hAnsi="Times New Roman" w:cs="Times New Roman"/>
+                <w:b/>
+                <w:bCs/>
+                <w:lang w:val="en-ID"/>
+              </w:rPr>
+              <w:t>triwulan_upper</w:t>
+            </w:r>
+            <w:proofErr w:type="spellEnd"/>
+            <w:r>
+              <w:rPr>
+                <w:rFonts w:ascii="Times New Roman" w:hAnsi="Times New Roman" w:cs="Times New Roman"/>
+                <w:b/>
+                <w:bCs/>
+                <w:lang w:val="en-ID"/>
+              </w:rPr>
+              <w:t>}</w:t>
+            </w:r>
+            <w:r>
+              <w:rPr>
+                <w:rFonts w:ascii="Times New Roman" w:hAnsi="Times New Roman" w:cs="Times New Roman"/>
+                <w:lang w:val="en-ID"/>
+              </w:rPr>
+              <w:t xml:space="preserve"> </w:t>
+            </w:r>
+            <w:r>
+              <w:rPr>
                 <w:rFonts w:ascii="Arial" w:hAnsi="Arial" w:cs="Arial"/>
                 <w:b/>
                 <w:bCs/>
                 <w:color w:val="000000"/>
               </w:rPr>
-              <w:t>${tahun}</w:t>
+              <w:t>${</w:t>
+            </w:r>
+            <w:proofErr w:type="spellStart"/>
+            <w:r>
+              <w:rPr>
+                <w:rFonts w:ascii="Arial" w:hAnsi="Arial" w:cs="Arial"/>
+                <w:b/>
+                <w:bCs/>
+                <w:color w:val="000000"/>
+              </w:rPr>
+              <w:t>tahun</w:t>
+            </w:r>
+            <w:proofErr w:type="spellEnd"/>
+            <w:r>
+              <w:rPr>
+                <w:rFonts w:ascii="Arial" w:hAnsi="Arial" w:cs="Arial"/>
+                <w:b/>
+                <w:bCs/>
+                <w:color w:val="000000"/>
+              </w:rPr>
+              <w:t>}</w:t>
             </w:r>
           </w:p>
           <w:p>
@@ -3250,14 +4356,25 @@
                 <w:lang w:val="en-ID"/>
               </w:rPr>
             </w:pPr>
-            <w:r>
-              <w:rPr>
-                <w:rFonts w:ascii="Times New Roman" w:hAnsi="Times New Roman" w:cs="Times New Roman"/>
-                <w:b/>
-                <w:bCs/>
-                <w:lang w:val="en-ID"/>
-              </w:rPr>
-              <w:t>Argumen Logis</w:t>
+            <w:proofErr w:type="spellStart"/>
+            <w:r>
+              <w:rPr>
+                <w:rFonts w:ascii="Times New Roman" w:hAnsi="Times New Roman" w:cs="Times New Roman"/>
+                <w:b/>
+                <w:bCs/>
+                <w:lang w:val="en-ID"/>
+              </w:rPr>
+              <w:t>Argumen</w:t>
+            </w:r>
+            <w:proofErr w:type="spellEnd"/>
+            <w:r>
+              <w:rPr>
+                <w:rFonts w:ascii="Times New Roman" w:hAnsi="Times New Roman" w:cs="Times New Roman"/>
+                <w:b/>
+                <w:bCs/>
+                <w:lang w:val="en-ID"/>
+              </w:rPr>
+              <w:t xml:space="preserve"> Logis</w:t>
             </w:r>
           </w:p>
           <w:p>
@@ -3358,17 +4475,133 @@
                 <w:rFonts w:ascii="Times New Roman" w:hAnsi="Times New Roman" w:cs="Times New Roman"/>
                 <w:b/>
                 <w:bCs/>
-                <w:lang w:val="fi-FI"/>
-              </w:rPr>
-            </w:pPr>
-            <w:r>
-              <w:rPr>
-                <w:rFonts w:ascii="Times New Roman" w:hAnsi="Times New Roman" w:cs="Times New Roman"/>
-                <w:b/>
-                <w:bCs/>
-                <w:lang w:val="fi-FI"/>
-              </w:rPr>
-              <w:t>Tautan Bukti Dukung Rencana Tindak Lanjut Triwulan Sebelumnya:</w:t>
+              </w:rPr>
+            </w:pPr>
+            <w:proofErr w:type="spellStart"/>
+            <w:r>
+              <w:rPr>
+                <w:rFonts w:ascii="Times New Roman" w:hAnsi="Times New Roman" w:cs="Times New Roman"/>
+                <w:b/>
+                <w:bCs/>
+              </w:rPr>
+              <w:t>Tautan</w:t>
+            </w:r>
+            <w:proofErr w:type="spellEnd"/>
+            <w:r>
+              <w:rPr>
+                <w:rFonts w:ascii="Times New Roman" w:hAnsi="Times New Roman" w:cs="Times New Roman"/>
+                <w:b/>
+                <w:bCs/>
+              </w:rPr>
+              <w:t xml:space="preserve"> Bukti </w:t>
+            </w:r>
+            <w:proofErr w:type="spellStart"/>
+            <w:r>
+              <w:rPr>
+                <w:rFonts w:ascii="Times New Roman" w:hAnsi="Times New Roman" w:cs="Times New Roman"/>
+                <w:b/>
+                <w:bCs/>
+              </w:rPr>
+              <w:t>Dukung</w:t>
+            </w:r>
+            <w:proofErr w:type="spellEnd"/>
+            <w:r>
+              <w:rPr>
+                <w:rFonts w:ascii="Times New Roman" w:hAnsi="Times New Roman" w:cs="Times New Roman"/>
+                <w:b/>
+                <w:bCs/>
+              </w:rPr>
+              <w:t xml:space="preserve"> </w:t>
+            </w:r>
+            <w:proofErr w:type="spellStart"/>
+            <w:r>
+              <w:rPr>
+                <w:rFonts w:ascii="Times New Roman" w:hAnsi="Times New Roman" w:cs="Times New Roman"/>
+                <w:b/>
+                <w:bCs/>
+              </w:rPr>
+              <w:t>Rencana</w:t>
+            </w:r>
+            <w:proofErr w:type="spellEnd"/>
+            <w:r>
+              <w:rPr>
+                <w:rFonts w:ascii="Times New Roman" w:hAnsi="Times New Roman" w:cs="Times New Roman"/>
+                <w:b/>
+                <w:bCs/>
+              </w:rPr>
+              <w:t xml:space="preserve"> </w:t>
+            </w:r>
+            <w:proofErr w:type="spellStart"/>
+            <w:r>
+              <w:rPr>
+                <w:rFonts w:ascii="Times New Roman" w:hAnsi="Times New Roman" w:cs="Times New Roman"/>
+                <w:b/>
+                <w:bCs/>
+              </w:rPr>
+              <w:t>Tindak</w:t>
+            </w:r>
+            <w:proofErr w:type="spellEnd"/>
+            <w:r>
+              <w:rPr>
+                <w:rFonts w:ascii="Times New Roman" w:hAnsi="Times New Roman" w:cs="Times New Roman"/>
+                <w:b/>
+                <w:bCs/>
+              </w:rPr>
+              <w:t xml:space="preserve"> </w:t>
+            </w:r>
+            <w:proofErr w:type="spellStart"/>
+            <w:r>
+              <w:rPr>
+                <w:rFonts w:ascii="Times New Roman" w:hAnsi="Times New Roman" w:cs="Times New Roman"/>
+                <w:b/>
+                <w:bCs/>
+              </w:rPr>
+              <w:t>Lanjut</w:t>
+            </w:r>
+            <w:proofErr w:type="spellEnd"/>
+            <w:r>
+              <w:rPr>
+                <w:rFonts w:ascii="Times New Roman" w:hAnsi="Times New Roman" w:cs="Times New Roman"/>
+                <w:b/>
+                <w:bCs/>
+              </w:rPr>
+              <w:t xml:space="preserve"> </w:t>
+            </w:r>
+            <w:proofErr w:type="spellStart"/>
+            <w:r>
+              <w:rPr>
+                <w:rFonts w:ascii="Times New Roman" w:hAnsi="Times New Roman" w:cs="Times New Roman"/>
+                <w:b/>
+                <w:bCs/>
+              </w:rPr>
+              <w:t>Triwulan</w:t>
+            </w:r>
+            <w:proofErr w:type="spellEnd"/>
+            <w:r>
+              <w:rPr>
+                <w:rFonts w:ascii="Times New Roman" w:hAnsi="Times New Roman" w:cs="Times New Roman"/>
+                <w:b/>
+                <w:bCs/>
+              </w:rPr>
+              <w:t xml:space="preserve"> </w:t>
+            </w:r>
+            <w:proofErr w:type="spellStart"/>
+            <w:r>
+              <w:rPr>
+                <w:rFonts w:ascii="Times New Roman" w:hAnsi="Times New Roman" w:cs="Times New Roman"/>
+                <w:b/>
+                <w:bCs/>
+              </w:rPr>
+              <w:t>Sebelumnya</w:t>
+            </w:r>
+            <w:proofErr w:type="spellEnd"/>
+            <w:r>
+              <w:rPr>
+                <w:rFonts w:ascii="Times New Roman" w:hAnsi="Times New Roman" w:cs="Times New Roman"/>
+                <w:b/>
+                <w:bCs/>
+              </w:rPr>
+              <w:t>:</w:t>
             </w:r>
           </w:p>
           <w:p>
@@ -3409,19 +4642,22 @@
               <w:jc w:val="both"/>
               <w:rPr>
                 <w:rFonts w:ascii="Times New Roman" w:hAnsi="Times New Roman" w:cs="Times New Roman"/>
-              </w:rPr>
-            </w:pPr>
-            <w:r>
-              <w:rPr>
-                <w:rFonts w:ascii="Times New Roman" w:hAnsi="Times New Roman" w:cs="Times New Roman"/>
-                <w:b/>
-                <w:bCs/>
+                <w:lang w:val="fi-FI"/>
+              </w:rPr>
+            </w:pPr>
+            <w:r>
+              <w:rPr>
+                <w:rFonts w:ascii="Times New Roman" w:hAnsi="Times New Roman" w:cs="Times New Roman"/>
+                <w:b/>
+                <w:bCs/>
+                <w:lang w:val="fi-FI"/>
               </w:rPr>
               <w:t>Penjelasan/pembahasan lainnya</w:t>
             </w:r>
             <w:r>
               <w:rPr>
                 <w:rFonts w:ascii="Times New Roman" w:hAnsi="Times New Roman" w:cs="Times New Roman"/>
+                <w:lang w:val="fi-FI"/>
               </w:rPr>
               <w:t>:</w:t>
             </w:r>
@@ -3492,6 +4728,68 @@
           <w:rFonts w:ascii="Times New Roman" w:hAnsi="Times New Roman" w:cs="Times New Roman"/>
           <w:lang w:val="fi-FI"/>
         </w:rPr>
+      </w:pPr>
+      <w:r>
+        <w:rPr>
+          <w:rFonts w:ascii="Times New Roman" w:hAnsi="Times New Roman" w:cs="Times New Roman"/>
+          <w:lang w:val="fi-FI"/>
+        </w:rPr>
+        <w:br w:type="page"/>
+      </w:r>
+    </w:p>
+    <w:p>
+      <w:pPr>
+        <w:rPr>
+          <w:rFonts w:ascii="Times New Roman" w:hAnsi="Times New Roman" w:cs="Times New Roman"/>
+          <w:lang w:val="fi-FI"/>
+        </w:rPr>
+      </w:pPr>
+      <w:r>
+        <w:rPr>
+          <w:rFonts w:ascii="Times New Roman" w:hAnsi="Times New Roman" w:cs="Times New Roman"/>
+          <w:lang w:val="fi-FI"/>
+        </w:rPr>
+        <w:lastRenderedPageBreak/>
+        <w:t>${/block_indikator}</w:t>
+      </w:r>
+    </w:p>
+    <w:p>
+      <w:pPr>
+        <w:rPr>
+          <w:rFonts w:ascii="Times New Roman" w:hAnsi="Times New Roman" w:cs="Times New Roman"/>
+          <w:lang w:val="fi-FI"/>
+        </w:rPr>
+      </w:pPr>
+      <w:r>
+        <w:rPr>
+          <w:rFonts w:ascii="Times New Roman" w:hAnsi="Times New Roman" w:cs="Times New Roman"/>
+          <w:lang w:val="fi-FI"/>
+        </w:rPr>
+        <w:br w:type="page"/>
+      </w:r>
+    </w:p>
+    <w:p>
+      <w:pPr>
+        <w:rPr>
+          <w:rFonts w:ascii="Times New Roman" w:hAnsi="Times New Roman" w:cs="Times New Roman"/>
+          <w:lang w:val="fi-FI"/>
+        </w:rPr>
+      </w:pPr>
+      <w:r>
+        <w:rPr>
+          <w:rFonts w:ascii="Times New Roman" w:hAnsi="Times New Roman" w:cs="Times New Roman"/>
+          <w:lang w:val="fi-FI"/>
+        </w:rPr>
+        <w:lastRenderedPageBreak/>
+        <w:br w:type="page"/>
+      </w:r>
+    </w:p>
+    <w:p>
+      <w:pPr>
+        <w:rPr>
+          <w:rFonts w:ascii="Times New Roman" w:hAnsi="Times New Roman" w:cs="Times New Roman"/>
+          <w:lang w:val="fi-FI"/>
+        </w:rPr>
         <w:sectPr>
           <w:pgSz w:w="12240" w:h="15840"/>
           <w:pgMar w:top="1440" w:right="1440" w:bottom="1440" w:left="1440" w:header="720" w:footer="720" w:gutter="0"/>
@@ -3499,13 +4797,6 @@
           <w:docGrid w:linePitch="360"/>
         </w:sectPr>
       </w:pPr>
-      <w:r>
-        <w:rPr>
-          <w:rFonts w:ascii="Times New Roman" w:hAnsi="Times New Roman" w:cs="Times New Roman"/>
-          <w:lang w:val="fi-FI"/>
-        </w:rPr>
-        <w:t>${/block_indikator}</w:t>
-      </w:r>
     </w:p>
     <w:p>
       <w:pPr>
@@ -3615,7 +4906,87 @@
                 <w:rFonts w:ascii="Times New Roman" w:hAnsi="Times New Roman" w:cs="Times New Roman"/>
                 <w:lang w:val="en-ID"/>
               </w:rPr>
-              <w:t>PAGU Revisi Sampai dengan triwulan berjalan (Rp)</w:t>
+              <w:t xml:space="preserve">PAGU </w:t>
+            </w:r>
+            <w:proofErr w:type="spellStart"/>
+            <w:r>
+              <w:rPr>
+                <w:rFonts w:ascii="Times New Roman" w:hAnsi="Times New Roman" w:cs="Times New Roman"/>
+                <w:lang w:val="en-ID"/>
+              </w:rPr>
+              <w:t>Revisi</w:t>
+            </w:r>
+            <w:proofErr w:type="spellEnd"/>
+            <w:r>
+              <w:rPr>
+                <w:rFonts w:ascii="Times New Roman" w:hAnsi="Times New Roman" w:cs="Times New Roman"/>
+                <w:lang w:val="en-ID"/>
+              </w:rPr>
+              <w:t xml:space="preserve"> </w:t>
+            </w:r>
+            <w:proofErr w:type="spellStart"/>
+            <w:r>
+              <w:rPr>
+                <w:rFonts w:ascii="Times New Roman" w:hAnsi="Times New Roman" w:cs="Times New Roman"/>
+                <w:lang w:val="en-ID"/>
+              </w:rPr>
+              <w:t>Sampai</w:t>
+            </w:r>
+            <w:proofErr w:type="spellEnd"/>
+            <w:r>
+              <w:rPr>
+                <w:rFonts w:ascii="Times New Roman" w:hAnsi="Times New Roman" w:cs="Times New Roman"/>
+                <w:lang w:val="en-ID"/>
+              </w:rPr>
+              <w:t xml:space="preserve"> </w:t>
+            </w:r>
+            <w:proofErr w:type="spellStart"/>
+            <w:r>
+              <w:rPr>
+                <w:rFonts w:ascii="Times New Roman" w:hAnsi="Times New Roman" w:cs="Times New Roman"/>
+                <w:lang w:val="en-ID"/>
+              </w:rPr>
+              <w:t>dengan</w:t>
+            </w:r>
+            <w:proofErr w:type="spellEnd"/>
+            <w:r>
+              <w:rPr>
+                <w:rFonts w:ascii="Times New Roman" w:hAnsi="Times New Roman" w:cs="Times New Roman"/>
+                <w:lang w:val="en-ID"/>
+              </w:rPr>
+              <w:t xml:space="preserve"> </w:t>
+            </w:r>
+            <w:proofErr w:type="spellStart"/>
+            <w:r>
+              <w:rPr>
+                <w:rFonts w:ascii="Times New Roman" w:hAnsi="Times New Roman" w:cs="Times New Roman"/>
+                <w:lang w:val="en-ID"/>
+              </w:rPr>
+              <w:t>triwulan</w:t>
+            </w:r>
+            <w:proofErr w:type="spellEnd"/>
+            <w:r>
+              <w:rPr>
+                <w:rFonts w:ascii="Times New Roman" w:hAnsi="Times New Roman" w:cs="Times New Roman"/>
+                <w:lang w:val="en-ID"/>
+              </w:rPr>
+              <w:t xml:space="preserve"> </w:t>
+            </w:r>
+            <w:proofErr w:type="spellStart"/>
+            <w:r>
+              <w:rPr>
+                <w:rFonts w:ascii="Times New Roman" w:hAnsi="Times New Roman" w:cs="Times New Roman"/>
+                <w:lang w:val="en-ID"/>
+              </w:rPr>
+              <w:t>berjalan</w:t>
+            </w:r>
+            <w:proofErr w:type="spellEnd"/>
+            <w:r>
+              <w:rPr>
+                <w:rFonts w:ascii="Times New Roman" w:hAnsi="Times New Roman" w:cs="Times New Roman"/>
+                <w:lang w:val="en-ID"/>
+              </w:rPr>
+              <w:t xml:space="preserve"> (Rp)</w:t>
             </w:r>
           </w:p>
         </w:tc>
@@ -3633,12 +5004,85 @@
                 <w:lang w:val="en-ID"/>
               </w:rPr>
             </w:pPr>
-            <w:r>
-              <w:rPr>
-                <w:rFonts w:ascii="Times New Roman" w:hAnsi="Times New Roman" w:cs="Times New Roman"/>
-                <w:lang w:val="en-ID"/>
-              </w:rPr>
-              <w:t>Realisasi sampai dengan triwulan Berjalan (Rp)</w:t>
+            <w:proofErr w:type="spellStart"/>
+            <w:r>
+              <w:rPr>
+                <w:rFonts w:ascii="Times New Roman" w:hAnsi="Times New Roman" w:cs="Times New Roman"/>
+                <w:lang w:val="en-ID"/>
+              </w:rPr>
+              <w:t>Realisasi</w:t>
+            </w:r>
+            <w:proofErr w:type="spellEnd"/>
+            <w:r>
+              <w:rPr>
+                <w:rFonts w:ascii="Times New Roman" w:hAnsi="Times New Roman" w:cs="Times New Roman"/>
+                <w:lang w:val="en-ID"/>
+              </w:rPr>
+              <w:t xml:space="preserve"> </w:t>
+            </w:r>
+            <w:proofErr w:type="spellStart"/>
+            <w:r>
+              <w:rPr>
+                <w:rFonts w:ascii="Times New Roman" w:hAnsi="Times New Roman" w:cs="Times New Roman"/>
+                <w:lang w:val="en-ID"/>
+              </w:rPr>
+              <w:t>sampai</w:t>
+            </w:r>
+            <w:proofErr w:type="spellEnd"/>
+            <w:r>
+              <w:rPr>
+                <w:rFonts w:ascii="Times New Roman" w:hAnsi="Times New Roman" w:cs="Times New Roman"/>
+                <w:lang w:val="en-ID"/>
+              </w:rPr>
+              <w:t xml:space="preserve"> </w:t>
+            </w:r>
+            <w:proofErr w:type="spellStart"/>
+            <w:r>
+              <w:rPr>
+                <w:rFonts w:ascii="Times New Roman" w:hAnsi="Times New Roman" w:cs="Times New Roman"/>
+                <w:lang w:val="en-ID"/>
+              </w:rPr>
+              <w:t>dengan</w:t>
+            </w:r>
+            <w:proofErr w:type="spellEnd"/>
+            <w:r>
+              <w:rPr>
+                <w:rFonts w:ascii="Times New Roman" w:hAnsi="Times New Roman" w:cs="Times New Roman"/>
+                <w:lang w:val="en-ID"/>
+              </w:rPr>
+              <w:t xml:space="preserve"> </w:t>
+            </w:r>
+            <w:proofErr w:type="spellStart"/>
+            <w:r>
+              <w:rPr>
+                <w:rFonts w:ascii="Times New Roman" w:hAnsi="Times New Roman" w:cs="Times New Roman"/>
+                <w:lang w:val="en-ID"/>
+              </w:rPr>
+              <w:t>triwulan</w:t>
+            </w:r>
+            <w:proofErr w:type="spellEnd"/>
+            <w:r>
+              <w:rPr>
+                <w:rFonts w:ascii="Times New Roman" w:hAnsi="Times New Roman" w:cs="Times New Roman"/>
+                <w:lang w:val="en-ID"/>
+              </w:rPr>
+              <w:t xml:space="preserve"> </w:t>
+            </w:r>
+            <w:proofErr w:type="spellStart"/>
+            <w:r>
+              <w:rPr>
+                <w:rFonts w:ascii="Times New Roman" w:hAnsi="Times New Roman" w:cs="Times New Roman"/>
+                <w:lang w:val="en-ID"/>
+              </w:rPr>
+              <w:t>Berjalan</w:t>
+            </w:r>
+            <w:proofErr w:type="spellEnd"/>
+            <w:r>
+              <w:rPr>
+                <w:rFonts w:ascii="Times New Roman" w:hAnsi="Times New Roman" w:cs="Times New Roman"/>
+                <w:lang w:val="en-ID"/>
+              </w:rPr>
+              <w:t xml:space="preserve"> (Rp)</w:t>
             </w:r>
           </w:p>
         </w:tc>
@@ -3662,7 +5106,23 @@
                 <w:rFonts w:ascii="Times New Roman" w:hAnsi="Times New Roman" w:cs="Times New Roman"/>
                 <w:lang w:val="en-ID"/>
               </w:rPr>
-              <w:t>${sasaran}</w:t>
+              <w:t>${</w:t>
+            </w:r>
+            <w:proofErr w:type="spellStart"/>
+            <w:r>
+              <w:rPr>
+                <w:rFonts w:ascii="Times New Roman" w:hAnsi="Times New Roman" w:cs="Times New Roman"/>
+                <w:lang w:val="en-ID"/>
+              </w:rPr>
+              <w:t>sasaran</w:t>
+            </w:r>
+            <w:proofErr w:type="spellEnd"/>
+            <w:r>
+              <w:rPr>
+                <w:rFonts w:ascii="Times New Roman" w:hAnsi="Times New Roman" w:cs="Times New Roman"/>
+                <w:lang w:val="en-ID"/>
+              </w:rPr>
+              <w:t>}</w:t>
             </w:r>
           </w:p>
         </w:tc>
@@ -3685,7 +5145,23 @@
                 <w:rFonts w:ascii="Times New Roman" w:hAnsi="Times New Roman" w:cs="Times New Roman"/>
                 <w:lang w:val="en-ID"/>
               </w:rPr>
-              <w:t>${pagu_awal}</w:t>
+              <w:t>${</w:t>
+            </w:r>
+            <w:proofErr w:type="spellStart"/>
+            <w:r>
+              <w:rPr>
+                <w:rFonts w:ascii="Times New Roman" w:hAnsi="Times New Roman" w:cs="Times New Roman"/>
+                <w:lang w:val="en-ID"/>
+              </w:rPr>
+              <w:t>pagu_awal</w:t>
+            </w:r>
+            <w:proofErr w:type="spellEnd"/>
+            <w:r>
+              <w:rPr>
+                <w:rFonts w:ascii="Times New Roman" w:hAnsi="Times New Roman" w:cs="Times New Roman"/>
+                <w:lang w:val="en-ID"/>
+              </w:rPr>
+              <w:t>}</w:t>
             </w:r>
           </w:p>
         </w:tc>
@@ -3708,7 +5184,23 @@
                 <w:rFonts w:ascii="Times New Roman" w:hAnsi="Times New Roman" w:cs="Times New Roman"/>
                 <w:lang w:val="en-ID"/>
               </w:rPr>
-              <w:t>${pagu_revisi}</w:t>
+              <w:t>${</w:t>
+            </w:r>
+            <w:proofErr w:type="spellStart"/>
+            <w:r>
+              <w:rPr>
+                <w:rFonts w:ascii="Times New Roman" w:hAnsi="Times New Roman" w:cs="Times New Roman"/>
+                <w:lang w:val="en-ID"/>
+              </w:rPr>
+              <w:t>pagu_revisi</w:t>
+            </w:r>
+            <w:proofErr w:type="spellEnd"/>
+            <w:r>
+              <w:rPr>
+                <w:rFonts w:ascii="Times New Roman" w:hAnsi="Times New Roman" w:cs="Times New Roman"/>
+                <w:lang w:val="en-ID"/>
+              </w:rPr>
+              <w:t>}</w:t>
             </w:r>
           </w:p>
         </w:tc>
@@ -3731,7 +5223,23 @@
                 <w:rFonts w:ascii="Times New Roman" w:hAnsi="Times New Roman" w:cs="Times New Roman"/>
                 <w:lang w:val="en-ID"/>
               </w:rPr>
-              <w:t>${pagu_realisasi}</w:t>
+              <w:t>${</w:t>
+            </w:r>
+            <w:proofErr w:type="spellStart"/>
+            <w:r>
+              <w:rPr>
+                <w:rFonts w:ascii="Times New Roman" w:hAnsi="Times New Roman" w:cs="Times New Roman"/>
+                <w:lang w:val="en-ID"/>
+              </w:rPr>
+              <w:t>pagu_realisasi</w:t>
+            </w:r>
+            <w:proofErr w:type="spellEnd"/>
+            <w:r>
+              <w:rPr>
+                <w:rFonts w:ascii="Times New Roman" w:hAnsi="Times New Roman" w:cs="Times New Roman"/>
+                <w:lang w:val="en-ID"/>
+              </w:rPr>
+              <w:t>}</w:t>
             </w:r>
           </w:p>
         </w:tc>
@@ -3769,14 +5277,72 @@
           <w:rFonts w:ascii="Times New Roman" w:hAnsi="Times New Roman" w:cs="Times New Roman"/>
         </w:rPr>
         <w:lastRenderedPageBreak/>
-        <w:t xml:space="preserve">Upaya efisiensi yang dilakukan BPS Kabupaten Tapin pada </w:t>
-      </w:r>
-      <w:r>
-        <w:rPr>
-          <w:rFonts w:ascii="Times New Roman" w:hAnsi="Times New Roman" w:cs="Times New Roman"/>
-          <w:lang w:val="fi-FI"/>
-        </w:rPr>
-        <w:t>${triwulan}</w:t>
+        <w:t xml:space="preserve">Upaya </w:t>
+      </w:r>
+      <w:proofErr w:type="spellStart"/>
+      <w:r>
+        <w:rPr>
+          <w:rFonts w:ascii="Times New Roman" w:hAnsi="Times New Roman" w:cs="Times New Roman"/>
+        </w:rPr>
+        <w:t>efisiensi</w:t>
+      </w:r>
+      <w:proofErr w:type="spellEnd"/>
+      <w:r>
+        <w:rPr>
+          <w:rFonts w:ascii="Times New Roman" w:hAnsi="Times New Roman" w:cs="Times New Roman"/>
+        </w:rPr>
+        <w:t xml:space="preserve"> yang </w:t>
+      </w:r>
+      <w:proofErr w:type="spellStart"/>
+      <w:r>
+        <w:rPr>
+          <w:rFonts w:ascii="Times New Roman" w:hAnsi="Times New Roman" w:cs="Times New Roman"/>
+        </w:rPr>
+        <w:t>dilakukan</w:t>
+      </w:r>
+      <w:proofErr w:type="spellEnd"/>
+      <w:r>
+        <w:rPr>
+          <w:rFonts w:ascii="Times New Roman" w:hAnsi="Times New Roman" w:cs="Times New Roman"/>
+        </w:rPr>
+        <w:t xml:space="preserve"> BPS </w:t>
+      </w:r>
+      <w:proofErr w:type="spellStart"/>
+      <w:r>
+        <w:rPr>
+          <w:rFonts w:ascii="Times New Roman" w:hAnsi="Times New Roman" w:cs="Times New Roman"/>
+        </w:rPr>
+        <w:t>Kabupaten</w:t>
+      </w:r>
+      <w:proofErr w:type="spellEnd"/>
+      <w:r>
+        <w:rPr>
+          <w:rFonts w:ascii="Times New Roman" w:hAnsi="Times New Roman" w:cs="Times New Roman"/>
+        </w:rPr>
+        <w:t xml:space="preserve"> Tapin pada </w:t>
+      </w:r>
+      <w:r>
+        <w:rPr>
+          <w:rFonts w:ascii="Times New Roman" w:hAnsi="Times New Roman" w:cs="Times New Roman"/>
+          <w:lang w:val="en-ID"/>
+        </w:rPr>
+        <w:t>${</w:t>
+      </w:r>
+      <w:proofErr w:type="spellStart"/>
+      <w:r>
+        <w:rPr>
+          <w:rFonts w:ascii="Times New Roman" w:hAnsi="Times New Roman" w:cs="Times New Roman"/>
+          <w:lang w:val="en-ID"/>
+        </w:rPr>
+        <w:t>triwulan_upper</w:t>
+      </w:r>
+      <w:proofErr w:type="spellEnd"/>
+      <w:r>
+        <w:rPr>
+          <w:rFonts w:ascii="Times New Roman" w:hAnsi="Times New Roman" w:cs="Times New Roman"/>
+          <w:lang w:val="en-ID"/>
+        </w:rPr>
+        <w:t>}</w:t>
       </w:r>
       <w:r>
         <w:rPr>
@@ -3789,20 +5355,317 @@
           <w:rFonts w:ascii="Arial" w:hAnsi="Arial" w:cs="Arial"/>
           <w:color w:val="000000"/>
         </w:rPr>
-        <w:t>${tahun}</w:t>
-      </w:r>
+        <w:t>${</w:t>
+      </w:r>
+      <w:proofErr w:type="spellStart"/>
       <w:r>
         <w:rPr>
           <w:rFonts w:ascii="Arial" w:hAnsi="Arial" w:cs="Arial"/>
           <w:color w:val="000000"/>
         </w:rPr>
+        <w:t>tahun</w:t>
+      </w:r>
+      <w:proofErr w:type="spellEnd"/>
+      <w:r>
+        <w:rPr>
+          <w:rFonts w:ascii="Arial" w:hAnsi="Arial" w:cs="Arial"/>
+          <w:color w:val="000000"/>
+        </w:rPr>
+        <w:t xml:space="preserve">} </w:t>
+      </w:r>
+      <w:proofErr w:type="spellStart"/>
+      <w:r>
+        <w:rPr>
+          <w:rFonts w:ascii="Times New Roman" w:hAnsi="Times New Roman" w:cs="Times New Roman"/>
+        </w:rPr>
+        <w:t>sebagai</w:t>
+      </w:r>
+      <w:proofErr w:type="spellEnd"/>
+      <w:r>
+        <w:rPr>
+          <w:rFonts w:ascii="Times New Roman" w:hAnsi="Times New Roman" w:cs="Times New Roman"/>
+        </w:rPr>
         <w:t xml:space="preserve"> </w:t>
       </w:r>
-      <w:r>
-        <w:rPr>
-          <w:rFonts w:ascii="Times New Roman" w:hAnsi="Times New Roman" w:cs="Times New Roman"/>
-        </w:rPr>
-        <w:t xml:space="preserve">sebagai upaya dalam mendukung pengelolaan efisiensi anggaran diantaranya melakukan penghematan atas penggunaan sumber daya dalam kegiatan operasional kantor, seperti penggunaan listrik, air, dan internet. </w:t>
+      <w:proofErr w:type="spellStart"/>
+      <w:r>
+        <w:rPr>
+          <w:rFonts w:ascii="Times New Roman" w:hAnsi="Times New Roman" w:cs="Times New Roman"/>
+        </w:rPr>
+        <w:t>upaya</w:t>
+      </w:r>
+      <w:proofErr w:type="spellEnd"/>
+      <w:r>
+        <w:rPr>
+          <w:rFonts w:ascii="Times New Roman" w:hAnsi="Times New Roman" w:cs="Times New Roman"/>
+        </w:rPr>
+        <w:t xml:space="preserve"> </w:t>
+      </w:r>
+      <w:proofErr w:type="spellStart"/>
+      <w:r>
+        <w:rPr>
+          <w:rFonts w:ascii="Times New Roman" w:hAnsi="Times New Roman" w:cs="Times New Roman"/>
+        </w:rPr>
+        <w:t>dalam</w:t>
+      </w:r>
+      <w:proofErr w:type="spellEnd"/>
+      <w:r>
+        <w:rPr>
+          <w:rFonts w:ascii="Times New Roman" w:hAnsi="Times New Roman" w:cs="Times New Roman"/>
+        </w:rPr>
+        <w:t xml:space="preserve"> </w:t>
+      </w:r>
+      <w:proofErr w:type="spellStart"/>
+      <w:r>
+        <w:rPr>
+          <w:rFonts w:ascii="Times New Roman" w:hAnsi="Times New Roman" w:cs="Times New Roman"/>
+        </w:rPr>
+        <w:t>mendukung</w:t>
+      </w:r>
+      <w:proofErr w:type="spellEnd"/>
+      <w:r>
+        <w:rPr>
+          <w:rFonts w:ascii="Times New Roman" w:hAnsi="Times New Roman" w:cs="Times New Roman"/>
+        </w:rPr>
+        <w:t xml:space="preserve"> </w:t>
+      </w:r>
+      <w:proofErr w:type="spellStart"/>
+      <w:r>
+        <w:rPr>
+          <w:rFonts w:ascii="Times New Roman" w:hAnsi="Times New Roman" w:cs="Times New Roman"/>
+        </w:rPr>
+        <w:t>pengelolaan</w:t>
+      </w:r>
+      <w:proofErr w:type="spellEnd"/>
+      <w:r>
+        <w:rPr>
+          <w:rFonts w:ascii="Times New Roman" w:hAnsi="Times New Roman" w:cs="Times New Roman"/>
+        </w:rPr>
+        <w:t xml:space="preserve"> </w:t>
+      </w:r>
+      <w:proofErr w:type="spellStart"/>
+      <w:r>
+        <w:rPr>
+          <w:rFonts w:ascii="Times New Roman" w:hAnsi="Times New Roman" w:cs="Times New Roman"/>
+        </w:rPr>
+        <w:t>efisiensi</w:t>
+      </w:r>
+      <w:proofErr w:type="spellEnd"/>
+      <w:r>
+        <w:rPr>
+          <w:rFonts w:ascii="Times New Roman" w:hAnsi="Times New Roman" w:cs="Times New Roman"/>
+        </w:rPr>
+        <w:t xml:space="preserve"> </w:t>
+      </w:r>
+      <w:proofErr w:type="spellStart"/>
+      <w:r>
+        <w:rPr>
+          <w:rFonts w:ascii="Times New Roman" w:hAnsi="Times New Roman" w:cs="Times New Roman"/>
+        </w:rPr>
+        <w:t>anggaran</w:t>
+      </w:r>
+      <w:proofErr w:type="spellEnd"/>
+      <w:r>
+        <w:rPr>
+          <w:rFonts w:ascii="Times New Roman" w:hAnsi="Times New Roman" w:cs="Times New Roman"/>
+        </w:rPr>
+        <w:t xml:space="preserve"> </w:t>
+      </w:r>
+      <w:proofErr w:type="spellStart"/>
+      <w:r>
+        <w:rPr>
+          <w:rFonts w:ascii="Times New Roman" w:hAnsi="Times New Roman" w:cs="Times New Roman"/>
+        </w:rPr>
+        <w:t>diantaranya</w:t>
+      </w:r>
+      <w:proofErr w:type="spellEnd"/>
+      <w:r>
+        <w:rPr>
+          <w:rFonts w:ascii="Times New Roman" w:hAnsi="Times New Roman" w:cs="Times New Roman"/>
+        </w:rPr>
+        <w:t xml:space="preserve"> </w:t>
+      </w:r>
+      <w:proofErr w:type="spellStart"/>
+      <w:r>
+        <w:rPr>
+          <w:rFonts w:ascii="Times New Roman" w:hAnsi="Times New Roman" w:cs="Times New Roman"/>
+        </w:rPr>
+        <w:t>melakukan</w:t>
+      </w:r>
+      <w:proofErr w:type="spellEnd"/>
+      <w:r>
+        <w:rPr>
+          <w:rFonts w:ascii="Times New Roman" w:hAnsi="Times New Roman" w:cs="Times New Roman"/>
+        </w:rPr>
+        <w:t xml:space="preserve"> </w:t>
+      </w:r>
+      <w:proofErr w:type="spellStart"/>
+      <w:r>
+        <w:rPr>
+          <w:rFonts w:ascii="Times New Roman" w:hAnsi="Times New Roman" w:cs="Times New Roman"/>
+        </w:rPr>
+        <w:t>penghematan</w:t>
+      </w:r>
+      <w:proofErr w:type="spellEnd"/>
+      <w:r>
+        <w:rPr>
+          <w:rFonts w:ascii="Times New Roman" w:hAnsi="Times New Roman" w:cs="Times New Roman"/>
+        </w:rPr>
+        <w:t xml:space="preserve"> </w:t>
+      </w:r>
+      <w:proofErr w:type="spellStart"/>
+      <w:r>
+        <w:rPr>
+          <w:rFonts w:ascii="Times New Roman" w:hAnsi="Times New Roman" w:cs="Times New Roman"/>
+        </w:rPr>
+        <w:t>atas</w:t>
+      </w:r>
+      <w:proofErr w:type="spellEnd"/>
+      <w:r>
+        <w:rPr>
+          <w:rFonts w:ascii="Times New Roman" w:hAnsi="Times New Roman" w:cs="Times New Roman"/>
+        </w:rPr>
+        <w:t xml:space="preserve"> </w:t>
+      </w:r>
+      <w:proofErr w:type="spellStart"/>
+      <w:r>
+        <w:rPr>
+          <w:rFonts w:ascii="Times New Roman" w:hAnsi="Times New Roman" w:cs="Times New Roman"/>
+        </w:rPr>
+        <w:t>penggunaan</w:t>
+      </w:r>
+      <w:proofErr w:type="spellEnd"/>
+      <w:r>
+        <w:rPr>
+          <w:rFonts w:ascii="Times New Roman" w:hAnsi="Times New Roman" w:cs="Times New Roman"/>
+        </w:rPr>
+        <w:t xml:space="preserve"> </w:t>
+      </w:r>
+      <w:proofErr w:type="spellStart"/>
+      <w:r>
+        <w:rPr>
+          <w:rFonts w:ascii="Times New Roman" w:hAnsi="Times New Roman" w:cs="Times New Roman"/>
+        </w:rPr>
+        <w:t>sumber</w:t>
+      </w:r>
+      <w:proofErr w:type="spellEnd"/>
+      <w:r>
+        <w:rPr>
+          <w:rFonts w:ascii="Times New Roman" w:hAnsi="Times New Roman" w:cs="Times New Roman"/>
+        </w:rPr>
+        <w:t xml:space="preserve"> </w:t>
+      </w:r>
+      <w:proofErr w:type="spellStart"/>
+      <w:r>
+        <w:rPr>
+          <w:rFonts w:ascii="Times New Roman" w:hAnsi="Times New Roman" w:cs="Times New Roman"/>
+        </w:rPr>
+        <w:t>daya</w:t>
+      </w:r>
+      <w:proofErr w:type="spellEnd"/>
+      <w:r>
+        <w:rPr>
+          <w:rFonts w:ascii="Times New Roman" w:hAnsi="Times New Roman" w:cs="Times New Roman"/>
+        </w:rPr>
+        <w:t xml:space="preserve"> </w:t>
+      </w:r>
+      <w:proofErr w:type="spellStart"/>
+      <w:r>
+        <w:rPr>
+          <w:rFonts w:ascii="Times New Roman" w:hAnsi="Times New Roman" w:cs="Times New Roman"/>
+        </w:rPr>
+        <w:t>dalam</w:t>
+      </w:r>
+      <w:proofErr w:type="spellEnd"/>
+      <w:r>
+        <w:rPr>
+          <w:rFonts w:ascii="Times New Roman" w:hAnsi="Times New Roman" w:cs="Times New Roman"/>
+        </w:rPr>
+        <w:t xml:space="preserve"> </w:t>
+      </w:r>
+      <w:proofErr w:type="spellStart"/>
+      <w:r>
+        <w:rPr>
+          <w:rFonts w:ascii="Times New Roman" w:hAnsi="Times New Roman" w:cs="Times New Roman"/>
+        </w:rPr>
+        <w:t>kegiatan</w:t>
+      </w:r>
+      <w:proofErr w:type="spellEnd"/>
+      <w:r>
+        <w:rPr>
+          <w:rFonts w:ascii="Times New Roman" w:hAnsi="Times New Roman" w:cs="Times New Roman"/>
+        </w:rPr>
+        <w:t xml:space="preserve"> </w:t>
+      </w:r>
+      <w:proofErr w:type="spellStart"/>
+      <w:r>
+        <w:rPr>
+          <w:rFonts w:ascii="Times New Roman" w:hAnsi="Times New Roman" w:cs="Times New Roman"/>
+        </w:rPr>
+        <w:t>operasional</w:t>
+      </w:r>
+      <w:proofErr w:type="spellEnd"/>
+      <w:r>
+        <w:rPr>
+          <w:rFonts w:ascii="Times New Roman" w:hAnsi="Times New Roman" w:cs="Times New Roman"/>
+        </w:rPr>
+        <w:t xml:space="preserve"> </w:t>
+      </w:r>
+      <w:proofErr w:type="spellStart"/>
+      <w:r>
+        <w:rPr>
+          <w:rFonts w:ascii="Times New Roman" w:hAnsi="Times New Roman" w:cs="Times New Roman"/>
+        </w:rPr>
+        <w:t>kantor</w:t>
+      </w:r>
+      <w:proofErr w:type="spellEnd"/>
+      <w:r>
+        <w:rPr>
+          <w:rFonts w:ascii="Times New Roman" w:hAnsi="Times New Roman" w:cs="Times New Roman"/>
+        </w:rPr>
+        <w:t xml:space="preserve">, </w:t>
+      </w:r>
+      <w:proofErr w:type="spellStart"/>
+      <w:r>
+        <w:rPr>
+          <w:rFonts w:ascii="Times New Roman" w:hAnsi="Times New Roman" w:cs="Times New Roman"/>
+        </w:rPr>
+        <w:t>seperti</w:t>
+      </w:r>
+      <w:proofErr w:type="spellEnd"/>
+      <w:r>
+        <w:rPr>
+          <w:rFonts w:ascii="Times New Roman" w:hAnsi="Times New Roman" w:cs="Times New Roman"/>
+        </w:rPr>
+        <w:t xml:space="preserve"> </w:t>
+      </w:r>
+      <w:proofErr w:type="spellStart"/>
+      <w:r>
+        <w:rPr>
+          <w:rFonts w:ascii="Times New Roman" w:hAnsi="Times New Roman" w:cs="Times New Roman"/>
+        </w:rPr>
+        <w:t>penggunaan</w:t>
+      </w:r>
+      <w:proofErr w:type="spellEnd"/>
+      <w:r>
+        <w:rPr>
+          <w:rFonts w:ascii="Times New Roman" w:hAnsi="Times New Roman" w:cs="Times New Roman"/>
+        </w:rPr>
+        <w:t xml:space="preserve"> </w:t>
+      </w:r>
+      <w:proofErr w:type="spellStart"/>
+      <w:r>
+        <w:rPr>
+          <w:rFonts w:ascii="Times New Roman" w:hAnsi="Times New Roman" w:cs="Times New Roman"/>
+        </w:rPr>
+        <w:t>listrik</w:t>
+      </w:r>
+      <w:proofErr w:type="spellEnd"/>
+      <w:r>
+        <w:rPr>
+          <w:rFonts w:ascii="Times New Roman" w:hAnsi="Times New Roman" w:cs="Times New Roman"/>
+        </w:rPr>
+        <w:t xml:space="preserve">, air, dan internet. </w:t>
       </w:r>
       <w:r>
         <w:rPr>

</xml_diff>

<commit_message>
Menmbahkan fitur baru dan master anggaran
</commit_message>
<xml_diff>
--- a/storage/app/templates/notulen_capkin.docx
+++ b/storage/app/templates/notulen_capkin.docx
@@ -154,33 +154,23 @@
                 <w:b/>
                 <w:bCs/>
               </w:rPr>
-              <w:t xml:space="preserve">Agenda </w:t>
-            </w:r>
-            <w:proofErr w:type="spellStart"/>
-            <w:r>
+              <w:t>Agenda Pembahasan</w:t>
+            </w:r>
+          </w:p>
+        </w:tc>
+        <w:tc>
+          <w:tcPr>
+            <w:tcW w:w="6661" w:type="dxa"/>
+            <w:vAlign w:val="center"/>
+          </w:tcPr>
+          <w:p>
+            <w:pPr>
+              <w:spacing w:line="276" w:lineRule="auto"/>
               <w:rPr>
                 <w:rFonts w:ascii="Times New Roman" w:hAnsi="Times New Roman" w:cs="Times New Roman"/>
                 <w:b/>
                 <w:bCs/>
               </w:rPr>
-              <w:t>Pembahasan</w:t>
-            </w:r>
-            <w:proofErr w:type="spellEnd"/>
-          </w:p>
-        </w:tc>
-        <w:tc>
-          <w:tcPr>
-            <w:tcW w:w="6661" w:type="dxa"/>
-            <w:vAlign w:val="center"/>
-          </w:tcPr>
-          <w:p>
-            <w:pPr>
-              <w:spacing w:line="276" w:lineRule="auto"/>
-              <w:rPr>
-                <w:rFonts w:ascii="Times New Roman" w:hAnsi="Times New Roman" w:cs="Times New Roman"/>
-                <w:b/>
-                <w:bCs/>
-              </w:rPr>
             </w:pPr>
             <w:r>
               <w:rPr>
@@ -194,76 +184,35 @@
                 <w:rFonts w:ascii="Arial" w:hAnsi="Arial" w:cs="Arial"/>
                 <w:color w:val="000000"/>
               </w:rPr>
-              <w:t>${</w:t>
-            </w:r>
-            <w:proofErr w:type="spellStart"/>
+              <w:t>${triwulan</w:t>
+            </w:r>
             <w:r>
               <w:rPr>
                 <w:rFonts w:ascii="Arial" w:hAnsi="Arial" w:cs="Arial"/>
                 <w:color w:val="000000"/>
               </w:rPr>
-              <w:t>triwulan</w:t>
+              <w:t>_proper</w:t>
             </w:r>
             <w:r>
               <w:rPr>
                 <w:rFonts w:ascii="Arial" w:hAnsi="Arial" w:cs="Arial"/>
                 <w:color w:val="000000"/>
               </w:rPr>
-              <w:t>_proper</w:t>
-            </w:r>
-            <w:proofErr w:type="spellEnd"/>
+              <w:t>}</w:t>
+            </w:r>
             <w:r>
               <w:rPr>
                 <w:rFonts w:ascii="Arial" w:hAnsi="Arial" w:cs="Arial"/>
                 <w:color w:val="000000"/>
               </w:rPr>
-              <w:t>}</w:t>
+              <w:t xml:space="preserve"> Tahun </w:t>
             </w:r>
             <w:r>
               <w:rPr>
                 <w:rFonts w:ascii="Arial" w:hAnsi="Arial" w:cs="Arial"/>
                 <w:color w:val="000000"/>
               </w:rPr>
-              <w:t xml:space="preserve"> </w:t>
-            </w:r>
-            <w:proofErr w:type="spellStart"/>
-            <w:r>
-              <w:rPr>
-                <w:rFonts w:ascii="Arial" w:hAnsi="Arial" w:cs="Arial"/>
-                <w:color w:val="000000"/>
-              </w:rPr>
-              <w:t>Tahun</w:t>
-            </w:r>
-            <w:proofErr w:type="spellEnd"/>
-            <w:r>
-              <w:rPr>
-                <w:rFonts w:ascii="Arial" w:hAnsi="Arial" w:cs="Arial"/>
-                <w:color w:val="000000"/>
-              </w:rPr>
-              <w:t xml:space="preserve"> </w:t>
-            </w:r>
-            <w:r>
-              <w:rPr>
-                <w:rFonts w:ascii="Arial" w:hAnsi="Arial" w:cs="Arial"/>
-                <w:color w:val="000000"/>
-              </w:rPr>
-              <w:t>${</w:t>
-            </w:r>
-            <w:proofErr w:type="spellStart"/>
-            <w:r>
-              <w:rPr>
-                <w:rFonts w:ascii="Arial" w:hAnsi="Arial" w:cs="Arial"/>
-                <w:color w:val="000000"/>
-              </w:rPr>
-              <w:t>tahun</w:t>
-            </w:r>
-            <w:proofErr w:type="spellEnd"/>
-            <w:r>
-              <w:rPr>
-                <w:rFonts w:ascii="Arial" w:hAnsi="Arial" w:cs="Arial"/>
-                <w:color w:val="000000"/>
-              </w:rPr>
-              <w:t>}</w:t>
+              <w:t>${tahun}</w:t>
             </w:r>
           </w:p>
         </w:tc>
@@ -292,33 +241,23 @@
                 <w:b/>
                 <w:bCs/>
               </w:rPr>
-              <w:t>Hari/</w:t>
-            </w:r>
-            <w:proofErr w:type="spellStart"/>
-            <w:r>
+              <w:t>Hari/Tanggal</w:t>
+            </w:r>
+          </w:p>
+        </w:tc>
+        <w:tc>
+          <w:tcPr>
+            <w:tcW w:w="6661" w:type="dxa"/>
+            <w:vAlign w:val="center"/>
+          </w:tcPr>
+          <w:p>
+            <w:pPr>
+              <w:spacing w:line="276" w:lineRule="auto"/>
               <w:rPr>
                 <w:rFonts w:ascii="Times New Roman" w:hAnsi="Times New Roman" w:cs="Times New Roman"/>
                 <w:b/>
                 <w:bCs/>
               </w:rPr>
-              <w:t>Tanggal</w:t>
-            </w:r>
-            <w:proofErr w:type="spellEnd"/>
-          </w:p>
-        </w:tc>
-        <w:tc>
-          <w:tcPr>
-            <w:tcW w:w="6661" w:type="dxa"/>
-            <w:vAlign w:val="center"/>
-          </w:tcPr>
-          <w:p>
-            <w:pPr>
-              <w:spacing w:line="276" w:lineRule="auto"/>
-              <w:rPr>
-                <w:rFonts w:ascii="Times New Roman" w:hAnsi="Times New Roman" w:cs="Times New Roman"/>
-                <w:b/>
-                <w:bCs/>
-              </w:rPr>
             </w:pPr>
             <w:r>
               <w:rPr>
@@ -327,7 +266,6 @@
               </w:rPr>
               <w:t>${</w:t>
             </w:r>
-            <w:proofErr w:type="spellStart"/>
             <w:r>
               <w:rPr>
                 <w:rFonts w:ascii="Arial" w:hAnsi="Arial" w:cs="Arial"/>
@@ -340,15 +278,7 @@
                 <w:rFonts w:ascii="Arial" w:hAnsi="Arial" w:cs="Arial"/>
                 <w:color w:val="000000"/>
               </w:rPr>
-              <w:t>tanggal</w:t>
-            </w:r>
-            <w:proofErr w:type="spellEnd"/>
-            <w:r>
-              <w:rPr>
-                <w:rFonts w:ascii="Arial" w:hAnsi="Arial" w:cs="Arial"/>
-                <w:color w:val="000000"/>
-              </w:rPr>
-              <w:t>}</w:t>
+              <w:t>tanggal}</w:t>
             </w:r>
           </w:p>
         </w:tc>
@@ -400,23 +330,7 @@
                 <w:rFonts w:ascii="Arial" w:hAnsi="Arial" w:cs="Arial"/>
                 <w:color w:val="000000"/>
               </w:rPr>
-              <w:t>${</w:t>
-            </w:r>
-            <w:proofErr w:type="spellStart"/>
-            <w:r>
-              <w:rPr>
-                <w:rFonts w:ascii="Arial" w:hAnsi="Arial" w:cs="Arial"/>
-                <w:color w:val="000000"/>
-              </w:rPr>
-              <w:t>waktu</w:t>
-            </w:r>
-            <w:proofErr w:type="spellEnd"/>
-            <w:r>
-              <w:rPr>
-                <w:rFonts w:ascii="Arial" w:hAnsi="Arial" w:cs="Arial"/>
-                <w:color w:val="000000"/>
-              </w:rPr>
-              <w:t>}</w:t>
+              <w:t>${waktu}</w:t>
             </w:r>
           </w:p>
         </w:tc>
@@ -439,7 +353,6 @@
                 <w:bCs/>
               </w:rPr>
             </w:pPr>
-            <w:proofErr w:type="spellStart"/>
             <w:r>
               <w:rPr>
                 <w:rFonts w:ascii="Times New Roman" w:hAnsi="Times New Roman" w:cs="Times New Roman"/>
@@ -448,7 +361,6 @@
               </w:rPr>
               <w:t>Tempat</w:t>
             </w:r>
-            <w:proofErr w:type="spellEnd"/>
           </w:p>
         </w:tc>
         <w:tc>
@@ -470,23 +382,7 @@
                 <w:rFonts w:ascii="Arial" w:hAnsi="Arial" w:cs="Arial"/>
                 <w:color w:val="000000"/>
               </w:rPr>
-              <w:t>${</w:t>
-            </w:r>
-            <w:proofErr w:type="spellStart"/>
-            <w:r>
-              <w:rPr>
-                <w:rFonts w:ascii="Arial" w:hAnsi="Arial" w:cs="Arial"/>
-                <w:color w:val="000000"/>
-              </w:rPr>
-              <w:t>tempat</w:t>
-            </w:r>
-            <w:proofErr w:type="spellEnd"/>
-            <w:r>
-              <w:rPr>
-                <w:rFonts w:ascii="Arial" w:hAnsi="Arial" w:cs="Arial"/>
-                <w:color w:val="000000"/>
-              </w:rPr>
-              <w:t>}</w:t>
+              <w:t>${tempat}</w:t>
             </w:r>
           </w:p>
         </w:tc>
@@ -509,49 +405,29 @@
                 <w:bCs/>
               </w:rPr>
             </w:pPr>
-            <w:proofErr w:type="spellStart"/>
             <w:r>
               <w:rPr>
                 <w:rFonts w:ascii="Times New Roman" w:hAnsi="Times New Roman" w:cs="Times New Roman"/>
                 <w:b/>
                 <w:bCs/>
               </w:rPr>
-              <w:t>Pimpinan</w:t>
-            </w:r>
-            <w:proofErr w:type="spellEnd"/>
-            <w:r>
+              <w:t>Pimpinan Rapat</w:t>
+            </w:r>
+          </w:p>
+        </w:tc>
+        <w:tc>
+          <w:tcPr>
+            <w:tcW w:w="6661" w:type="dxa"/>
+            <w:vAlign w:val="center"/>
+          </w:tcPr>
+          <w:p>
+            <w:pPr>
+              <w:spacing w:line="276" w:lineRule="auto"/>
               <w:rPr>
                 <w:rFonts w:ascii="Times New Roman" w:hAnsi="Times New Roman" w:cs="Times New Roman"/>
                 <w:b/>
                 <w:bCs/>
               </w:rPr>
-              <w:t xml:space="preserve"> </w:t>
-            </w:r>
-            <w:proofErr w:type="spellStart"/>
-            <w:r>
-              <w:rPr>
-                <w:rFonts w:ascii="Times New Roman" w:hAnsi="Times New Roman" w:cs="Times New Roman"/>
-                <w:b/>
-                <w:bCs/>
-              </w:rPr>
-              <w:t>Rapat</w:t>
-            </w:r>
-            <w:proofErr w:type="spellEnd"/>
-          </w:p>
-        </w:tc>
-        <w:tc>
-          <w:tcPr>
-            <w:tcW w:w="6661" w:type="dxa"/>
-            <w:vAlign w:val="center"/>
-          </w:tcPr>
-          <w:p>
-            <w:pPr>
-              <w:spacing w:line="276" w:lineRule="auto"/>
-              <w:rPr>
-                <w:rFonts w:ascii="Times New Roman" w:hAnsi="Times New Roman" w:cs="Times New Roman"/>
-                <w:b/>
-                <w:bCs/>
-              </w:rPr>
             </w:pPr>
             <w:r>
               <w:rPr>
@@ -567,7 +443,6 @@
               </w:rPr>
               <w:t>{</w:t>
             </w:r>
-            <w:proofErr w:type="spellStart"/>
             <w:r>
               <w:rPr>
                 <w:rFonts w:ascii="Arial" w:hAnsi="Arial" w:cs="Arial"/>
@@ -582,7 +457,6 @@
               </w:rPr>
               <w:t>_rapat</w:t>
             </w:r>
-            <w:proofErr w:type="spellEnd"/>
             <w:r>
               <w:rPr>
                 <w:rFonts w:ascii="Arial" w:hAnsi="Arial" w:cs="Arial"/>
@@ -595,23 +469,7 @@
                 <w:rFonts w:ascii="Arial" w:hAnsi="Arial" w:cs="Arial"/>
                 <w:color w:val="000000"/>
               </w:rPr>
-              <w:t xml:space="preserve"> (${</w:t>
-            </w:r>
-            <w:proofErr w:type="spellStart"/>
-            <w:r>
-              <w:rPr>
-                <w:rFonts w:ascii="Arial" w:hAnsi="Arial" w:cs="Arial"/>
-                <w:color w:val="000000"/>
-              </w:rPr>
-              <w:t>jabatan_pimpinan</w:t>
-            </w:r>
-            <w:proofErr w:type="spellEnd"/>
-            <w:r>
-              <w:rPr>
-                <w:rFonts w:ascii="Arial" w:hAnsi="Arial" w:cs="Arial"/>
-                <w:color w:val="000000"/>
-              </w:rPr>
-              <w:t>})</w:t>
+              <w:t xml:space="preserve"> (${jabatan_pimpinan})</w:t>
             </w:r>
           </w:p>
         </w:tc>
@@ -642,23 +500,21 @@
           <w:bCs/>
         </w:rPr>
       </w:pPr>
-      <w:proofErr w:type="spellStart"/>
       <w:r>
         <w:rPr>
           <w:rFonts w:ascii="Times New Roman" w:hAnsi="Times New Roman" w:cs="Times New Roman"/>
           <w:b/>
           <w:bCs/>
         </w:rPr>
-        <w:t>Capaian</w:t>
+        <w:t xml:space="preserve">Capaian Kinerja </w:t>
       </w:r>
-      <w:proofErr w:type="spellEnd"/>
       <w:r>
         <w:rPr>
           <w:rFonts w:ascii="Times New Roman" w:hAnsi="Times New Roman" w:cs="Times New Roman"/>
           <w:b/>
           <w:bCs/>
         </w:rPr>
-        <w:t xml:space="preserve"> Kinerja </w:t>
+        <w:t>${</w:t>
       </w:r>
       <w:r>
         <w:rPr>
@@ -666,25 +522,23 @@
           <w:b/>
           <w:bCs/>
         </w:rPr>
-        <w:t>${</w:t>
+        <w:t>triwulan_upper</w:t>
       </w:r>
-      <w:proofErr w:type="spellStart"/>
       <w:r>
         <w:rPr>
           <w:rFonts w:ascii="Times New Roman" w:hAnsi="Times New Roman" w:cs="Times New Roman"/>
           <w:b/>
           <w:bCs/>
         </w:rPr>
-        <w:t>triwulan_upper</w:t>
+        <w:t>}</w:t>
       </w:r>
-      <w:proofErr w:type="spellEnd"/>
       <w:r>
         <w:rPr>
           <w:rFonts w:ascii="Times New Roman" w:hAnsi="Times New Roman" w:cs="Times New Roman"/>
           <w:b/>
           <w:bCs/>
         </w:rPr>
-        <w:t>}</w:t>
+        <w:t xml:space="preserve"> Tahun </w:t>
       </w:r>
       <w:r>
         <w:rPr>
@@ -692,51 +546,7 @@
           <w:b/>
           <w:bCs/>
         </w:rPr>
-        <w:t xml:space="preserve"> </w:t>
-      </w:r>
-      <w:proofErr w:type="spellStart"/>
-      <w:r>
-        <w:rPr>
-          <w:rFonts w:ascii="Times New Roman" w:hAnsi="Times New Roman" w:cs="Times New Roman"/>
-          <w:b/>
-          <w:bCs/>
-        </w:rPr>
-        <w:t>Tahun</w:t>
-      </w:r>
-      <w:proofErr w:type="spellEnd"/>
-      <w:r>
-        <w:rPr>
-          <w:rFonts w:ascii="Times New Roman" w:hAnsi="Times New Roman" w:cs="Times New Roman"/>
-          <w:b/>
-          <w:bCs/>
-        </w:rPr>
-        <w:t xml:space="preserve"> </w:t>
-      </w:r>
-      <w:r>
-        <w:rPr>
-          <w:rFonts w:ascii="Times New Roman" w:hAnsi="Times New Roman" w:cs="Times New Roman"/>
-          <w:b/>
-          <w:bCs/>
-        </w:rPr>
-        <w:t>${</w:t>
-      </w:r>
-      <w:proofErr w:type="spellStart"/>
-      <w:r>
-        <w:rPr>
-          <w:rFonts w:ascii="Times New Roman" w:hAnsi="Times New Roman" w:cs="Times New Roman"/>
-          <w:b/>
-          <w:bCs/>
-        </w:rPr>
-        <w:t>tahun</w:t>
-      </w:r>
-      <w:proofErr w:type="spellEnd"/>
-      <w:r>
-        <w:rPr>
-          <w:rFonts w:ascii="Times New Roman" w:hAnsi="Times New Roman" w:cs="Times New Roman"/>
-          <w:b/>
-          <w:bCs/>
-        </w:rPr>
-        <w:t>}</w:t>
+        <w:t>${tahun}</w:t>
       </w:r>
     </w:p>
     <w:p>
@@ -749,19 +559,11 @@
           <w:rFonts w:ascii="Times New Roman" w:hAnsi="Times New Roman" w:cs="Times New Roman"/>
         </w:rPr>
       </w:pPr>
-      <w:proofErr w:type="spellStart"/>
       <w:r>
         <w:rPr>
           <w:rFonts w:ascii="Times New Roman" w:hAnsi="Times New Roman" w:cs="Times New Roman"/>
         </w:rPr>
-        <w:t>Capaian</w:t>
-      </w:r>
-      <w:proofErr w:type="spellEnd"/>
-      <w:r>
-        <w:rPr>
-          <w:rFonts w:ascii="Times New Roman" w:hAnsi="Times New Roman" w:cs="Times New Roman"/>
-        </w:rPr>
-        <w:t xml:space="preserve"> Kinerja IKU </w:t>
+        <w:t xml:space="preserve">Capaian Kinerja IKU </w:t>
       </w:r>
       <w:r>
         <w:rPr>
@@ -769,14 +571,12 @@
         </w:rPr>
         <w:t>${</w:t>
       </w:r>
-      <w:proofErr w:type="spellStart"/>
       <w:r>
         <w:rPr>
           <w:rFonts w:ascii="Times New Roman" w:hAnsi="Times New Roman" w:cs="Times New Roman"/>
         </w:rPr>
-        <w:t>triwulan_upper</w:t>
+        <w:t>triwulan_proper</w:t>
       </w:r>
-      <w:proofErr w:type="spellEnd"/>
       <w:r>
         <w:rPr>
           <w:rFonts w:ascii="Times New Roman" w:hAnsi="Times New Roman" w:cs="Times New Roman"/>
@@ -787,349 +587,57 @@
         <w:rPr>
           <w:rFonts w:ascii="Times New Roman" w:hAnsi="Times New Roman" w:cs="Times New Roman"/>
         </w:rPr>
-        <w:t xml:space="preserve"> </w:t>
-      </w:r>
-      <w:proofErr w:type="spellStart"/>
-      <w:r>
-        <w:rPr>
-          <w:rFonts w:ascii="Times New Roman" w:hAnsi="Times New Roman" w:cs="Times New Roman"/>
-        </w:rPr>
-        <w:t>tahun</w:t>
-      </w:r>
-      <w:proofErr w:type="spellEnd"/>
-      <w:r>
-        <w:rPr>
-          <w:rFonts w:ascii="Times New Roman" w:hAnsi="Times New Roman" w:cs="Times New Roman"/>
-        </w:rPr>
-        <w:t xml:space="preserve"> </w:t>
+        <w:t xml:space="preserve"> tahun </w:t>
       </w:r>
       <w:r>
         <w:rPr>
           <w:rFonts w:ascii="Arial" w:hAnsi="Arial" w:cs="Arial"/>
           <w:color w:val="000000"/>
         </w:rPr>
+        <w:t xml:space="preserve">${tahun} </w:t>
+      </w:r>
+      <w:r>
+        <w:rPr>
+          <w:rFonts w:ascii="Times New Roman" w:hAnsi="Times New Roman" w:cs="Times New Roman"/>
+        </w:rPr>
+        <w:t xml:space="preserve">pada BPS Kabupaten Tapin sebesar 110 persen (terhadap target </w:t>
+      </w:r>
+      <w:r>
+        <w:rPr>
+          <w:rFonts w:ascii="Times New Roman" w:hAnsi="Times New Roman" w:cs="Times New Roman"/>
+        </w:rPr>
         <w:t>${</w:t>
       </w:r>
-      <w:proofErr w:type="spellStart"/>
       <w:r>
         <w:rPr>
-          <w:rFonts w:ascii="Arial" w:hAnsi="Arial" w:cs="Arial"/>
-          <w:color w:val="000000"/>
-        </w:rPr>
-        <w:t>tahun</w:t>
+          <w:rFonts w:ascii="Times New Roman" w:hAnsi="Times New Roman" w:cs="Times New Roman"/>
+        </w:rPr>
+        <w:t>triwulan_proper</w:t>
       </w:r>
-      <w:proofErr w:type="spellEnd"/>
       <w:r>
         <w:rPr>
-          <w:rFonts w:ascii="Arial" w:hAnsi="Arial" w:cs="Arial"/>
-          <w:color w:val="000000"/>
+          <w:rFonts w:ascii="Times New Roman" w:hAnsi="Times New Roman" w:cs="Times New Roman"/>
         </w:rPr>
         <w:t xml:space="preserve">} </w:t>
       </w:r>
       <w:r>
         <w:rPr>
-          <w:rFonts w:ascii="Times New Roman" w:hAnsi="Times New Roman" w:cs="Times New Roman"/>
-        </w:rPr>
-        <w:t xml:space="preserve">pada BPS </w:t>
-      </w:r>
-      <w:proofErr w:type="spellStart"/>
-      <w:r>
-        <w:rPr>
-          <w:rFonts w:ascii="Times New Roman" w:hAnsi="Times New Roman" w:cs="Times New Roman"/>
-        </w:rPr>
-        <w:t>Kabupaten</w:t>
-      </w:r>
-      <w:proofErr w:type="spellEnd"/>
-      <w:r>
-        <w:rPr>
-          <w:rFonts w:ascii="Times New Roman" w:hAnsi="Times New Roman" w:cs="Times New Roman"/>
-        </w:rPr>
-        <w:t xml:space="preserve"> Tapin </w:t>
-      </w:r>
-      <w:proofErr w:type="spellStart"/>
-      <w:r>
-        <w:rPr>
-          <w:rFonts w:ascii="Times New Roman" w:hAnsi="Times New Roman" w:cs="Times New Roman"/>
-        </w:rPr>
-        <w:t>sebesar</w:t>
-      </w:r>
-      <w:proofErr w:type="spellEnd"/>
-      <w:r>
-        <w:rPr>
-          <w:rFonts w:ascii="Times New Roman" w:hAnsi="Times New Roman" w:cs="Times New Roman"/>
-        </w:rPr>
-        <w:t xml:space="preserve"> 110 </w:t>
-      </w:r>
-      <w:proofErr w:type="spellStart"/>
-      <w:r>
-        <w:rPr>
-          <w:rFonts w:ascii="Times New Roman" w:hAnsi="Times New Roman" w:cs="Times New Roman"/>
-        </w:rPr>
-        <w:t>persen</w:t>
-      </w:r>
-      <w:proofErr w:type="spellEnd"/>
-      <w:r>
-        <w:rPr>
-          <w:rFonts w:ascii="Times New Roman" w:hAnsi="Times New Roman" w:cs="Times New Roman"/>
-        </w:rPr>
-        <w:t xml:space="preserve"> (</w:t>
-      </w:r>
-      <w:proofErr w:type="spellStart"/>
-      <w:r>
-        <w:rPr>
-          <w:rFonts w:ascii="Times New Roman" w:hAnsi="Times New Roman" w:cs="Times New Roman"/>
-        </w:rPr>
-        <w:t>terhadap</w:t>
-      </w:r>
-      <w:proofErr w:type="spellEnd"/>
-      <w:r>
-        <w:rPr>
-          <w:rFonts w:ascii="Times New Roman" w:hAnsi="Times New Roman" w:cs="Times New Roman"/>
-        </w:rPr>
-        <w:t xml:space="preserve"> target </w:t>
+          <w:rFonts w:ascii="Arial" w:hAnsi="Arial" w:cs="Arial"/>
+          <w:color w:val="000000"/>
+        </w:rPr>
+        <w:t>${tahun}</w:t>
       </w:r>
       <w:r>
         <w:rPr>
           <w:rFonts w:ascii="Times New Roman" w:hAnsi="Times New Roman" w:cs="Times New Roman"/>
         </w:rPr>
-        <w:t>${</w:t>
-      </w:r>
-      <w:proofErr w:type="spellStart"/>
-      <w:r>
-        <w:rPr>
-          <w:rFonts w:ascii="Times New Roman" w:hAnsi="Times New Roman" w:cs="Times New Roman"/>
-        </w:rPr>
-        <w:t>triwulan_upper</w:t>
-      </w:r>
-      <w:proofErr w:type="spellEnd"/>
-      <w:r>
-        <w:rPr>
-          <w:rFonts w:ascii="Times New Roman" w:hAnsi="Times New Roman" w:cs="Times New Roman"/>
-        </w:rPr>
-        <w:t>}</w:t>
+        <w:t xml:space="preserve">) atau 6,38 persen (terhadap target tahunan). </w:t>
       </w:r>
       <w:r>
         <w:rPr>
           <w:rFonts w:ascii="Times New Roman" w:hAnsi="Times New Roman" w:cs="Times New Roman"/>
         </w:rPr>
-        <w:t xml:space="preserve"> </w:t>
-      </w:r>
-      <w:r>
-        <w:rPr>
-          <w:rFonts w:ascii="Arial" w:hAnsi="Arial" w:cs="Arial"/>
-          <w:color w:val="000000"/>
-        </w:rPr>
-        <w:t>${</w:t>
-      </w:r>
-      <w:proofErr w:type="spellStart"/>
-      <w:r>
-        <w:rPr>
-          <w:rFonts w:ascii="Arial" w:hAnsi="Arial" w:cs="Arial"/>
-          <w:color w:val="000000"/>
-        </w:rPr>
-        <w:t>tahun</w:t>
-      </w:r>
-      <w:proofErr w:type="spellEnd"/>
-      <w:r>
-        <w:rPr>
-          <w:rFonts w:ascii="Arial" w:hAnsi="Arial" w:cs="Arial"/>
-          <w:color w:val="000000"/>
-        </w:rPr>
-        <w:t>}</w:t>
-      </w:r>
-      <w:r>
-        <w:rPr>
-          <w:rFonts w:ascii="Times New Roman" w:hAnsi="Times New Roman" w:cs="Times New Roman"/>
-        </w:rPr>
-        <w:t xml:space="preserve">) </w:t>
-      </w:r>
-      <w:proofErr w:type="spellStart"/>
-      <w:r>
-        <w:rPr>
-          <w:rFonts w:ascii="Times New Roman" w:hAnsi="Times New Roman" w:cs="Times New Roman"/>
-        </w:rPr>
-        <w:t>atau</w:t>
-      </w:r>
-      <w:proofErr w:type="spellEnd"/>
-      <w:r>
-        <w:rPr>
-          <w:rFonts w:ascii="Times New Roman" w:hAnsi="Times New Roman" w:cs="Times New Roman"/>
-        </w:rPr>
-        <w:t xml:space="preserve"> 6,38 </w:t>
-      </w:r>
-      <w:proofErr w:type="spellStart"/>
-      <w:r>
-        <w:rPr>
-          <w:rFonts w:ascii="Times New Roman" w:hAnsi="Times New Roman" w:cs="Times New Roman"/>
-        </w:rPr>
-        <w:t>persen</w:t>
-      </w:r>
-      <w:proofErr w:type="spellEnd"/>
-      <w:r>
-        <w:rPr>
-          <w:rFonts w:ascii="Times New Roman" w:hAnsi="Times New Roman" w:cs="Times New Roman"/>
-        </w:rPr>
-        <w:t xml:space="preserve"> (</w:t>
-      </w:r>
-      <w:proofErr w:type="spellStart"/>
-      <w:r>
-        <w:rPr>
-          <w:rFonts w:ascii="Times New Roman" w:hAnsi="Times New Roman" w:cs="Times New Roman"/>
-        </w:rPr>
-        <w:t>terhadap</w:t>
-      </w:r>
-      <w:proofErr w:type="spellEnd"/>
-      <w:r>
-        <w:rPr>
-          <w:rFonts w:ascii="Times New Roman" w:hAnsi="Times New Roman" w:cs="Times New Roman"/>
-        </w:rPr>
-        <w:t xml:space="preserve"> target </w:t>
-      </w:r>
-      <w:proofErr w:type="spellStart"/>
-      <w:r>
-        <w:rPr>
-          <w:rFonts w:ascii="Times New Roman" w:hAnsi="Times New Roman" w:cs="Times New Roman"/>
-        </w:rPr>
-        <w:t>tahunan</w:t>
-      </w:r>
-      <w:proofErr w:type="spellEnd"/>
-      <w:r>
-        <w:rPr>
-          <w:rFonts w:ascii="Times New Roman" w:hAnsi="Times New Roman" w:cs="Times New Roman"/>
-        </w:rPr>
-        <w:t xml:space="preserve">). </w:t>
-      </w:r>
-      <w:r>
-        <w:rPr>
-          <w:rFonts w:ascii="Times New Roman" w:hAnsi="Times New Roman" w:cs="Times New Roman"/>
-        </w:rPr>
-        <w:t xml:space="preserve">Adapun </w:t>
-      </w:r>
-      <w:proofErr w:type="spellStart"/>
-      <w:r>
-        <w:rPr>
-          <w:rFonts w:ascii="Times New Roman" w:hAnsi="Times New Roman" w:cs="Times New Roman"/>
-        </w:rPr>
-        <w:t>penjelasan</w:t>
-      </w:r>
-      <w:proofErr w:type="spellEnd"/>
-      <w:r>
-        <w:rPr>
-          <w:rFonts w:ascii="Times New Roman" w:hAnsi="Times New Roman" w:cs="Times New Roman"/>
-        </w:rPr>
-        <w:t xml:space="preserve"> detail </w:t>
-      </w:r>
-      <w:proofErr w:type="spellStart"/>
-      <w:r>
-        <w:rPr>
-          <w:rFonts w:ascii="Times New Roman" w:hAnsi="Times New Roman" w:cs="Times New Roman"/>
-        </w:rPr>
-        <w:t>capaian</w:t>
-      </w:r>
-      <w:proofErr w:type="spellEnd"/>
-      <w:r>
-        <w:rPr>
-          <w:rFonts w:ascii="Times New Roman" w:hAnsi="Times New Roman" w:cs="Times New Roman"/>
-        </w:rPr>
-        <w:t xml:space="preserve"> </w:t>
-      </w:r>
-      <w:proofErr w:type="spellStart"/>
-      <w:r>
-        <w:rPr>
-          <w:rFonts w:ascii="Times New Roman" w:hAnsi="Times New Roman" w:cs="Times New Roman"/>
-        </w:rPr>
-        <w:t>untuk</w:t>
-      </w:r>
-      <w:proofErr w:type="spellEnd"/>
-      <w:r>
-        <w:rPr>
-          <w:rFonts w:ascii="Times New Roman" w:hAnsi="Times New Roman" w:cs="Times New Roman"/>
-        </w:rPr>
-        <w:t xml:space="preserve"> </w:t>
-      </w:r>
-      <w:proofErr w:type="spellStart"/>
-      <w:r>
-        <w:rPr>
-          <w:rFonts w:ascii="Times New Roman" w:hAnsi="Times New Roman" w:cs="Times New Roman"/>
-        </w:rPr>
-        <w:t>setiap</w:t>
-      </w:r>
-      <w:proofErr w:type="spellEnd"/>
-      <w:r>
-        <w:rPr>
-          <w:rFonts w:ascii="Times New Roman" w:hAnsi="Times New Roman" w:cs="Times New Roman"/>
-        </w:rPr>
-        <w:t xml:space="preserve"> </w:t>
-      </w:r>
-      <w:proofErr w:type="spellStart"/>
-      <w:r>
-        <w:rPr>
-          <w:rFonts w:ascii="Times New Roman" w:hAnsi="Times New Roman" w:cs="Times New Roman"/>
-        </w:rPr>
-        <w:t>indikator</w:t>
-      </w:r>
-      <w:proofErr w:type="spellEnd"/>
-      <w:r>
-        <w:rPr>
-          <w:rFonts w:ascii="Times New Roman" w:hAnsi="Times New Roman" w:cs="Times New Roman"/>
-        </w:rPr>
-        <w:t xml:space="preserve"> </w:t>
-      </w:r>
-      <w:proofErr w:type="spellStart"/>
-      <w:r>
-        <w:rPr>
-          <w:rFonts w:ascii="Times New Roman" w:hAnsi="Times New Roman" w:cs="Times New Roman"/>
-        </w:rPr>
-        <w:t>kinerja</w:t>
-      </w:r>
-      <w:proofErr w:type="spellEnd"/>
-      <w:r>
-        <w:rPr>
-          <w:rFonts w:ascii="Times New Roman" w:hAnsi="Times New Roman" w:cs="Times New Roman"/>
-        </w:rPr>
-        <w:t xml:space="preserve"> </w:t>
-      </w:r>
-      <w:proofErr w:type="spellStart"/>
-      <w:r>
-        <w:rPr>
-          <w:rFonts w:ascii="Times New Roman" w:hAnsi="Times New Roman" w:cs="Times New Roman"/>
-        </w:rPr>
-        <w:t>disampaikan</w:t>
-      </w:r>
-      <w:proofErr w:type="spellEnd"/>
-      <w:r>
-        <w:rPr>
-          <w:rFonts w:ascii="Times New Roman" w:hAnsi="Times New Roman" w:cs="Times New Roman"/>
-        </w:rPr>
-        <w:t xml:space="preserve"> di </w:t>
-      </w:r>
-      <w:proofErr w:type="spellStart"/>
-      <w:r>
-        <w:rPr>
-          <w:rFonts w:ascii="Times New Roman" w:hAnsi="Times New Roman" w:cs="Times New Roman"/>
-        </w:rPr>
-        <w:t>bawah</w:t>
-      </w:r>
-      <w:proofErr w:type="spellEnd"/>
-      <w:r>
-        <w:rPr>
-          <w:rFonts w:ascii="Times New Roman" w:hAnsi="Times New Roman" w:cs="Times New Roman"/>
-        </w:rPr>
-        <w:t xml:space="preserve"> </w:t>
-      </w:r>
-      <w:proofErr w:type="spellStart"/>
-      <w:r>
-        <w:rPr>
-          <w:rFonts w:ascii="Times New Roman" w:hAnsi="Times New Roman" w:cs="Times New Roman"/>
-        </w:rPr>
-        <w:t>ini</w:t>
-      </w:r>
-      <w:proofErr w:type="spellEnd"/>
-      <w:r>
-        <w:rPr>
-          <w:rFonts w:ascii="Times New Roman" w:hAnsi="Times New Roman" w:cs="Times New Roman"/>
-        </w:rPr>
-        <w:t>.</w:t>
+        <w:t>Adapun penjelasan detail capaian untuk setiap indikator kinerja disampaikan di bawah ini.</w:t>
       </w:r>
     </w:p>
     <w:p>
@@ -1157,21 +665,7 @@
         <w:rPr>
           <w:rFonts w:ascii="Times New Roman" w:hAnsi="Times New Roman" w:cs="Times New Roman"/>
         </w:rPr>
-        <w:t>${</w:t>
-      </w:r>
-      <w:proofErr w:type="spellStart"/>
-      <w:r>
-        <w:rPr>
-          <w:rFonts w:ascii="Times New Roman" w:hAnsi="Times New Roman" w:cs="Times New Roman"/>
-        </w:rPr>
-        <w:t>block_indikator</w:t>
-      </w:r>
-      <w:proofErr w:type="spellEnd"/>
-      <w:r>
-        <w:rPr>
-          <w:rFonts w:ascii="Times New Roman" w:hAnsi="Times New Roman" w:cs="Times New Roman"/>
-        </w:rPr>
-        <w:t>}</w:t>
+        <w:t>${block_indikator}</w:t>
       </w:r>
     </w:p>
     <w:tbl>
@@ -1418,21 +912,7 @@
                 <w:rFonts w:ascii="Times New Roman" w:hAnsi="Times New Roman" w:cs="Times New Roman"/>
                 <w:lang w:val="fi-FI"/>
               </w:rPr>
-              <w:t>${</w:t>
-            </w:r>
-            <w:r>
-              <w:rPr>
-                <w:rFonts w:ascii="Times New Roman" w:hAnsi="Times New Roman" w:cs="Times New Roman"/>
-                <w:lang w:val="fi-FI"/>
-              </w:rPr>
-              <w:t>triwulan_upper</w:t>
-            </w:r>
-            <w:r>
-              <w:rPr>
-                <w:rFonts w:ascii="Times New Roman" w:hAnsi="Times New Roman" w:cs="Times New Roman"/>
-                <w:lang w:val="fi-FI"/>
-              </w:rPr>
-              <w:t>}</w:t>
+              <w:t>${triwulan_proper}</w:t>
             </w:r>
           </w:p>
         </w:tc>
@@ -2211,196 +1691,38 @@
                 <w:rFonts w:ascii="Times New Roman" w:hAnsi="Times New Roman" w:cs="Times New Roman"/>
               </w:rPr>
             </w:pPr>
-            <w:proofErr w:type="spellStart"/>
             <w:r>
               <w:rPr>
                 <w:rFonts w:ascii="Times New Roman" w:hAnsi="Times New Roman" w:cs="Times New Roman"/>
                 <w:b/>
                 <w:bCs/>
               </w:rPr>
-              <w:t>Realisasi</w:t>
-            </w:r>
-            <w:proofErr w:type="spellEnd"/>
+              <w:t xml:space="preserve">Realisasi Volume RO dan Progress Pelaksanaan Kegiatan sampai dengan Triwulan </w:t>
+            </w:r>
+            <w:proofErr w:type="gramStart"/>
             <w:r>
               <w:rPr>
                 <w:rFonts w:ascii="Times New Roman" w:hAnsi="Times New Roman" w:cs="Times New Roman"/>
                 <w:b/>
                 <w:bCs/>
               </w:rPr>
-              <w:t xml:space="preserve"> Volume RO dan Progress </w:t>
-            </w:r>
-            <w:proofErr w:type="spellStart"/>
+              <w:t>Berjalan :</w:t>
+            </w:r>
+            <w:proofErr w:type="gramEnd"/>
             <w:r>
               <w:rPr>
                 <w:rFonts w:ascii="Times New Roman" w:hAnsi="Times New Roman" w:cs="Times New Roman"/>
                 <w:b/>
                 <w:bCs/>
               </w:rPr>
-              <w:t>Pelaksanaan</w:t>
-            </w:r>
-            <w:proofErr w:type="spellEnd"/>
-            <w:r>
-              <w:rPr>
-                <w:rFonts w:ascii="Times New Roman" w:hAnsi="Times New Roman" w:cs="Times New Roman"/>
-                <w:b/>
-                <w:bCs/>
-              </w:rPr>
               <w:t xml:space="preserve"> </w:t>
             </w:r>
-            <w:proofErr w:type="spellStart"/>
-            <w:r>
-              <w:rPr>
-                <w:rFonts w:ascii="Times New Roman" w:hAnsi="Times New Roman" w:cs="Times New Roman"/>
-                <w:b/>
-                <w:bCs/>
-              </w:rPr>
-              <w:t>Kegiatan</w:t>
-            </w:r>
-            <w:proofErr w:type="spellEnd"/>
-            <w:r>
-              <w:rPr>
-                <w:rFonts w:ascii="Times New Roman" w:hAnsi="Times New Roman" w:cs="Times New Roman"/>
-                <w:b/>
-                <w:bCs/>
-              </w:rPr>
-              <w:t xml:space="preserve"> </w:t>
-            </w:r>
-            <w:proofErr w:type="spellStart"/>
-            <w:r>
-              <w:rPr>
-                <w:rFonts w:ascii="Times New Roman" w:hAnsi="Times New Roman" w:cs="Times New Roman"/>
-                <w:b/>
-                <w:bCs/>
-              </w:rPr>
-              <w:t>sampai</w:t>
-            </w:r>
-            <w:proofErr w:type="spellEnd"/>
-            <w:r>
-              <w:rPr>
-                <w:rFonts w:ascii="Times New Roman" w:hAnsi="Times New Roman" w:cs="Times New Roman"/>
-                <w:b/>
-                <w:bCs/>
-              </w:rPr>
-              <w:t xml:space="preserve"> </w:t>
-            </w:r>
-            <w:proofErr w:type="spellStart"/>
-            <w:r>
-              <w:rPr>
-                <w:rFonts w:ascii="Times New Roman" w:hAnsi="Times New Roman" w:cs="Times New Roman"/>
-                <w:b/>
-                <w:bCs/>
-              </w:rPr>
-              <w:t>dengan</w:t>
-            </w:r>
-            <w:proofErr w:type="spellEnd"/>
-            <w:r>
-              <w:rPr>
-                <w:rFonts w:ascii="Times New Roman" w:hAnsi="Times New Roman" w:cs="Times New Roman"/>
-                <w:b/>
-                <w:bCs/>
-              </w:rPr>
-              <w:t xml:space="preserve"> </w:t>
-            </w:r>
-            <w:proofErr w:type="spellStart"/>
-            <w:r>
-              <w:rPr>
-                <w:rFonts w:ascii="Times New Roman" w:hAnsi="Times New Roman" w:cs="Times New Roman"/>
-                <w:b/>
-                <w:bCs/>
-              </w:rPr>
-              <w:t>Triwulan</w:t>
-            </w:r>
-            <w:proofErr w:type="spellEnd"/>
-            <w:r>
-              <w:rPr>
-                <w:rFonts w:ascii="Times New Roman" w:hAnsi="Times New Roman" w:cs="Times New Roman"/>
-                <w:b/>
-                <w:bCs/>
-              </w:rPr>
-              <w:t xml:space="preserve"> </w:t>
-            </w:r>
-            <w:proofErr w:type="spellStart"/>
-            <w:r>
-              <w:rPr>
-                <w:rFonts w:ascii="Times New Roman" w:hAnsi="Times New Roman" w:cs="Times New Roman"/>
-                <w:b/>
-                <w:bCs/>
-              </w:rPr>
-              <w:t>Berjalan</w:t>
-            </w:r>
-            <w:proofErr w:type="spellEnd"/>
-            <w:r>
-              <w:rPr>
-                <w:rFonts w:ascii="Times New Roman" w:hAnsi="Times New Roman" w:cs="Times New Roman"/>
-                <w:b/>
-                <w:bCs/>
-              </w:rPr>
-              <w:t xml:space="preserve"> : </w:t>
-            </w:r>
-            <w:proofErr w:type="spellStart"/>
-            <w:r>
-              <w:rPr>
-                <w:rFonts w:ascii="Times New Roman" w:hAnsi="Times New Roman" w:cs="Times New Roman"/>
-              </w:rPr>
-              <w:t>Realisasi</w:t>
-            </w:r>
-            <w:proofErr w:type="spellEnd"/>
-            <w:r>
-              <w:rPr>
-                <w:rFonts w:ascii="Times New Roman" w:hAnsi="Times New Roman" w:cs="Times New Roman"/>
-              </w:rPr>
-              <w:t xml:space="preserve"> volume RO </w:t>
-            </w:r>
-            <w:proofErr w:type="spellStart"/>
-            <w:r>
-              <w:rPr>
-                <w:rFonts w:ascii="Times New Roman" w:hAnsi="Times New Roman" w:cs="Times New Roman"/>
-              </w:rPr>
-              <w:t>kegiatan</w:t>
-            </w:r>
-            <w:proofErr w:type="spellEnd"/>
-            <w:r>
-              <w:rPr>
-                <w:rFonts w:ascii="Times New Roman" w:hAnsi="Times New Roman" w:cs="Times New Roman"/>
-              </w:rPr>
-              <w:t xml:space="preserve"> </w:t>
-            </w:r>
-            <w:proofErr w:type="spellStart"/>
-            <w:r>
-              <w:rPr>
-                <w:rFonts w:ascii="Times New Roman" w:hAnsi="Times New Roman" w:cs="Times New Roman"/>
-              </w:rPr>
-              <w:t>Statistik</w:t>
-            </w:r>
-            <w:proofErr w:type="spellEnd"/>
-            <w:r>
-              <w:rPr>
-                <w:rFonts w:ascii="Times New Roman" w:hAnsi="Times New Roman" w:cs="Times New Roman"/>
-              </w:rPr>
-              <w:t xml:space="preserve"> </w:t>
-            </w:r>
-            <w:proofErr w:type="spellStart"/>
-            <w:r>
-              <w:rPr>
-                <w:rFonts w:ascii="Times New Roman" w:hAnsi="Times New Roman" w:cs="Times New Roman"/>
-              </w:rPr>
-              <w:t>Kependudukan</w:t>
-            </w:r>
-            <w:proofErr w:type="spellEnd"/>
-            <w:r>
-              <w:rPr>
-                <w:rFonts w:ascii="Times New Roman" w:hAnsi="Times New Roman" w:cs="Times New Roman"/>
-              </w:rPr>
-              <w:t xml:space="preserve"> dan </w:t>
-            </w:r>
-            <w:proofErr w:type="spellStart"/>
-            <w:r>
-              <w:rPr>
-                <w:rFonts w:ascii="Times New Roman" w:hAnsi="Times New Roman" w:cs="Times New Roman"/>
-              </w:rPr>
-              <w:t>Ketenagakerjaan</w:t>
-            </w:r>
-            <w:proofErr w:type="spellEnd"/>
+            <w:r>
+              <w:rPr>
+                <w:rFonts w:ascii="Times New Roman" w:hAnsi="Times New Roman" w:cs="Times New Roman"/>
+              </w:rPr>
+              <w:t>Realisasi volume RO kegiatan Statistik Kependudukan dan Ketenagakerjaan</w:t>
+            </w:r>
           </w:p>
           <w:tbl>
             <w:tblPr>
@@ -2429,19 +1751,11 @@
                       <w:rFonts w:ascii="Times New Roman" w:hAnsi="Times New Roman" w:cs="Times New Roman"/>
                     </w:rPr>
                   </w:pPr>
-                  <w:proofErr w:type="spellStart"/>
                   <w:r>
                     <w:rPr>
                       <w:rFonts w:ascii="Times New Roman" w:hAnsi="Times New Roman" w:cs="Times New Roman"/>
                     </w:rPr>
-                    <w:t>Rincian</w:t>
-                  </w:r>
-                  <w:proofErr w:type="spellEnd"/>
-                  <w:r>
-                    <w:rPr>
-                      <w:rFonts w:ascii="Times New Roman" w:hAnsi="Times New Roman" w:cs="Times New Roman"/>
-                    </w:rPr>
-                    <w:t xml:space="preserve"> Output</w:t>
+                    <w:t>Rincian Output</w:t>
                   </w:r>
                 </w:p>
               </w:tc>
@@ -2460,19 +1774,11 @@
                       <w:rFonts w:ascii="Times New Roman" w:hAnsi="Times New Roman" w:cs="Times New Roman"/>
                     </w:rPr>
                   </w:pPr>
-                  <w:proofErr w:type="spellStart"/>
                   <w:r>
                     <w:rPr>
                       <w:rFonts w:ascii="Times New Roman" w:hAnsi="Times New Roman" w:cs="Times New Roman"/>
                     </w:rPr>
-                    <w:t>Realisasi</w:t>
-                  </w:r>
-                  <w:proofErr w:type="spellEnd"/>
-                  <w:r>
-                    <w:rPr>
-                      <w:rFonts w:ascii="Times New Roman" w:hAnsi="Times New Roman" w:cs="Times New Roman"/>
-                    </w:rPr>
-                    <w:t xml:space="preserve"> Volume RO</w:t>
+                    <w:t>Realisasi Volume RO</w:t>
                   </w:r>
                 </w:p>
               </w:tc>
@@ -2491,47 +1797,11 @@
                       <w:rFonts w:ascii="Times New Roman" w:hAnsi="Times New Roman" w:cs="Times New Roman"/>
                     </w:rPr>
                   </w:pPr>
-                  <w:proofErr w:type="spellStart"/>
                   <w:r>
                     <w:rPr>
                       <w:rFonts w:ascii="Times New Roman" w:hAnsi="Times New Roman" w:cs="Times New Roman"/>
                     </w:rPr>
-                    <w:t>Progres</w:t>
-                  </w:r>
-                  <w:proofErr w:type="spellEnd"/>
-                  <w:r>
-                    <w:rPr>
-                      <w:rFonts w:ascii="Times New Roman" w:hAnsi="Times New Roman" w:cs="Times New Roman"/>
-                    </w:rPr>
-                    <w:t xml:space="preserve"> </w:t>
-                  </w:r>
-                  <w:proofErr w:type="spellStart"/>
-                  <w:r>
-                    <w:rPr>
-                      <w:rFonts w:ascii="Times New Roman" w:hAnsi="Times New Roman" w:cs="Times New Roman"/>
-                    </w:rPr>
-                    <w:t>Pelaksanaan</w:t>
-                  </w:r>
-                  <w:proofErr w:type="spellEnd"/>
-                  <w:r>
-                    <w:rPr>
-                      <w:rFonts w:ascii="Times New Roman" w:hAnsi="Times New Roman" w:cs="Times New Roman"/>
-                    </w:rPr>
-                    <w:t xml:space="preserve"> </w:t>
-                  </w:r>
-                  <w:proofErr w:type="spellStart"/>
-                  <w:r>
-                    <w:rPr>
-                      <w:rFonts w:ascii="Times New Roman" w:hAnsi="Times New Roman" w:cs="Times New Roman"/>
-                    </w:rPr>
-                    <w:t>Kegiatan</w:t>
-                  </w:r>
-                  <w:proofErr w:type="spellEnd"/>
-                  <w:r>
-                    <w:rPr>
-                      <w:rFonts w:ascii="Times New Roman" w:hAnsi="Times New Roman" w:cs="Times New Roman"/>
-                    </w:rPr>
-                    <w:t xml:space="preserve"> (Persen)</w:t>
+                    <w:t>Progres Pelaksanaan Kegiatan (Persen)</w:t>
                   </w:r>
                 </w:p>
               </w:tc>
@@ -2563,14 +1833,12 @@
                     </w:rPr>
                     <w:t>{</w:t>
                   </w:r>
-                  <w:proofErr w:type="spellStart"/>
                   <w:r>
                     <w:rPr>
                       <w:rFonts w:ascii="Times New Roman" w:hAnsi="Times New Roman" w:cs="Times New Roman"/>
                     </w:rPr>
                     <w:t>nama_output</w:t>
                   </w:r>
-                  <w:proofErr w:type="spellEnd"/>
                   <w:r>
                     <w:rPr>
                       <w:rFonts w:ascii="Times New Roman" w:hAnsi="Times New Roman" w:cs="Times New Roman"/>
@@ -2606,14 +1874,12 @@
                     </w:rPr>
                     <w:t>{</w:t>
                   </w:r>
-                  <w:proofErr w:type="spellStart"/>
                   <w:r>
                     <w:rPr>
                       <w:rFonts w:ascii="Times New Roman" w:hAnsi="Times New Roman" w:cs="Times New Roman"/>
                     </w:rPr>
                     <w:t>output_volume</w:t>
                   </w:r>
-                  <w:proofErr w:type="spellEnd"/>
                   <w:r>
                     <w:rPr>
                       <w:rFonts w:ascii="Times New Roman" w:hAnsi="Times New Roman" w:cs="Times New Roman"/>
@@ -2649,14 +1915,12 @@
                     </w:rPr>
                     <w:t>{</w:t>
                   </w:r>
-                  <w:proofErr w:type="spellStart"/>
                   <w:r>
                     <w:rPr>
                       <w:rFonts w:ascii="Times New Roman" w:hAnsi="Times New Roman" w:cs="Times New Roman"/>
                     </w:rPr>
                     <w:t>output_progres</w:t>
                   </w:r>
-                  <w:proofErr w:type="spellEnd"/>
                   <w:r>
                     <w:rPr>
                       <w:rFonts w:ascii="Times New Roman" w:hAnsi="Times New Roman" w:cs="Times New Roman"/>
@@ -3016,59 +2280,8 @@
                 <w:bCs/>
                 <w:lang w:val="en-ID"/>
               </w:rPr>
-              <w:t xml:space="preserve">Dasar </w:t>
-            </w:r>
-            <w:proofErr w:type="spellStart"/>
-            <w:r>
-              <w:rPr>
-                <w:rFonts w:ascii="Times New Roman" w:hAnsi="Times New Roman" w:cs="Times New Roman"/>
-                <w:b/>
-                <w:bCs/>
-                <w:lang w:val="en-ID"/>
-              </w:rPr>
-              <w:t>Hitung</w:t>
-            </w:r>
-            <w:proofErr w:type="spellEnd"/>
-            <w:r>
-              <w:rPr>
-                <w:rFonts w:ascii="Times New Roman" w:hAnsi="Times New Roman" w:cs="Times New Roman"/>
-                <w:b/>
-                <w:bCs/>
-                <w:lang w:val="en-ID"/>
-              </w:rPr>
-              <w:t xml:space="preserve">/Bukti </w:t>
-            </w:r>
-            <w:proofErr w:type="spellStart"/>
-            <w:r>
-              <w:rPr>
-                <w:rFonts w:ascii="Times New Roman" w:hAnsi="Times New Roman" w:cs="Times New Roman"/>
-                <w:b/>
-                <w:bCs/>
-                <w:lang w:val="en-ID"/>
-              </w:rPr>
-              <w:t>Dukung</w:t>
-            </w:r>
-            <w:proofErr w:type="spellEnd"/>
-            <w:r>
-              <w:rPr>
-                <w:rFonts w:ascii="Times New Roman" w:hAnsi="Times New Roman" w:cs="Times New Roman"/>
-                <w:b/>
-                <w:bCs/>
-                <w:lang w:val="en-ID"/>
-              </w:rPr>
-              <w:t>/</w:t>
-            </w:r>
-            <w:proofErr w:type="spellStart"/>
-            <w:r>
-              <w:rPr>
-                <w:rFonts w:ascii="Times New Roman" w:hAnsi="Times New Roman" w:cs="Times New Roman"/>
-                <w:b/>
-                <w:bCs/>
-                <w:lang w:val="en-ID"/>
-              </w:rPr>
-              <w:t>Lainnya</w:t>
-            </w:r>
-            <w:proofErr w:type="spellEnd"/>
+              <w:t>Dasar Hitung/Bukti Dukung/Lainnya</w:t>
+            </w:r>
           </w:p>
         </w:tc>
       </w:tr>
@@ -3094,40 +2307,17 @@
                 <w:rFonts w:ascii="Times New Roman" w:hAnsi="Times New Roman" w:cs="Times New Roman"/>
                 <w:lang w:val="en-ID"/>
               </w:rPr>
-              <w:t xml:space="preserve">Dasar </w:t>
-            </w:r>
-            <w:proofErr w:type="spellStart"/>
+              <w:t xml:space="preserve">Dasar Hitung dan Basis Data Realisasi </w:t>
+            </w:r>
+            <w:proofErr w:type="gramStart"/>
             <w:r>
               <w:rPr>
                 <w:rFonts w:ascii="Times New Roman" w:hAnsi="Times New Roman" w:cs="Times New Roman"/>
                 <w:lang w:val="en-ID"/>
               </w:rPr>
-              <w:t>Hitung</w:t>
-            </w:r>
-            <w:proofErr w:type="spellEnd"/>
-            <w:r>
-              <w:rPr>
-                <w:rFonts w:ascii="Times New Roman" w:hAnsi="Times New Roman" w:cs="Times New Roman"/>
-                <w:lang w:val="en-ID"/>
-              </w:rPr>
-              <w:t xml:space="preserve"> dan Basis Data </w:t>
-            </w:r>
-            <w:proofErr w:type="spellStart"/>
-            <w:r>
-              <w:rPr>
-                <w:rFonts w:ascii="Times New Roman" w:hAnsi="Times New Roman" w:cs="Times New Roman"/>
-                <w:lang w:val="en-ID"/>
-              </w:rPr>
-              <w:t>Realisasi</w:t>
-            </w:r>
-            <w:proofErr w:type="spellEnd"/>
-            <w:r>
-              <w:rPr>
-                <w:rFonts w:ascii="Times New Roman" w:hAnsi="Times New Roman" w:cs="Times New Roman"/>
-                <w:lang w:val="en-ID"/>
-              </w:rPr>
-              <w:t xml:space="preserve"> IKU :</w:t>
-            </w:r>
+              <w:t>IKU :</w:t>
+            </w:r>
+            <w:proofErr w:type="gramEnd"/>
           </w:p>
           <w:p>
             <w:pPr>
@@ -3148,17 +2338,8 @@
                 <w:rFonts w:ascii="Times New Roman" w:hAnsi="Times New Roman" w:cs="Times New Roman"/>
                 <w:lang w:val="en-ID"/>
               </w:rPr>
-              <w:t xml:space="preserve">Dasar </w:t>
-            </w:r>
-            <w:proofErr w:type="spellStart"/>
-            <w:r>
-              <w:rPr>
-                <w:rFonts w:ascii="Times New Roman" w:hAnsi="Times New Roman" w:cs="Times New Roman"/>
-                <w:lang w:val="en-ID"/>
-              </w:rPr>
-              <w:t>Hitung</w:t>
-            </w:r>
-            <w:proofErr w:type="spellEnd"/>
+              <w:t>Dasar Hitung</w:t>
+            </w:r>
           </w:p>
           <w:p>
             <w:pPr>
@@ -3176,23 +2357,7 @@
                 <w:rFonts w:ascii="Times New Roman" w:hAnsi="Times New Roman" w:cs="Times New Roman"/>
                 <w:lang w:val="en-ID"/>
               </w:rPr>
-              <w:t>${</w:t>
-            </w:r>
-            <w:proofErr w:type="spellStart"/>
-            <w:r>
-              <w:rPr>
-                <w:rFonts w:ascii="Times New Roman" w:hAnsi="Times New Roman" w:cs="Times New Roman"/>
-                <w:lang w:val="en-ID"/>
-              </w:rPr>
-              <w:t>dasar_hitung</w:t>
-            </w:r>
-            <w:proofErr w:type="spellEnd"/>
-            <w:r>
-              <w:rPr>
-                <w:rFonts w:ascii="Times New Roman" w:hAnsi="Times New Roman" w:cs="Times New Roman"/>
-                <w:lang w:val="en-ID"/>
-              </w:rPr>
-              <w:t>}</w:t>
+              <w:t>${dasar_hitung}</w:t>
             </w:r>
           </w:p>
           <w:p>
@@ -3233,23 +2398,7 @@
                 <w:rFonts w:ascii="Times New Roman" w:hAnsi="Times New Roman" w:cs="Times New Roman"/>
                 <w:lang w:val="en-ID"/>
               </w:rPr>
-              <w:t>${</w:t>
-            </w:r>
-            <w:proofErr w:type="spellStart"/>
-            <w:r>
-              <w:rPr>
-                <w:rFonts w:ascii="Times New Roman" w:hAnsi="Times New Roman" w:cs="Times New Roman"/>
-                <w:lang w:val="en-ID"/>
-              </w:rPr>
-              <w:t>basis_data_baseline</w:t>
-            </w:r>
-            <w:proofErr w:type="spellEnd"/>
-            <w:r>
-              <w:rPr>
-                <w:rFonts w:ascii="Times New Roman" w:hAnsi="Times New Roman" w:cs="Times New Roman"/>
-                <w:lang w:val="en-ID"/>
-              </w:rPr>
-              <w:t>}</w:t>
+              <w:t>${basis_data_baseline}</w:t>
             </w:r>
           </w:p>
           <w:p>
@@ -3377,7 +2526,6 @@
               </w:rPr>
               <w:t>{</w:t>
             </w:r>
-            <w:proofErr w:type="spellStart"/>
             <w:r>
               <w:rPr>
                 <w:rFonts w:ascii="Times New Roman" w:hAnsi="Times New Roman" w:cs="Times New Roman"/>
@@ -3390,16 +2538,18 @@
                 <w:rFonts w:ascii="Times New Roman" w:hAnsi="Times New Roman" w:cs="Times New Roman"/>
                 <w:lang w:val="en-ID"/>
               </w:rPr>
-              <w:t>_master_nama_output</w:t>
-            </w:r>
-            <w:proofErr w:type="spellEnd"/>
-            <w:r>
+              <w:t>_master_nama_output}</w:t>
+            </w:r>
+          </w:p>
+          <w:p>
+            <w:pPr>
+              <w:spacing w:line="276" w:lineRule="auto"/>
+              <w:jc w:val="both"/>
               <w:rPr>
                 <w:rFonts w:ascii="Times New Roman" w:hAnsi="Times New Roman" w:cs="Times New Roman"/>
                 <w:lang w:val="en-ID"/>
               </w:rPr>
-              <w:t>}</w:t>
-            </w:r>
+            </w:pPr>
           </w:p>
           <w:p>
             <w:pPr>
@@ -3407,66 +2557,48 @@
               <w:jc w:val="both"/>
               <w:rPr>
                 <w:rFonts w:ascii="Times New Roman" w:hAnsi="Times New Roman" w:cs="Times New Roman"/>
-                <w:lang w:val="en-ID"/>
-              </w:rPr>
-            </w:pPr>
-          </w:p>
-          <w:p>
-            <w:pPr>
-              <w:spacing w:line="276" w:lineRule="auto"/>
-              <w:jc w:val="both"/>
-              <w:rPr>
-                <w:rFonts w:ascii="Times New Roman" w:hAnsi="Times New Roman" w:cs="Times New Roman"/>
-              </w:rPr>
-            </w:pPr>
-            <w:proofErr w:type="spellStart"/>
-            <w:r>
-              <w:rPr>
-                <w:rFonts w:ascii="Times New Roman" w:hAnsi="Times New Roman" w:cs="Times New Roman"/>
-              </w:rPr>
-              <w:t>Untuk</w:t>
-            </w:r>
-            <w:proofErr w:type="spellEnd"/>
-            <w:r>
-              <w:rPr>
-                <w:rFonts w:ascii="Times New Roman" w:hAnsi="Times New Roman" w:cs="Times New Roman"/>
-              </w:rPr>
-              <w:t xml:space="preserve"> </w:t>
-            </w:r>
-            <w:proofErr w:type="spellStart"/>
-            <w:r>
-              <w:rPr>
-                <w:rFonts w:ascii="Times New Roman" w:hAnsi="Times New Roman" w:cs="Times New Roman"/>
-              </w:rPr>
-              <w:t>Tahun</w:t>
-            </w:r>
-            <w:proofErr w:type="spellEnd"/>
-            <w:r>
-              <w:rPr>
-                <w:rFonts w:ascii="Times New Roman" w:hAnsi="Times New Roman" w:cs="Times New Roman"/>
-              </w:rPr>
-              <w:t xml:space="preserve"> </w:t>
+              </w:rPr>
+            </w:pPr>
+            <w:r>
+              <w:rPr>
+                <w:rFonts w:ascii="Times New Roman" w:hAnsi="Times New Roman" w:cs="Times New Roman"/>
+              </w:rPr>
+              <w:t xml:space="preserve">Untuk Tahun </w:t>
             </w:r>
             <w:r>
               <w:rPr>
                 <w:rFonts w:ascii="Arial" w:hAnsi="Arial" w:cs="Arial"/>
                 <w:color w:val="000000"/>
               </w:rPr>
-              <w:t>${</w:t>
-            </w:r>
-            <w:proofErr w:type="spellStart"/>
-            <w:r>
-              <w:rPr>
-                <w:rFonts w:ascii="Arial" w:hAnsi="Arial" w:cs="Arial"/>
-                <w:color w:val="000000"/>
-              </w:rPr>
-              <w:t>tahun</w:t>
-            </w:r>
-            <w:proofErr w:type="spellEnd"/>
-            <w:r>
-              <w:rPr>
-                <w:rFonts w:ascii="Arial" w:hAnsi="Arial" w:cs="Arial"/>
-                <w:color w:val="000000"/>
+              <w:t>${tahun}</w:t>
+            </w:r>
+            <w:r>
+              <w:rPr>
+                <w:rFonts w:ascii="Times New Roman" w:hAnsi="Times New Roman" w:cs="Times New Roman"/>
+              </w:rPr>
+              <w:t xml:space="preserve">, dengan adanya target sebanyak </w:t>
+            </w:r>
+            <w:r>
+              <w:rPr>
+                <w:rFonts w:ascii="Times New Roman" w:hAnsi="Times New Roman" w:cs="Times New Roman"/>
+              </w:rPr>
+              <w:t>$</w:t>
+            </w:r>
+            <w:r>
+              <w:rPr>
+                <w:rFonts w:ascii="Times New Roman" w:hAnsi="Times New Roman" w:cs="Times New Roman"/>
+              </w:rPr>
+              <w:t>{</w:t>
+            </w:r>
+            <w:r>
+              <w:rPr>
+                <w:rFonts w:ascii="Times New Roman" w:hAnsi="Times New Roman" w:cs="Times New Roman"/>
+              </w:rPr>
+              <w:t>x</w:t>
+            </w:r>
+            <w:r>
+              <w:rPr>
+                <w:rFonts w:ascii="Times New Roman" w:hAnsi="Times New Roman" w:cs="Times New Roman"/>
               </w:rPr>
               <w:t>}</w:t>
             </w:r>
@@ -3474,210 +2606,20 @@
               <w:rPr>
                 <w:rFonts w:ascii="Times New Roman" w:hAnsi="Times New Roman" w:cs="Times New Roman"/>
               </w:rPr>
-              <w:t xml:space="preserve">, </w:t>
-            </w:r>
-            <w:proofErr w:type="spellStart"/>
-            <w:r>
-              <w:rPr>
-                <w:rFonts w:ascii="Times New Roman" w:hAnsi="Times New Roman" w:cs="Times New Roman"/>
-              </w:rPr>
-              <w:t>dengan</w:t>
-            </w:r>
-            <w:proofErr w:type="spellEnd"/>
-            <w:r>
-              <w:rPr>
-                <w:rFonts w:ascii="Times New Roman" w:hAnsi="Times New Roman" w:cs="Times New Roman"/>
-              </w:rPr>
               <w:t xml:space="preserve"> </w:t>
             </w:r>
-            <w:proofErr w:type="spellStart"/>
-            <w:r>
-              <w:rPr>
-                <w:rFonts w:ascii="Times New Roman" w:hAnsi="Times New Roman" w:cs="Times New Roman"/>
-              </w:rPr>
-              <w:t>adanya</w:t>
-            </w:r>
-            <w:proofErr w:type="spellEnd"/>
-            <w:r>
-              <w:rPr>
-                <w:rFonts w:ascii="Times New Roman" w:hAnsi="Times New Roman" w:cs="Times New Roman"/>
-              </w:rPr>
-              <w:t xml:space="preserve"> target </w:t>
-            </w:r>
-            <w:proofErr w:type="spellStart"/>
-            <w:r>
-              <w:rPr>
-                <w:rFonts w:ascii="Times New Roman" w:hAnsi="Times New Roman" w:cs="Times New Roman"/>
-              </w:rPr>
-              <w:t>sebanyak</w:t>
-            </w:r>
-            <w:proofErr w:type="spellEnd"/>
-            <w:r>
-              <w:rPr>
-                <w:rFonts w:ascii="Times New Roman" w:hAnsi="Times New Roman" w:cs="Times New Roman"/>
-              </w:rPr>
-              <w:t xml:space="preserve"> </w:t>
-            </w:r>
-            <w:r>
-              <w:rPr>
-                <w:rFonts w:ascii="Times New Roman" w:hAnsi="Times New Roman" w:cs="Times New Roman"/>
-              </w:rPr>
-              <w:t>$</w:t>
-            </w:r>
-            <w:r>
-              <w:rPr>
-                <w:rFonts w:ascii="Times New Roman" w:hAnsi="Times New Roman" w:cs="Times New Roman"/>
-              </w:rPr>
-              <w:t>{</w:t>
-            </w:r>
-            <w:r>
-              <w:rPr>
-                <w:rFonts w:ascii="Times New Roman" w:hAnsi="Times New Roman" w:cs="Times New Roman"/>
-              </w:rPr>
-              <w:t>x</w:t>
-            </w:r>
-            <w:r>
-              <w:rPr>
-                <w:rFonts w:ascii="Times New Roman" w:hAnsi="Times New Roman" w:cs="Times New Roman"/>
-              </w:rPr>
-              <w:t>}</w:t>
-            </w:r>
-            <w:r>
-              <w:rPr>
-                <w:rFonts w:ascii="Times New Roman" w:hAnsi="Times New Roman" w:cs="Times New Roman"/>
-              </w:rPr>
-              <w:t xml:space="preserve"> </w:t>
-            </w:r>
-            <w:proofErr w:type="spellStart"/>
             <w:r>
               <w:rPr>
                 <w:rFonts w:ascii="Times New Roman" w:hAnsi="Times New Roman" w:cs="Times New Roman"/>
                 <w:color w:val="FF0000"/>
               </w:rPr>
-              <w:t>publikasi</w:t>
-            </w:r>
-            <w:proofErr w:type="spellEnd"/>
-            <w:r>
-              <w:rPr>
-                <w:rFonts w:ascii="Times New Roman" w:hAnsi="Times New Roman" w:cs="Times New Roman"/>
-                <w:color w:val="FF0000"/>
-              </w:rPr>
-              <w:t>/</w:t>
-            </w:r>
-            <w:proofErr w:type="spellStart"/>
-            <w:r>
-              <w:rPr>
-                <w:rFonts w:ascii="Times New Roman" w:hAnsi="Times New Roman" w:cs="Times New Roman"/>
-                <w:color w:val="FF0000"/>
-              </w:rPr>
-              <w:t>laporan</w:t>
-            </w:r>
-            <w:proofErr w:type="spellEnd"/>
-            <w:r>
-              <w:rPr>
-                <w:rFonts w:ascii="Times New Roman" w:hAnsi="Times New Roman" w:cs="Times New Roman"/>
-                <w:color w:val="FF0000"/>
-              </w:rPr>
-              <w:t xml:space="preserve"> yang </w:t>
-            </w:r>
-            <w:proofErr w:type="spellStart"/>
-            <w:r>
-              <w:rPr>
-                <w:rFonts w:ascii="Times New Roman" w:hAnsi="Times New Roman" w:cs="Times New Roman"/>
-                <w:color w:val="FF0000"/>
-              </w:rPr>
-              <w:t>berkualitas</w:t>
-            </w:r>
-            <w:proofErr w:type="spellEnd"/>
-            <w:r>
-              <w:rPr>
-                <w:rFonts w:ascii="Times New Roman" w:hAnsi="Times New Roman" w:cs="Times New Roman"/>
-              </w:rPr>
-              <w:t xml:space="preserve">, </w:t>
-            </w:r>
-            <w:proofErr w:type="spellStart"/>
-            <w:r>
-              <w:rPr>
-                <w:rFonts w:ascii="Times New Roman" w:hAnsi="Times New Roman" w:cs="Times New Roman"/>
-              </w:rPr>
-              <w:t>maka</w:t>
-            </w:r>
-            <w:proofErr w:type="spellEnd"/>
-            <w:r>
-              <w:rPr>
-                <w:rFonts w:ascii="Times New Roman" w:hAnsi="Times New Roman" w:cs="Times New Roman"/>
-              </w:rPr>
-              <w:t xml:space="preserve"> </w:t>
-            </w:r>
-            <w:proofErr w:type="spellStart"/>
-            <w:r>
-              <w:rPr>
-                <w:rFonts w:ascii="Times New Roman" w:hAnsi="Times New Roman" w:cs="Times New Roman"/>
-              </w:rPr>
-              <w:t>disusun</w:t>
-            </w:r>
-            <w:proofErr w:type="spellEnd"/>
-            <w:r>
-              <w:rPr>
-                <w:rFonts w:ascii="Times New Roman" w:hAnsi="Times New Roman" w:cs="Times New Roman"/>
-              </w:rPr>
-              <w:t xml:space="preserve"> target per </w:t>
-            </w:r>
-            <w:proofErr w:type="spellStart"/>
-            <w:r>
-              <w:rPr>
-                <w:rFonts w:ascii="Times New Roman" w:hAnsi="Times New Roman" w:cs="Times New Roman"/>
-              </w:rPr>
-              <w:t>triwulan</w:t>
-            </w:r>
-            <w:proofErr w:type="spellEnd"/>
-            <w:r>
-              <w:rPr>
-                <w:rFonts w:ascii="Times New Roman" w:hAnsi="Times New Roman" w:cs="Times New Roman"/>
-              </w:rPr>
-              <w:t xml:space="preserve"> </w:t>
-            </w:r>
-            <w:proofErr w:type="spellStart"/>
-            <w:r>
-              <w:rPr>
-                <w:rFonts w:ascii="Times New Roman" w:hAnsi="Times New Roman" w:cs="Times New Roman"/>
-              </w:rPr>
-              <w:t>adalah</w:t>
-            </w:r>
-            <w:proofErr w:type="spellEnd"/>
-            <w:r>
-              <w:rPr>
-                <w:rFonts w:ascii="Times New Roman" w:hAnsi="Times New Roman" w:cs="Times New Roman"/>
-              </w:rPr>
-              <w:t xml:space="preserve"> </w:t>
-            </w:r>
-            <w:proofErr w:type="spellStart"/>
-            <w:r>
-              <w:rPr>
-                <w:rFonts w:ascii="Times New Roman" w:hAnsi="Times New Roman" w:cs="Times New Roman"/>
-              </w:rPr>
-              <w:t>sebagai</w:t>
-            </w:r>
-            <w:proofErr w:type="spellEnd"/>
-            <w:r>
-              <w:rPr>
-                <w:rFonts w:ascii="Times New Roman" w:hAnsi="Times New Roman" w:cs="Times New Roman"/>
-              </w:rPr>
-              <w:t xml:space="preserve"> </w:t>
-            </w:r>
-            <w:proofErr w:type="spellStart"/>
-            <w:r>
-              <w:rPr>
-                <w:rFonts w:ascii="Times New Roman" w:hAnsi="Times New Roman" w:cs="Times New Roman"/>
-              </w:rPr>
-              <w:t>berikut</w:t>
-            </w:r>
-            <w:proofErr w:type="spellEnd"/>
-            <w:r>
-              <w:rPr>
-                <w:rFonts w:ascii="Times New Roman" w:hAnsi="Times New Roman" w:cs="Times New Roman"/>
-              </w:rPr>
-              <w:t>:</w:t>
+              <w:t>publikasi/laporan yang berkualitas</w:t>
+            </w:r>
+            <w:r>
+              <w:rPr>
+                <w:rFonts w:ascii="Times New Roman" w:hAnsi="Times New Roman" w:cs="Times New Roman"/>
+              </w:rPr>
+              <w:t>, maka disusun target per triwulan adalah sebagai berikut:</w:t>
             </w:r>
           </w:p>
           <w:tbl>
@@ -3707,46 +2649,12 @@
                       <w:lang w:val="en-ID"/>
                     </w:rPr>
                   </w:pPr>
-                  <w:proofErr w:type="spellStart"/>
                   <w:r>
                     <w:rPr>
                       <w:rFonts w:ascii="Times New Roman" w:hAnsi="Times New Roman" w:cs="Times New Roman"/>
                       <w:lang w:val="en-ID"/>
                     </w:rPr>
                     <w:t>Keterangan</w:t>
-                  </w:r>
-                  <w:proofErr w:type="spellEnd"/>
-                </w:p>
-              </w:tc>
-              <w:tc>
-                <w:tcPr>
-                  <w:tcW w:w="1602" w:type="dxa"/>
-                  <w:vAlign w:val="center"/>
-                </w:tcPr>
-                <w:p>
-                  <w:pPr>
-                    <w:spacing w:line="276" w:lineRule="auto"/>
-                    <w:jc w:val="center"/>
-                    <w:rPr>
-                      <w:rFonts w:ascii="Times New Roman" w:hAnsi="Times New Roman" w:cs="Times New Roman"/>
-                      <w:lang w:val="en-ID"/>
-                    </w:rPr>
-                  </w:pPr>
-                  <w:proofErr w:type="spellStart"/>
-                  <w:r>
-                    <w:rPr>
-                      <w:rFonts w:ascii="Times New Roman" w:hAnsi="Times New Roman" w:cs="Times New Roman"/>
-                      <w:lang w:val="en-ID"/>
-                    </w:rPr>
-                    <w:t>Triwulan</w:t>
-                  </w:r>
-                  <w:proofErr w:type="spellEnd"/>
-                  <w:r>
-                    <w:rPr>
-                      <w:rFonts w:ascii="Times New Roman" w:hAnsi="Times New Roman" w:cs="Times New Roman"/>
-                      <w:lang w:val="en-ID"/>
-                    </w:rPr>
-                    <w:t xml:space="preserve"> I</w:t>
                   </w:r>
                 </w:p>
               </w:tc>
@@ -3764,21 +2672,12 @@
                       <w:lang w:val="en-ID"/>
                     </w:rPr>
                   </w:pPr>
-                  <w:proofErr w:type="spellStart"/>
                   <w:r>
                     <w:rPr>
                       <w:rFonts w:ascii="Times New Roman" w:hAnsi="Times New Roman" w:cs="Times New Roman"/>
                       <w:lang w:val="en-ID"/>
                     </w:rPr>
-                    <w:t>Triwulan</w:t>
-                  </w:r>
-                  <w:proofErr w:type="spellEnd"/>
-                  <w:r>
-                    <w:rPr>
-                      <w:rFonts w:ascii="Times New Roman" w:hAnsi="Times New Roman" w:cs="Times New Roman"/>
-                      <w:lang w:val="en-ID"/>
-                    </w:rPr>
-                    <w:t xml:space="preserve"> II</w:t>
+                    <w:t>Triwulan I</w:t>
                   </w:r>
                 </w:p>
               </w:tc>
@@ -3796,21 +2695,35 @@
                       <w:lang w:val="en-ID"/>
                     </w:rPr>
                   </w:pPr>
-                  <w:proofErr w:type="spellStart"/>
                   <w:r>
                     <w:rPr>
                       <w:rFonts w:ascii="Times New Roman" w:hAnsi="Times New Roman" w:cs="Times New Roman"/>
                       <w:lang w:val="en-ID"/>
                     </w:rPr>
-                    <w:t>Triwulan</w:t>
+                    <w:t>Triwulan II</w:t>
                   </w:r>
-                  <w:proofErr w:type="spellEnd"/>
+                </w:p>
+              </w:tc>
+              <w:tc>
+                <w:tcPr>
+                  <w:tcW w:w="1602" w:type="dxa"/>
+                  <w:vAlign w:val="center"/>
+                </w:tcPr>
+                <w:p>
+                  <w:pPr>
+                    <w:spacing w:line="276" w:lineRule="auto"/>
+                    <w:jc w:val="center"/>
+                    <w:rPr>
+                      <w:rFonts w:ascii="Times New Roman" w:hAnsi="Times New Roman" w:cs="Times New Roman"/>
+                      <w:lang w:val="en-ID"/>
+                    </w:rPr>
+                  </w:pPr>
                   <w:r>
                     <w:rPr>
                       <w:rFonts w:ascii="Times New Roman" w:hAnsi="Times New Roman" w:cs="Times New Roman"/>
                       <w:lang w:val="en-ID"/>
                     </w:rPr>
-                    <w:t xml:space="preserve"> III</w:t>
+                    <w:t>Triwulan III</w:t>
                   </w:r>
                 </w:p>
               </w:tc>
@@ -3828,21 +2741,12 @@
                       <w:lang w:val="en-ID"/>
                     </w:rPr>
                   </w:pPr>
-                  <w:proofErr w:type="spellStart"/>
                   <w:r>
                     <w:rPr>
                       <w:rFonts w:ascii="Times New Roman" w:hAnsi="Times New Roman" w:cs="Times New Roman"/>
                       <w:lang w:val="en-ID"/>
                     </w:rPr>
-                    <w:t>Triwulan</w:t>
-                  </w:r>
-                  <w:proofErr w:type="spellEnd"/>
-                  <w:r>
-                    <w:rPr>
-                      <w:rFonts w:ascii="Times New Roman" w:hAnsi="Times New Roman" w:cs="Times New Roman"/>
-                      <w:lang w:val="en-ID"/>
-                    </w:rPr>
-                    <w:t xml:space="preserve"> IV</w:t>
+                    <w:t>Triwulan IV</w:t>
                   </w:r>
                 </w:p>
               </w:tc>
@@ -3873,23 +2777,7 @@
                       <w:rFonts w:ascii="Times New Roman" w:hAnsi="Times New Roman" w:cs="Times New Roman"/>
                       <w:lang w:val="en-ID"/>
                     </w:rPr>
-                    <w:t>{</w:t>
-                  </w:r>
-                  <w:proofErr w:type="spellStart"/>
-                  <w:r>
-                    <w:rPr>
-                      <w:rFonts w:ascii="Times New Roman" w:hAnsi="Times New Roman" w:cs="Times New Roman"/>
-                      <w:lang w:val="en-ID"/>
-                    </w:rPr>
-                    <w:t>definisi_x</w:t>
-                  </w:r>
-                  <w:proofErr w:type="spellEnd"/>
-                  <w:r>
-                    <w:rPr>
-                      <w:rFonts w:ascii="Times New Roman" w:hAnsi="Times New Roman" w:cs="Times New Roman"/>
-                      <w:lang w:val="en-ID"/>
-                    </w:rPr>
-                    <w:t>}</w:t>
+                    <w:t>{definisi_x}</w:t>
                   </w:r>
                 </w:p>
               </w:tc>
@@ -4012,23 +2900,7 @@
                       <w:rFonts w:ascii="Times New Roman" w:hAnsi="Times New Roman" w:cs="Times New Roman"/>
                       <w:lang w:val="en-ID"/>
                     </w:rPr>
-                    <w:t>{</w:t>
-                  </w:r>
-                  <w:proofErr w:type="spellStart"/>
-                  <w:r>
-                    <w:rPr>
-                      <w:rFonts w:ascii="Times New Roman" w:hAnsi="Times New Roman" w:cs="Times New Roman"/>
-                      <w:lang w:val="en-ID"/>
-                    </w:rPr>
-                    <w:t>definisi_y</w:t>
-                  </w:r>
-                  <w:proofErr w:type="spellEnd"/>
-                  <w:r>
-                    <w:rPr>
-                      <w:rFonts w:ascii="Times New Roman" w:hAnsi="Times New Roman" w:cs="Times New Roman"/>
-                      <w:lang w:val="en-ID"/>
-                    </w:rPr>
-                    <w:t>}</w:t>
+                    <w:t>{definisi_y}</w:t>
                   </w:r>
                 </w:p>
               </w:tc>
@@ -4162,31 +3034,7 @@
                 <w:b/>
                 <w:bCs/>
               </w:rPr>
-              <w:t>${</w:t>
-            </w:r>
-            <w:proofErr w:type="spellStart"/>
-            <w:r>
-              <w:rPr>
-                <w:rFonts w:ascii="Times New Roman" w:hAnsi="Times New Roman" w:cs="Times New Roman"/>
-                <w:b/>
-                <w:bCs/>
-              </w:rPr>
-              <w:t>triwulan_upper</w:t>
-            </w:r>
-            <w:proofErr w:type="spellEnd"/>
-            <w:r>
-              <w:rPr>
-                <w:rFonts w:ascii="Times New Roman" w:hAnsi="Times New Roman" w:cs="Times New Roman"/>
-                <w:b/>
-                <w:bCs/>
-              </w:rPr>
-              <w:t>}</w:t>
-            </w:r>
-            <w:r>
-              <w:rPr>
-                <w:rFonts w:ascii="Times New Roman" w:hAnsi="Times New Roman" w:cs="Times New Roman"/>
-              </w:rPr>
-              <w:t xml:space="preserve"> </w:t>
+              <w:t xml:space="preserve">${triwulan_proper} </w:t>
             </w:r>
             <w:r>
               <w:rPr>
@@ -4195,9 +3043,48 @@
                 <w:bCs/>
                 <w:color w:val="000000"/>
               </w:rPr>
-              <w:t>${</w:t>
-            </w:r>
-            <w:proofErr w:type="spellStart"/>
+              <w:t>${tahun}</w:t>
+            </w:r>
+          </w:p>
+          <w:p>
+            <w:pPr>
+              <w:spacing w:line="276" w:lineRule="auto"/>
+              <w:jc w:val="both"/>
+              <w:rPr>
+                <w:rFonts w:ascii="Times New Roman" w:hAnsi="Times New Roman" w:cs="Times New Roman"/>
+                <w:lang w:val="en-ID"/>
+              </w:rPr>
+            </w:pPr>
+          </w:p>
+          <w:p>
+            <w:pPr>
+              <w:spacing w:line="276" w:lineRule="auto"/>
+              <w:jc w:val="both"/>
+              <w:rPr>
+                <w:rFonts w:ascii="Times New Roman" w:hAnsi="Times New Roman" w:cs="Times New Roman"/>
+                <w:b/>
+                <w:bCs/>
+                <w:lang w:val="en-ID"/>
+              </w:rPr>
+            </w:pPr>
+            <w:r>
+              <w:rPr>
+                <w:rFonts w:ascii="Times New Roman" w:hAnsi="Times New Roman" w:cs="Times New Roman"/>
+                <w:b/>
+                <w:bCs/>
+                <w:lang w:val="en-ID"/>
+              </w:rPr>
+              <w:t xml:space="preserve">Realisasi </w:t>
+            </w:r>
+            <w:r>
+              <w:rPr>
+                <w:rFonts w:ascii="Times New Roman" w:hAnsi="Times New Roman" w:cs="Times New Roman"/>
+                <w:b/>
+                <w:bCs/>
+                <w:lang w:val="en-ID"/>
+              </w:rPr>
+              <w:t xml:space="preserve">${triwulan_proper} </w:t>
+            </w:r>
             <w:r>
               <w:rPr>
                 <w:rFonts w:ascii="Arial" w:hAnsi="Arial" w:cs="Arial"/>
@@ -4205,18 +3092,18 @@
                 <w:bCs/>
                 <w:color w:val="000000"/>
               </w:rPr>
-              <w:t>tahun</w:t>
-            </w:r>
-            <w:proofErr w:type="spellEnd"/>
-            <w:r>
-              <w:rPr>
-                <w:rFonts w:ascii="Arial" w:hAnsi="Arial" w:cs="Arial"/>
-                <w:b/>
-                <w:bCs/>
-                <w:color w:val="000000"/>
-              </w:rPr>
-              <w:t>}</w:t>
-            </w:r>
+              <w:t>${tahun}</w:t>
+            </w:r>
+          </w:p>
+          <w:p>
+            <w:pPr>
+              <w:spacing w:line="276" w:lineRule="auto"/>
+              <w:jc w:val="both"/>
+              <w:rPr>
+                <w:rFonts w:ascii="Times New Roman" w:hAnsi="Times New Roman" w:cs="Times New Roman"/>
+                <w:lang w:val="en-ID"/>
+              </w:rPr>
+            </w:pPr>
           </w:p>
           <w:p>
             <w:pPr>
@@ -4239,7 +3126,6 @@
                 <w:lang w:val="en-ID"/>
               </w:rPr>
             </w:pPr>
-            <w:proofErr w:type="spellStart"/>
             <w:r>
               <w:rPr>
                 <w:rFonts w:ascii="Times New Roman" w:hAnsi="Times New Roman" w:cs="Times New Roman"/>
@@ -4247,361 +3133,116 @@
                 <w:bCs/>
                 <w:lang w:val="en-ID"/>
               </w:rPr>
-              <w:t>Realisasi</w:t>
-            </w:r>
-            <w:proofErr w:type="spellEnd"/>
-            <w:r>
+              <w:t>Argumen Logis</w:t>
+            </w:r>
+          </w:p>
+          <w:p>
+            <w:pPr>
+              <w:spacing w:line="276" w:lineRule="auto"/>
+              <w:jc w:val="both"/>
+              <w:rPr>
+                <w:rFonts w:ascii="Times New Roman" w:hAnsi="Times New Roman" w:cs="Times New Roman"/>
+                <w:lang w:val="en-ID"/>
+              </w:rPr>
+            </w:pPr>
+          </w:p>
+          <w:p>
+            <w:pPr>
+              <w:spacing w:line="276" w:lineRule="auto"/>
+              <w:jc w:val="both"/>
+              <w:rPr>
+                <w:rFonts w:ascii="Times New Roman" w:hAnsi="Times New Roman" w:cs="Times New Roman"/>
+                <w:lang w:val="en-ID"/>
+              </w:rPr>
+            </w:pPr>
+          </w:p>
+          <w:p>
+            <w:pPr>
+              <w:spacing w:line="276" w:lineRule="auto"/>
+              <w:jc w:val="both"/>
+              <w:rPr>
+                <w:rFonts w:ascii="Times New Roman" w:hAnsi="Times New Roman" w:cs="Times New Roman"/>
+                <w:lang w:val="en-ID"/>
+              </w:rPr>
+            </w:pPr>
+          </w:p>
+        </w:tc>
+      </w:tr>
+      <w:tr>
+        <w:tc>
+          <w:tcPr>
+            <w:tcW w:w="8924" w:type="dxa"/>
+            <w:gridSpan w:val="10"/>
+          </w:tcPr>
+          <w:p>
+            <w:pPr>
+              <w:pStyle w:val="ListParagraph"/>
+              <w:spacing w:line="276" w:lineRule="auto"/>
+              <w:ind w:left="0"/>
+              <w:jc w:val="both"/>
               <w:rPr>
                 <w:rFonts w:ascii="Times New Roman" w:hAnsi="Times New Roman" w:cs="Times New Roman"/>
                 <w:b/>
                 <w:bCs/>
-                <w:lang w:val="en-ID"/>
-              </w:rPr>
-              <w:t xml:space="preserve"> </w:t>
-            </w:r>
+                <w:lang w:val="fi-FI"/>
+              </w:rPr>
+            </w:pPr>
             <w:r>
               <w:rPr>
                 <w:rFonts w:ascii="Times New Roman" w:hAnsi="Times New Roman" w:cs="Times New Roman"/>
                 <w:b/>
                 <w:bCs/>
-                <w:lang w:val="en-ID"/>
-              </w:rPr>
-              <w:t>${</w:t>
-            </w:r>
-            <w:proofErr w:type="spellStart"/>
-            <w:r>
+                <w:lang w:val="fi-FI"/>
+              </w:rPr>
+              <w:t>Tautan Bukti Dukung Realisasi IKU:</w:t>
+            </w:r>
+          </w:p>
+          <w:p>
+            <w:pPr>
+              <w:pStyle w:val="ListParagraph"/>
+              <w:spacing w:line="276" w:lineRule="auto"/>
+              <w:ind w:left="0"/>
+              <w:jc w:val="both"/>
+              <w:rPr>
+                <w:rFonts w:ascii="Times New Roman" w:hAnsi="Times New Roman" w:cs="Times New Roman"/>
+                <w:lang w:val="fi-FI"/>
+              </w:rPr>
+            </w:pPr>
+            <w:r>
+              <w:rPr>
+                <w:rFonts w:ascii="Times New Roman" w:hAnsi="Times New Roman" w:cs="Times New Roman"/>
+                <w:lang w:val="fi-FI"/>
+              </w:rPr>
+              <w:t>${link_bukti_kinerja}</w:t>
+            </w:r>
+          </w:p>
+        </w:tc>
+      </w:tr>
+      <w:tr>
+        <w:tc>
+          <w:tcPr>
+            <w:tcW w:w="8924" w:type="dxa"/>
+            <w:gridSpan w:val="10"/>
+          </w:tcPr>
+          <w:p>
+            <w:pPr>
+              <w:pStyle w:val="ListParagraph"/>
+              <w:spacing w:line="276" w:lineRule="auto"/>
+              <w:ind w:left="0"/>
+              <w:jc w:val="both"/>
               <w:rPr>
                 <w:rFonts w:ascii="Times New Roman" w:hAnsi="Times New Roman" w:cs="Times New Roman"/>
                 <w:b/>
                 <w:bCs/>
-                <w:lang w:val="en-ID"/>
-              </w:rPr>
-              <w:t>triwulan_upper</w:t>
-            </w:r>
-            <w:proofErr w:type="spellEnd"/>
+              </w:rPr>
+            </w:pPr>
             <w:r>
               <w:rPr>
                 <w:rFonts w:ascii="Times New Roman" w:hAnsi="Times New Roman" w:cs="Times New Roman"/>
                 <w:b/>
                 <w:bCs/>
-                <w:lang w:val="en-ID"/>
-              </w:rPr>
-              <w:t>}</w:t>
-            </w:r>
-            <w:r>
-              <w:rPr>
-                <w:rFonts w:ascii="Times New Roman" w:hAnsi="Times New Roman" w:cs="Times New Roman"/>
-                <w:lang w:val="en-ID"/>
-              </w:rPr>
-              <w:t xml:space="preserve"> </w:t>
-            </w:r>
-            <w:r>
-              <w:rPr>
-                <w:rFonts w:ascii="Arial" w:hAnsi="Arial" w:cs="Arial"/>
-                <w:b/>
-                <w:bCs/>
-                <w:color w:val="000000"/>
-              </w:rPr>
-              <w:t>${</w:t>
-            </w:r>
-            <w:proofErr w:type="spellStart"/>
-            <w:r>
-              <w:rPr>
-                <w:rFonts w:ascii="Arial" w:hAnsi="Arial" w:cs="Arial"/>
-                <w:b/>
-                <w:bCs/>
-                <w:color w:val="000000"/>
-              </w:rPr>
-              <w:t>tahun</w:t>
-            </w:r>
-            <w:proofErr w:type="spellEnd"/>
-            <w:r>
-              <w:rPr>
-                <w:rFonts w:ascii="Arial" w:hAnsi="Arial" w:cs="Arial"/>
-                <w:b/>
-                <w:bCs/>
-                <w:color w:val="000000"/>
-              </w:rPr>
-              <w:t>}</w:t>
-            </w:r>
-          </w:p>
-          <w:p>
-            <w:pPr>
-              <w:spacing w:line="276" w:lineRule="auto"/>
-              <w:jc w:val="both"/>
-              <w:rPr>
-                <w:rFonts w:ascii="Times New Roman" w:hAnsi="Times New Roman" w:cs="Times New Roman"/>
-                <w:lang w:val="en-ID"/>
-              </w:rPr>
-            </w:pPr>
-          </w:p>
-          <w:p>
-            <w:pPr>
-              <w:spacing w:line="276" w:lineRule="auto"/>
-              <w:jc w:val="both"/>
-              <w:rPr>
-                <w:rFonts w:ascii="Times New Roman" w:hAnsi="Times New Roman" w:cs="Times New Roman"/>
-                <w:lang w:val="en-ID"/>
-              </w:rPr>
-            </w:pPr>
-          </w:p>
-          <w:p>
-            <w:pPr>
-              <w:spacing w:line="276" w:lineRule="auto"/>
-              <w:jc w:val="both"/>
-              <w:rPr>
-                <w:rFonts w:ascii="Times New Roman" w:hAnsi="Times New Roman" w:cs="Times New Roman"/>
-                <w:b/>
-                <w:bCs/>
-                <w:lang w:val="en-ID"/>
-              </w:rPr>
-            </w:pPr>
-            <w:proofErr w:type="spellStart"/>
-            <w:r>
-              <w:rPr>
-                <w:rFonts w:ascii="Times New Roman" w:hAnsi="Times New Roman" w:cs="Times New Roman"/>
-                <w:b/>
-                <w:bCs/>
-                <w:lang w:val="en-ID"/>
-              </w:rPr>
-              <w:t>Argumen</w:t>
-            </w:r>
-            <w:proofErr w:type="spellEnd"/>
-            <w:r>
-              <w:rPr>
-                <w:rFonts w:ascii="Times New Roman" w:hAnsi="Times New Roman" w:cs="Times New Roman"/>
-                <w:b/>
-                <w:bCs/>
-                <w:lang w:val="en-ID"/>
-              </w:rPr>
-              <w:t xml:space="preserve"> Logis</w:t>
-            </w:r>
-          </w:p>
-          <w:p>
-            <w:pPr>
-              <w:spacing w:line="276" w:lineRule="auto"/>
-              <w:jc w:val="both"/>
-              <w:rPr>
-                <w:rFonts w:ascii="Times New Roman" w:hAnsi="Times New Roman" w:cs="Times New Roman"/>
-                <w:lang w:val="en-ID"/>
-              </w:rPr>
-            </w:pPr>
-          </w:p>
-          <w:p>
-            <w:pPr>
-              <w:spacing w:line="276" w:lineRule="auto"/>
-              <w:jc w:val="both"/>
-              <w:rPr>
-                <w:rFonts w:ascii="Times New Roman" w:hAnsi="Times New Roman" w:cs="Times New Roman"/>
-                <w:lang w:val="en-ID"/>
-              </w:rPr>
-            </w:pPr>
-          </w:p>
-          <w:p>
-            <w:pPr>
-              <w:spacing w:line="276" w:lineRule="auto"/>
-              <w:jc w:val="both"/>
-              <w:rPr>
-                <w:rFonts w:ascii="Times New Roman" w:hAnsi="Times New Roman" w:cs="Times New Roman"/>
-                <w:lang w:val="en-ID"/>
-              </w:rPr>
-            </w:pPr>
-          </w:p>
-        </w:tc>
-      </w:tr>
-      <w:tr>
-        <w:tc>
-          <w:tcPr>
-            <w:tcW w:w="8924" w:type="dxa"/>
-            <w:gridSpan w:val="10"/>
-          </w:tcPr>
-          <w:p>
-            <w:pPr>
-              <w:pStyle w:val="ListParagraph"/>
-              <w:spacing w:line="276" w:lineRule="auto"/>
-              <w:ind w:left="0"/>
-              <w:jc w:val="both"/>
-              <w:rPr>
-                <w:rFonts w:ascii="Times New Roman" w:hAnsi="Times New Roman" w:cs="Times New Roman"/>
-                <w:b/>
-                <w:bCs/>
-                <w:lang w:val="fi-FI"/>
-              </w:rPr>
-            </w:pPr>
-            <w:r>
-              <w:rPr>
-                <w:rFonts w:ascii="Times New Roman" w:hAnsi="Times New Roman" w:cs="Times New Roman"/>
-                <w:b/>
-                <w:bCs/>
-                <w:lang w:val="fi-FI"/>
-              </w:rPr>
-              <w:t>Tautan Bukti Dukung Realisasi IKU:</w:t>
-            </w:r>
-          </w:p>
-          <w:p>
-            <w:pPr>
-              <w:pStyle w:val="ListParagraph"/>
-              <w:spacing w:line="276" w:lineRule="auto"/>
-              <w:ind w:left="0"/>
-              <w:jc w:val="both"/>
-              <w:rPr>
-                <w:rFonts w:ascii="Times New Roman" w:hAnsi="Times New Roman" w:cs="Times New Roman"/>
-                <w:lang w:val="fi-FI"/>
-              </w:rPr>
-            </w:pPr>
-            <w:r>
-              <w:rPr>
-                <w:rFonts w:ascii="Times New Roman" w:hAnsi="Times New Roman" w:cs="Times New Roman"/>
-                <w:lang w:val="fi-FI"/>
-              </w:rPr>
-              <w:t>${link_bukti_kinerja}</w:t>
-            </w:r>
-          </w:p>
-        </w:tc>
-      </w:tr>
-      <w:tr>
-        <w:tc>
-          <w:tcPr>
-            <w:tcW w:w="8924" w:type="dxa"/>
-            <w:gridSpan w:val="10"/>
-          </w:tcPr>
-          <w:p>
-            <w:pPr>
-              <w:pStyle w:val="ListParagraph"/>
-              <w:spacing w:line="276" w:lineRule="auto"/>
-              <w:ind w:left="0"/>
-              <w:jc w:val="both"/>
-              <w:rPr>
-                <w:rFonts w:ascii="Times New Roman" w:hAnsi="Times New Roman" w:cs="Times New Roman"/>
-                <w:b/>
-                <w:bCs/>
-              </w:rPr>
-            </w:pPr>
-            <w:proofErr w:type="spellStart"/>
-            <w:r>
-              <w:rPr>
-                <w:rFonts w:ascii="Times New Roman" w:hAnsi="Times New Roman" w:cs="Times New Roman"/>
-                <w:b/>
-                <w:bCs/>
-              </w:rPr>
-              <w:t>Tautan</w:t>
-            </w:r>
-            <w:proofErr w:type="spellEnd"/>
-            <w:r>
-              <w:rPr>
-                <w:rFonts w:ascii="Times New Roman" w:hAnsi="Times New Roman" w:cs="Times New Roman"/>
-                <w:b/>
-                <w:bCs/>
-              </w:rPr>
-              <w:t xml:space="preserve"> Bukti </w:t>
-            </w:r>
-            <w:proofErr w:type="spellStart"/>
-            <w:r>
-              <w:rPr>
-                <w:rFonts w:ascii="Times New Roman" w:hAnsi="Times New Roman" w:cs="Times New Roman"/>
-                <w:b/>
-                <w:bCs/>
-              </w:rPr>
-              <w:t>Dukung</w:t>
-            </w:r>
-            <w:proofErr w:type="spellEnd"/>
-            <w:r>
-              <w:rPr>
-                <w:rFonts w:ascii="Times New Roman" w:hAnsi="Times New Roman" w:cs="Times New Roman"/>
-                <w:b/>
-                <w:bCs/>
-              </w:rPr>
-              <w:t xml:space="preserve"> </w:t>
-            </w:r>
-            <w:proofErr w:type="spellStart"/>
-            <w:r>
-              <w:rPr>
-                <w:rFonts w:ascii="Times New Roman" w:hAnsi="Times New Roman" w:cs="Times New Roman"/>
-                <w:b/>
-                <w:bCs/>
-              </w:rPr>
-              <w:t>Rencana</w:t>
-            </w:r>
-            <w:proofErr w:type="spellEnd"/>
-            <w:r>
-              <w:rPr>
-                <w:rFonts w:ascii="Times New Roman" w:hAnsi="Times New Roman" w:cs="Times New Roman"/>
-                <w:b/>
-                <w:bCs/>
-              </w:rPr>
-              <w:t xml:space="preserve"> </w:t>
-            </w:r>
-            <w:proofErr w:type="spellStart"/>
-            <w:r>
-              <w:rPr>
-                <w:rFonts w:ascii="Times New Roman" w:hAnsi="Times New Roman" w:cs="Times New Roman"/>
-                <w:b/>
-                <w:bCs/>
-              </w:rPr>
-              <w:t>Tindak</w:t>
-            </w:r>
-            <w:proofErr w:type="spellEnd"/>
-            <w:r>
-              <w:rPr>
-                <w:rFonts w:ascii="Times New Roman" w:hAnsi="Times New Roman" w:cs="Times New Roman"/>
-                <w:b/>
-                <w:bCs/>
-              </w:rPr>
-              <w:t xml:space="preserve"> </w:t>
-            </w:r>
-            <w:proofErr w:type="spellStart"/>
-            <w:r>
-              <w:rPr>
-                <w:rFonts w:ascii="Times New Roman" w:hAnsi="Times New Roman" w:cs="Times New Roman"/>
-                <w:b/>
-                <w:bCs/>
-              </w:rPr>
-              <w:t>Lanjut</w:t>
-            </w:r>
-            <w:proofErr w:type="spellEnd"/>
-            <w:r>
-              <w:rPr>
-                <w:rFonts w:ascii="Times New Roman" w:hAnsi="Times New Roman" w:cs="Times New Roman"/>
-                <w:b/>
-                <w:bCs/>
-              </w:rPr>
-              <w:t xml:space="preserve"> </w:t>
-            </w:r>
-            <w:proofErr w:type="spellStart"/>
-            <w:r>
-              <w:rPr>
-                <w:rFonts w:ascii="Times New Roman" w:hAnsi="Times New Roman" w:cs="Times New Roman"/>
-                <w:b/>
-                <w:bCs/>
-              </w:rPr>
-              <w:t>Triwulan</w:t>
-            </w:r>
-            <w:proofErr w:type="spellEnd"/>
-            <w:r>
-              <w:rPr>
-                <w:rFonts w:ascii="Times New Roman" w:hAnsi="Times New Roman" w:cs="Times New Roman"/>
-                <w:b/>
-                <w:bCs/>
-              </w:rPr>
-              <w:t xml:space="preserve"> </w:t>
-            </w:r>
-            <w:proofErr w:type="spellStart"/>
-            <w:r>
-              <w:rPr>
-                <w:rFonts w:ascii="Times New Roman" w:hAnsi="Times New Roman" w:cs="Times New Roman"/>
-                <w:b/>
-                <w:bCs/>
-              </w:rPr>
-              <w:t>Sebelumnya</w:t>
-            </w:r>
-            <w:proofErr w:type="spellEnd"/>
-            <w:r>
-              <w:rPr>
-                <w:rFonts w:ascii="Times New Roman" w:hAnsi="Times New Roman" w:cs="Times New Roman"/>
-                <w:b/>
-                <w:bCs/>
-              </w:rPr>
-              <w:t>:</w:t>
+              </w:rPr>
+              <w:t>Tautan Bukti Dukung Rencana Tindak Lanjut Triwulan Sebelumnya:</w:t>
             </w:r>
           </w:p>
           <w:p>
@@ -4906,87 +3547,7 @@
                 <w:rFonts w:ascii="Times New Roman" w:hAnsi="Times New Roman" w:cs="Times New Roman"/>
                 <w:lang w:val="en-ID"/>
               </w:rPr>
-              <w:t xml:space="preserve">PAGU </w:t>
-            </w:r>
-            <w:proofErr w:type="spellStart"/>
-            <w:r>
-              <w:rPr>
-                <w:rFonts w:ascii="Times New Roman" w:hAnsi="Times New Roman" w:cs="Times New Roman"/>
-                <w:lang w:val="en-ID"/>
-              </w:rPr>
-              <w:t>Revisi</w:t>
-            </w:r>
-            <w:proofErr w:type="spellEnd"/>
-            <w:r>
-              <w:rPr>
-                <w:rFonts w:ascii="Times New Roman" w:hAnsi="Times New Roman" w:cs="Times New Roman"/>
-                <w:lang w:val="en-ID"/>
-              </w:rPr>
-              <w:t xml:space="preserve"> </w:t>
-            </w:r>
-            <w:proofErr w:type="spellStart"/>
-            <w:r>
-              <w:rPr>
-                <w:rFonts w:ascii="Times New Roman" w:hAnsi="Times New Roman" w:cs="Times New Roman"/>
-                <w:lang w:val="en-ID"/>
-              </w:rPr>
-              <w:t>Sampai</w:t>
-            </w:r>
-            <w:proofErr w:type="spellEnd"/>
-            <w:r>
-              <w:rPr>
-                <w:rFonts w:ascii="Times New Roman" w:hAnsi="Times New Roman" w:cs="Times New Roman"/>
-                <w:lang w:val="en-ID"/>
-              </w:rPr>
-              <w:t xml:space="preserve"> </w:t>
-            </w:r>
-            <w:proofErr w:type="spellStart"/>
-            <w:r>
-              <w:rPr>
-                <w:rFonts w:ascii="Times New Roman" w:hAnsi="Times New Roman" w:cs="Times New Roman"/>
-                <w:lang w:val="en-ID"/>
-              </w:rPr>
-              <w:t>dengan</w:t>
-            </w:r>
-            <w:proofErr w:type="spellEnd"/>
-            <w:r>
-              <w:rPr>
-                <w:rFonts w:ascii="Times New Roman" w:hAnsi="Times New Roman" w:cs="Times New Roman"/>
-                <w:lang w:val="en-ID"/>
-              </w:rPr>
-              <w:t xml:space="preserve"> </w:t>
-            </w:r>
-            <w:proofErr w:type="spellStart"/>
-            <w:r>
-              <w:rPr>
-                <w:rFonts w:ascii="Times New Roman" w:hAnsi="Times New Roman" w:cs="Times New Roman"/>
-                <w:lang w:val="en-ID"/>
-              </w:rPr>
-              <w:t>triwulan</w:t>
-            </w:r>
-            <w:proofErr w:type="spellEnd"/>
-            <w:r>
-              <w:rPr>
-                <w:rFonts w:ascii="Times New Roman" w:hAnsi="Times New Roman" w:cs="Times New Roman"/>
-                <w:lang w:val="en-ID"/>
-              </w:rPr>
-              <w:t xml:space="preserve"> </w:t>
-            </w:r>
-            <w:proofErr w:type="spellStart"/>
-            <w:r>
-              <w:rPr>
-                <w:rFonts w:ascii="Times New Roman" w:hAnsi="Times New Roman" w:cs="Times New Roman"/>
-                <w:lang w:val="en-ID"/>
-              </w:rPr>
-              <w:t>berjalan</w:t>
-            </w:r>
-            <w:proofErr w:type="spellEnd"/>
-            <w:r>
-              <w:rPr>
-                <w:rFonts w:ascii="Times New Roman" w:hAnsi="Times New Roman" w:cs="Times New Roman"/>
-                <w:lang w:val="en-ID"/>
-              </w:rPr>
-              <w:t xml:space="preserve"> (Rp)</w:t>
+              <w:t>PAGU Revisi Sampai dengan triwulan berjalan (Rp)</w:t>
             </w:r>
           </w:p>
         </w:tc>
@@ -5004,85 +3565,12 @@
                 <w:lang w:val="en-ID"/>
               </w:rPr>
             </w:pPr>
-            <w:proofErr w:type="spellStart"/>
             <w:r>
               <w:rPr>
                 <w:rFonts w:ascii="Times New Roman" w:hAnsi="Times New Roman" w:cs="Times New Roman"/>
                 <w:lang w:val="en-ID"/>
               </w:rPr>
-              <w:t>Realisasi</w:t>
-            </w:r>
-            <w:proofErr w:type="spellEnd"/>
-            <w:r>
-              <w:rPr>
-                <w:rFonts w:ascii="Times New Roman" w:hAnsi="Times New Roman" w:cs="Times New Roman"/>
-                <w:lang w:val="en-ID"/>
-              </w:rPr>
-              <w:t xml:space="preserve"> </w:t>
-            </w:r>
-            <w:proofErr w:type="spellStart"/>
-            <w:r>
-              <w:rPr>
-                <w:rFonts w:ascii="Times New Roman" w:hAnsi="Times New Roman" w:cs="Times New Roman"/>
-                <w:lang w:val="en-ID"/>
-              </w:rPr>
-              <w:t>sampai</w:t>
-            </w:r>
-            <w:proofErr w:type="spellEnd"/>
-            <w:r>
-              <w:rPr>
-                <w:rFonts w:ascii="Times New Roman" w:hAnsi="Times New Roman" w:cs="Times New Roman"/>
-                <w:lang w:val="en-ID"/>
-              </w:rPr>
-              <w:t xml:space="preserve"> </w:t>
-            </w:r>
-            <w:proofErr w:type="spellStart"/>
-            <w:r>
-              <w:rPr>
-                <w:rFonts w:ascii="Times New Roman" w:hAnsi="Times New Roman" w:cs="Times New Roman"/>
-                <w:lang w:val="en-ID"/>
-              </w:rPr>
-              <w:t>dengan</w:t>
-            </w:r>
-            <w:proofErr w:type="spellEnd"/>
-            <w:r>
-              <w:rPr>
-                <w:rFonts w:ascii="Times New Roman" w:hAnsi="Times New Roman" w:cs="Times New Roman"/>
-                <w:lang w:val="en-ID"/>
-              </w:rPr>
-              <w:t xml:space="preserve"> </w:t>
-            </w:r>
-            <w:proofErr w:type="spellStart"/>
-            <w:r>
-              <w:rPr>
-                <w:rFonts w:ascii="Times New Roman" w:hAnsi="Times New Roman" w:cs="Times New Roman"/>
-                <w:lang w:val="en-ID"/>
-              </w:rPr>
-              <w:t>triwulan</w:t>
-            </w:r>
-            <w:proofErr w:type="spellEnd"/>
-            <w:r>
-              <w:rPr>
-                <w:rFonts w:ascii="Times New Roman" w:hAnsi="Times New Roman" w:cs="Times New Roman"/>
-                <w:lang w:val="en-ID"/>
-              </w:rPr>
-              <w:t xml:space="preserve"> </w:t>
-            </w:r>
-            <w:proofErr w:type="spellStart"/>
-            <w:r>
-              <w:rPr>
-                <w:rFonts w:ascii="Times New Roman" w:hAnsi="Times New Roman" w:cs="Times New Roman"/>
-                <w:lang w:val="en-ID"/>
-              </w:rPr>
-              <w:t>Berjalan</w:t>
-            </w:r>
-            <w:proofErr w:type="spellEnd"/>
-            <w:r>
-              <w:rPr>
-                <w:rFonts w:ascii="Times New Roman" w:hAnsi="Times New Roman" w:cs="Times New Roman"/>
-                <w:lang w:val="en-ID"/>
-              </w:rPr>
-              <w:t xml:space="preserve"> (Rp)</w:t>
+              <w:t>Realisasi sampai dengan triwulan Berjalan (Rp)</w:t>
             </w:r>
           </w:p>
         </w:tc>
@@ -5106,23 +3594,7 @@
                 <w:rFonts w:ascii="Times New Roman" w:hAnsi="Times New Roman" w:cs="Times New Roman"/>
                 <w:lang w:val="en-ID"/>
               </w:rPr>
-              <w:t>${</w:t>
-            </w:r>
-            <w:proofErr w:type="spellStart"/>
-            <w:r>
-              <w:rPr>
-                <w:rFonts w:ascii="Times New Roman" w:hAnsi="Times New Roman" w:cs="Times New Roman"/>
-                <w:lang w:val="en-ID"/>
-              </w:rPr>
-              <w:t>sasaran</w:t>
-            </w:r>
-            <w:proofErr w:type="spellEnd"/>
-            <w:r>
-              <w:rPr>
-                <w:rFonts w:ascii="Times New Roman" w:hAnsi="Times New Roman" w:cs="Times New Roman"/>
-                <w:lang w:val="en-ID"/>
-              </w:rPr>
-              <w:t>}</w:t>
+              <w:t>${sasaran}</w:t>
             </w:r>
           </w:p>
         </w:tc>
@@ -5145,23 +3617,7 @@
                 <w:rFonts w:ascii="Times New Roman" w:hAnsi="Times New Roman" w:cs="Times New Roman"/>
                 <w:lang w:val="en-ID"/>
               </w:rPr>
-              <w:t>${</w:t>
-            </w:r>
-            <w:proofErr w:type="spellStart"/>
-            <w:r>
-              <w:rPr>
-                <w:rFonts w:ascii="Times New Roman" w:hAnsi="Times New Roman" w:cs="Times New Roman"/>
-                <w:lang w:val="en-ID"/>
-              </w:rPr>
-              <w:t>pagu_awal</w:t>
-            </w:r>
-            <w:proofErr w:type="spellEnd"/>
-            <w:r>
-              <w:rPr>
-                <w:rFonts w:ascii="Times New Roman" w:hAnsi="Times New Roman" w:cs="Times New Roman"/>
-                <w:lang w:val="en-ID"/>
-              </w:rPr>
-              <w:t>}</w:t>
+              <w:t>${pagu_awal}</w:t>
             </w:r>
           </w:p>
         </w:tc>
@@ -5184,23 +3640,7 @@
                 <w:rFonts w:ascii="Times New Roman" w:hAnsi="Times New Roman" w:cs="Times New Roman"/>
                 <w:lang w:val="en-ID"/>
               </w:rPr>
-              <w:t>${</w:t>
-            </w:r>
-            <w:proofErr w:type="spellStart"/>
-            <w:r>
-              <w:rPr>
-                <w:rFonts w:ascii="Times New Roman" w:hAnsi="Times New Roman" w:cs="Times New Roman"/>
-                <w:lang w:val="en-ID"/>
-              </w:rPr>
-              <w:t>pagu_revisi</w:t>
-            </w:r>
-            <w:proofErr w:type="spellEnd"/>
-            <w:r>
-              <w:rPr>
-                <w:rFonts w:ascii="Times New Roman" w:hAnsi="Times New Roman" w:cs="Times New Roman"/>
-                <w:lang w:val="en-ID"/>
-              </w:rPr>
-              <w:t>}</w:t>
+              <w:t>${pagu_revisi}</w:t>
             </w:r>
           </w:p>
         </w:tc>
@@ -5223,23 +3663,7 @@
                 <w:rFonts w:ascii="Times New Roman" w:hAnsi="Times New Roman" w:cs="Times New Roman"/>
                 <w:lang w:val="en-ID"/>
               </w:rPr>
-              <w:t>${</w:t>
-            </w:r>
-            <w:proofErr w:type="spellStart"/>
-            <w:r>
-              <w:rPr>
-                <w:rFonts w:ascii="Times New Roman" w:hAnsi="Times New Roman" w:cs="Times New Roman"/>
-                <w:lang w:val="en-ID"/>
-              </w:rPr>
-              <w:t>pagu_realisasi</w:t>
-            </w:r>
-            <w:proofErr w:type="spellEnd"/>
-            <w:r>
-              <w:rPr>
-                <w:rFonts w:ascii="Times New Roman" w:hAnsi="Times New Roman" w:cs="Times New Roman"/>
-                <w:lang w:val="en-ID"/>
-              </w:rPr>
-              <w:t>}</w:t>
+              <w:t>${pagu_realisasi}</w:t>
             </w:r>
           </w:p>
         </w:tc>
@@ -5277,395 +3701,27 @@
           <w:rFonts w:ascii="Times New Roman" w:hAnsi="Times New Roman" w:cs="Times New Roman"/>
         </w:rPr>
         <w:lastRenderedPageBreak/>
-        <w:t xml:space="preserve">Upaya </w:t>
-      </w:r>
-      <w:proofErr w:type="spellStart"/>
-      <w:r>
-        <w:rPr>
-          <w:rFonts w:ascii="Times New Roman" w:hAnsi="Times New Roman" w:cs="Times New Roman"/>
-        </w:rPr>
-        <w:t>efisiensi</w:t>
-      </w:r>
-      <w:proofErr w:type="spellEnd"/>
-      <w:r>
-        <w:rPr>
-          <w:rFonts w:ascii="Times New Roman" w:hAnsi="Times New Roman" w:cs="Times New Roman"/>
-        </w:rPr>
-        <w:t xml:space="preserve"> yang </w:t>
-      </w:r>
-      <w:proofErr w:type="spellStart"/>
-      <w:r>
-        <w:rPr>
-          <w:rFonts w:ascii="Times New Roman" w:hAnsi="Times New Roman" w:cs="Times New Roman"/>
-        </w:rPr>
-        <w:t>dilakukan</w:t>
-      </w:r>
-      <w:proofErr w:type="spellEnd"/>
-      <w:r>
-        <w:rPr>
-          <w:rFonts w:ascii="Times New Roman" w:hAnsi="Times New Roman" w:cs="Times New Roman"/>
-        </w:rPr>
-        <w:t xml:space="preserve"> BPS </w:t>
-      </w:r>
-      <w:proofErr w:type="spellStart"/>
-      <w:r>
-        <w:rPr>
-          <w:rFonts w:ascii="Times New Roman" w:hAnsi="Times New Roman" w:cs="Times New Roman"/>
-        </w:rPr>
-        <w:t>Kabupaten</w:t>
-      </w:r>
-      <w:proofErr w:type="spellEnd"/>
-      <w:r>
-        <w:rPr>
-          <w:rFonts w:ascii="Times New Roman" w:hAnsi="Times New Roman" w:cs="Times New Roman"/>
-        </w:rPr>
-        <w:t xml:space="preserve"> Tapin pada </w:t>
+        <w:t xml:space="preserve">Upaya efisiensi yang dilakukan BPS Kabupaten Tapin pada </w:t>
       </w:r>
       <w:r>
         <w:rPr>
           <w:rFonts w:ascii="Times New Roman" w:hAnsi="Times New Roman" w:cs="Times New Roman"/>
           <w:lang w:val="en-ID"/>
         </w:rPr>
-        <w:t>${</w:t>
-      </w:r>
-      <w:proofErr w:type="spellStart"/>
-      <w:r>
-        <w:rPr>
-          <w:rFonts w:ascii="Times New Roman" w:hAnsi="Times New Roman" w:cs="Times New Roman"/>
-          <w:lang w:val="en-ID"/>
-        </w:rPr>
-        <w:t>triwulan_upper</w:t>
-      </w:r>
-      <w:proofErr w:type="spellEnd"/>
-      <w:r>
-        <w:rPr>
-          <w:rFonts w:ascii="Times New Roman" w:hAnsi="Times New Roman" w:cs="Times New Roman"/>
-          <w:lang w:val="en-ID"/>
-        </w:rPr>
-        <w:t>}</w:t>
+        <w:t xml:space="preserve">${triwulan_proper} </w:t>
       </w:r>
       <w:r>
         <w:rPr>
-          <w:rFonts w:ascii="Times New Roman" w:hAnsi="Times New Roman" w:cs="Times New Roman"/>
-        </w:rPr>
-        <w:t xml:space="preserve"> </w:t>
+          <w:rFonts w:ascii="Arial" w:hAnsi="Arial" w:cs="Arial"/>
+          <w:color w:val="000000"/>
+        </w:rPr>
+        <w:t xml:space="preserve">${tahun} </w:t>
       </w:r>
       <w:r>
         <w:rPr>
-          <w:rFonts w:ascii="Arial" w:hAnsi="Arial" w:cs="Arial"/>
-          <w:color w:val="000000"/>
-        </w:rPr>
-        <w:t>${</w:t>
-      </w:r>
-      <w:proofErr w:type="spellStart"/>
-      <w:r>
-        <w:rPr>
-          <w:rFonts w:ascii="Arial" w:hAnsi="Arial" w:cs="Arial"/>
-          <w:color w:val="000000"/>
-        </w:rPr>
-        <w:t>tahun</w:t>
-      </w:r>
-      <w:proofErr w:type="spellEnd"/>
-      <w:r>
-        <w:rPr>
-          <w:rFonts w:ascii="Arial" w:hAnsi="Arial" w:cs="Arial"/>
-          <w:color w:val="000000"/>
-        </w:rPr>
-        <w:t xml:space="preserve">} </w:t>
-      </w:r>
-      <w:proofErr w:type="spellStart"/>
-      <w:r>
-        <w:rPr>
           <w:rFonts w:ascii="Times New Roman" w:hAnsi="Times New Roman" w:cs="Times New Roman"/>
         </w:rPr>
-        <w:t>sebagai</w:t>
-      </w:r>
-      <w:proofErr w:type="spellEnd"/>
-      <w:r>
-        <w:rPr>
-          <w:rFonts w:ascii="Times New Roman" w:hAnsi="Times New Roman" w:cs="Times New Roman"/>
-        </w:rPr>
-        <w:t xml:space="preserve"> </w:t>
-      </w:r>
-      <w:proofErr w:type="spellStart"/>
-      <w:r>
-        <w:rPr>
-          <w:rFonts w:ascii="Times New Roman" w:hAnsi="Times New Roman" w:cs="Times New Roman"/>
-        </w:rPr>
-        <w:t>upaya</w:t>
-      </w:r>
-      <w:proofErr w:type="spellEnd"/>
-      <w:r>
-        <w:rPr>
-          <w:rFonts w:ascii="Times New Roman" w:hAnsi="Times New Roman" w:cs="Times New Roman"/>
-        </w:rPr>
-        <w:t xml:space="preserve"> </w:t>
-      </w:r>
-      <w:proofErr w:type="spellStart"/>
-      <w:r>
-        <w:rPr>
-          <w:rFonts w:ascii="Times New Roman" w:hAnsi="Times New Roman" w:cs="Times New Roman"/>
-        </w:rPr>
-        <w:t>dalam</w:t>
-      </w:r>
-      <w:proofErr w:type="spellEnd"/>
-      <w:r>
-        <w:rPr>
-          <w:rFonts w:ascii="Times New Roman" w:hAnsi="Times New Roman" w:cs="Times New Roman"/>
-        </w:rPr>
-        <w:t xml:space="preserve"> </w:t>
-      </w:r>
-      <w:proofErr w:type="spellStart"/>
-      <w:r>
-        <w:rPr>
-          <w:rFonts w:ascii="Times New Roman" w:hAnsi="Times New Roman" w:cs="Times New Roman"/>
-        </w:rPr>
-        <w:t>mendukung</w:t>
-      </w:r>
-      <w:proofErr w:type="spellEnd"/>
-      <w:r>
-        <w:rPr>
-          <w:rFonts w:ascii="Times New Roman" w:hAnsi="Times New Roman" w:cs="Times New Roman"/>
-        </w:rPr>
-        <w:t xml:space="preserve"> </w:t>
-      </w:r>
-      <w:proofErr w:type="spellStart"/>
-      <w:r>
-        <w:rPr>
-          <w:rFonts w:ascii="Times New Roman" w:hAnsi="Times New Roman" w:cs="Times New Roman"/>
-        </w:rPr>
-        <w:t>pengelolaan</w:t>
-      </w:r>
-      <w:proofErr w:type="spellEnd"/>
-      <w:r>
-        <w:rPr>
-          <w:rFonts w:ascii="Times New Roman" w:hAnsi="Times New Roman" w:cs="Times New Roman"/>
-        </w:rPr>
-        <w:t xml:space="preserve"> </w:t>
-      </w:r>
-      <w:proofErr w:type="spellStart"/>
-      <w:r>
-        <w:rPr>
-          <w:rFonts w:ascii="Times New Roman" w:hAnsi="Times New Roman" w:cs="Times New Roman"/>
-        </w:rPr>
-        <w:t>efisiensi</w:t>
-      </w:r>
-      <w:proofErr w:type="spellEnd"/>
-      <w:r>
-        <w:rPr>
-          <w:rFonts w:ascii="Times New Roman" w:hAnsi="Times New Roman" w:cs="Times New Roman"/>
-        </w:rPr>
-        <w:t xml:space="preserve"> </w:t>
-      </w:r>
-      <w:proofErr w:type="spellStart"/>
-      <w:r>
-        <w:rPr>
-          <w:rFonts w:ascii="Times New Roman" w:hAnsi="Times New Roman" w:cs="Times New Roman"/>
-        </w:rPr>
-        <w:t>anggaran</w:t>
-      </w:r>
-      <w:proofErr w:type="spellEnd"/>
-      <w:r>
-        <w:rPr>
-          <w:rFonts w:ascii="Times New Roman" w:hAnsi="Times New Roman" w:cs="Times New Roman"/>
-        </w:rPr>
-        <w:t xml:space="preserve"> </w:t>
-      </w:r>
-      <w:proofErr w:type="spellStart"/>
-      <w:r>
-        <w:rPr>
-          <w:rFonts w:ascii="Times New Roman" w:hAnsi="Times New Roman" w:cs="Times New Roman"/>
-        </w:rPr>
-        <w:t>diantaranya</w:t>
-      </w:r>
-      <w:proofErr w:type="spellEnd"/>
-      <w:r>
-        <w:rPr>
-          <w:rFonts w:ascii="Times New Roman" w:hAnsi="Times New Roman" w:cs="Times New Roman"/>
-        </w:rPr>
-        <w:t xml:space="preserve"> </w:t>
-      </w:r>
-      <w:proofErr w:type="spellStart"/>
-      <w:r>
-        <w:rPr>
-          <w:rFonts w:ascii="Times New Roman" w:hAnsi="Times New Roman" w:cs="Times New Roman"/>
-        </w:rPr>
-        <w:t>melakukan</w:t>
-      </w:r>
-      <w:proofErr w:type="spellEnd"/>
-      <w:r>
-        <w:rPr>
-          <w:rFonts w:ascii="Times New Roman" w:hAnsi="Times New Roman" w:cs="Times New Roman"/>
-        </w:rPr>
-        <w:t xml:space="preserve"> </w:t>
-      </w:r>
-      <w:proofErr w:type="spellStart"/>
-      <w:r>
-        <w:rPr>
-          <w:rFonts w:ascii="Times New Roman" w:hAnsi="Times New Roman" w:cs="Times New Roman"/>
-        </w:rPr>
-        <w:t>penghematan</w:t>
-      </w:r>
-      <w:proofErr w:type="spellEnd"/>
-      <w:r>
-        <w:rPr>
-          <w:rFonts w:ascii="Times New Roman" w:hAnsi="Times New Roman" w:cs="Times New Roman"/>
-        </w:rPr>
-        <w:t xml:space="preserve"> </w:t>
-      </w:r>
-      <w:proofErr w:type="spellStart"/>
-      <w:r>
-        <w:rPr>
-          <w:rFonts w:ascii="Times New Roman" w:hAnsi="Times New Roman" w:cs="Times New Roman"/>
-        </w:rPr>
-        <w:t>atas</w:t>
-      </w:r>
-      <w:proofErr w:type="spellEnd"/>
-      <w:r>
-        <w:rPr>
-          <w:rFonts w:ascii="Times New Roman" w:hAnsi="Times New Roman" w:cs="Times New Roman"/>
-        </w:rPr>
-        <w:t xml:space="preserve"> </w:t>
-      </w:r>
-      <w:proofErr w:type="spellStart"/>
-      <w:r>
-        <w:rPr>
-          <w:rFonts w:ascii="Times New Roman" w:hAnsi="Times New Roman" w:cs="Times New Roman"/>
-        </w:rPr>
-        <w:t>penggunaan</w:t>
-      </w:r>
-      <w:proofErr w:type="spellEnd"/>
-      <w:r>
-        <w:rPr>
-          <w:rFonts w:ascii="Times New Roman" w:hAnsi="Times New Roman" w:cs="Times New Roman"/>
-        </w:rPr>
-        <w:t xml:space="preserve"> </w:t>
-      </w:r>
-      <w:proofErr w:type="spellStart"/>
-      <w:r>
-        <w:rPr>
-          <w:rFonts w:ascii="Times New Roman" w:hAnsi="Times New Roman" w:cs="Times New Roman"/>
-        </w:rPr>
-        <w:t>sumber</w:t>
-      </w:r>
-      <w:proofErr w:type="spellEnd"/>
-      <w:r>
-        <w:rPr>
-          <w:rFonts w:ascii="Times New Roman" w:hAnsi="Times New Roman" w:cs="Times New Roman"/>
-        </w:rPr>
-        <w:t xml:space="preserve"> </w:t>
-      </w:r>
-      <w:proofErr w:type="spellStart"/>
-      <w:r>
-        <w:rPr>
-          <w:rFonts w:ascii="Times New Roman" w:hAnsi="Times New Roman" w:cs="Times New Roman"/>
-        </w:rPr>
-        <w:t>daya</w:t>
-      </w:r>
-      <w:proofErr w:type="spellEnd"/>
-      <w:r>
-        <w:rPr>
-          <w:rFonts w:ascii="Times New Roman" w:hAnsi="Times New Roman" w:cs="Times New Roman"/>
-        </w:rPr>
-        <w:t xml:space="preserve"> </w:t>
-      </w:r>
-      <w:proofErr w:type="spellStart"/>
-      <w:r>
-        <w:rPr>
-          <w:rFonts w:ascii="Times New Roman" w:hAnsi="Times New Roman" w:cs="Times New Roman"/>
-        </w:rPr>
-        <w:t>dalam</w:t>
-      </w:r>
-      <w:proofErr w:type="spellEnd"/>
-      <w:r>
-        <w:rPr>
-          <w:rFonts w:ascii="Times New Roman" w:hAnsi="Times New Roman" w:cs="Times New Roman"/>
-        </w:rPr>
-        <w:t xml:space="preserve"> </w:t>
-      </w:r>
-      <w:proofErr w:type="spellStart"/>
-      <w:r>
-        <w:rPr>
-          <w:rFonts w:ascii="Times New Roman" w:hAnsi="Times New Roman" w:cs="Times New Roman"/>
-        </w:rPr>
-        <w:t>kegiatan</w:t>
-      </w:r>
-      <w:proofErr w:type="spellEnd"/>
-      <w:r>
-        <w:rPr>
-          <w:rFonts w:ascii="Times New Roman" w:hAnsi="Times New Roman" w:cs="Times New Roman"/>
-        </w:rPr>
-        <w:t xml:space="preserve"> </w:t>
-      </w:r>
-      <w:proofErr w:type="spellStart"/>
-      <w:r>
-        <w:rPr>
-          <w:rFonts w:ascii="Times New Roman" w:hAnsi="Times New Roman" w:cs="Times New Roman"/>
-        </w:rPr>
-        <w:t>operasional</w:t>
-      </w:r>
-      <w:proofErr w:type="spellEnd"/>
-      <w:r>
-        <w:rPr>
-          <w:rFonts w:ascii="Times New Roman" w:hAnsi="Times New Roman" w:cs="Times New Roman"/>
-        </w:rPr>
-        <w:t xml:space="preserve"> </w:t>
-      </w:r>
-      <w:proofErr w:type="spellStart"/>
-      <w:r>
-        <w:rPr>
-          <w:rFonts w:ascii="Times New Roman" w:hAnsi="Times New Roman" w:cs="Times New Roman"/>
-        </w:rPr>
-        <w:t>kantor</w:t>
-      </w:r>
-      <w:proofErr w:type="spellEnd"/>
-      <w:r>
-        <w:rPr>
-          <w:rFonts w:ascii="Times New Roman" w:hAnsi="Times New Roman" w:cs="Times New Roman"/>
-        </w:rPr>
-        <w:t xml:space="preserve">, </w:t>
-      </w:r>
-      <w:proofErr w:type="spellStart"/>
-      <w:r>
-        <w:rPr>
-          <w:rFonts w:ascii="Times New Roman" w:hAnsi="Times New Roman" w:cs="Times New Roman"/>
-        </w:rPr>
-        <w:t>seperti</w:t>
-      </w:r>
-      <w:proofErr w:type="spellEnd"/>
-      <w:r>
-        <w:rPr>
-          <w:rFonts w:ascii="Times New Roman" w:hAnsi="Times New Roman" w:cs="Times New Roman"/>
-        </w:rPr>
-        <w:t xml:space="preserve"> </w:t>
-      </w:r>
-      <w:proofErr w:type="spellStart"/>
-      <w:r>
-        <w:rPr>
-          <w:rFonts w:ascii="Times New Roman" w:hAnsi="Times New Roman" w:cs="Times New Roman"/>
-        </w:rPr>
-        <w:t>penggunaan</w:t>
-      </w:r>
-      <w:proofErr w:type="spellEnd"/>
-      <w:r>
-        <w:rPr>
-          <w:rFonts w:ascii="Times New Roman" w:hAnsi="Times New Roman" w:cs="Times New Roman"/>
-        </w:rPr>
-        <w:t xml:space="preserve"> </w:t>
-      </w:r>
-      <w:proofErr w:type="spellStart"/>
-      <w:r>
-        <w:rPr>
-          <w:rFonts w:ascii="Times New Roman" w:hAnsi="Times New Roman" w:cs="Times New Roman"/>
-        </w:rPr>
-        <w:t>listrik</w:t>
-      </w:r>
-      <w:proofErr w:type="spellEnd"/>
-      <w:r>
-        <w:rPr>
-          <w:rFonts w:ascii="Times New Roman" w:hAnsi="Times New Roman" w:cs="Times New Roman"/>
-        </w:rPr>
-        <w:t xml:space="preserve">, air, dan internet. </w:t>
+        <w:t xml:space="preserve">sebagai upaya dalam mendukung pengelolaan efisiensi anggaran diantaranya melakukan penghematan atas penggunaan sumber daya dalam kegiatan operasional kantor, seperti penggunaan listrik, air, dan internet. </w:t>
       </w:r>
       <w:r>
         <w:rPr>

</xml_diff>